<commit_message>
R2 review: workspace + manuscript/response-letter sync
Captures the full R2-review workspace under revision-analysis/_r2_review:
Claude+Codex parallel audits (fidelity, final, citation, theoretical
contribution DEI language, zero-baseline placement/relocation/round 3,
Section 3 opener v1-v3), the converged drafts, tracked-changes drafts
(Manuscript_R2_drafts_TRACKED.docx, Manuscript_Study1PretestPlacement_
TRACKED.docx), suggestions index, Study 1 pretest placement build, and
the Gdoc-sync utilities (Survey1 NPR pretest PDFs, footnote/zero-baseline
edit scripts).

Manuscript_gdoc_text.txt and response_letter_gdoc_text.txt re-pulled
from the canonical Gdocs. Local Manuscript and ResponseLetter .docx
artifacts refreshed for review. Study1_pretest_placement_edit handoff
note retired now that the tracked-changes draft has landed.

Co-Authored-By: Claude Opus 4.7 (1M context) <noreply@anthropic.com>
</commit_message>
<xml_diff>
--- a/Manuscript_DoesFeedbackEnhanceDiversity.docx
+++ b/Manuscript_DoesFeedbackEnhanceDiversity.docx
@@ -55,7 +55,25 @@
         <w:rPr>
           <w:rFonts w:ascii="Times New Roman" w:eastAsia="Times New Roman" w:hAnsi="Times New Roman" w:cs="Times New Roman"/>
         </w:rPr>
-        <w:t xml:space="preserve">Providing regular feedback to employees about the demographics of whom they have previously chosen to spotlight, hire and promote is an approach that a number of organizations have adopted in the hopes of spurring decision makers to select more diverse candidates. However, it is an open question whether purely descriptive feedback can be an effective intervention. We theorized and showed that descriptive feedback highlighting low past selection rates of women or racial minorities (e.g., 5% of previous experts you interviewed were women) triggers a motivation to respond without prejudice, increasing the subsequent selection of members of underrepresented groups. Conversely, providing descriptive feedback about low selection rates of people or products with other attributes (e.g., areas of expertise, recent release dates) that doesn’t evoke image or reputational concerns has less influence on future decisions. We demonstrated these patterns across seven pre-registered experiments (total </w:t>
+        <w:t>Many organizations provide employees feedback on the demographics of whom they</w:t>
+      </w:r>
+      <w:r>
+        <w:rPr>
+          <w:rFonts w:ascii="Times New Roman" w:eastAsia="Times New Roman" w:hAnsi="Times New Roman" w:cs="Times New Roman"/>
+        </w:rPr>
+        <w:t>’</w:t>
+      </w:r>
+      <w:r>
+        <w:rPr>
+          <w:rFonts w:ascii="Times New Roman" w:eastAsia="Times New Roman" w:hAnsi="Times New Roman" w:cs="Times New Roman"/>
+        </w:rPr>
+        <w:t>ve chosen to spotlight, hire, and promote, hoping to spur more diverse selections.</w:t>
+      </w:r>
+      <w:r>
+        <w:rPr>
+          <w:rFonts w:ascii="Times New Roman" w:eastAsia="Times New Roman" w:hAnsi="Times New Roman" w:cs="Times New Roman"/>
+        </w:rPr>
+        <w:t xml:space="preserve"> However, it is an open question whether providing purely descriptive feedback can improve diversity. We theorized and showed that descriptive feedback highlighting low past selection rates of women or racial minorities (e.g., 5% of previous experts you interviewed were women) triggers a motivation to respond without prejudice, increasing the subsequent selection of members of underrepresented groups. Conversely, providing descriptive feedback about low selection rates of other attributes (e.g., areas of expertise, recent release dates) that doesn’t evoke image or reputational concerns has less influence on future decisions. We demonstrated these patterns across seven pre-registered experiments (total </w:t>
       </w:r>
       <w:r>
         <w:rPr>
@@ -150,31 +168,18 @@
         </w:rPr>
         <w:t xml:space="preserve">In 2013, editors at National Public Radio (NPR) added a new prompt to their reporters’ daily workflow: when filing a story, journalists would be required to log basic demographic information about each source quoted, such as that source’s gender and race. From 2013-2021, these data were summarized for teams annually. Beginning in 2021, each reporter’s content management system began displaying up-to-date summary statistics describing whom they had quoted in the last month, documenting, among other things, the share of their sources who were women or racial minorities (Fu, 2021). Many other organizations have similar practices, including Salesforce, which shows monthly “diversity scorecards” to senior leaders detailing headcount, hiring, attrition, and promotion data by employees’ gender (globally) and race (in the U.S.; Salesforce, 2020) and the British Broadcasting Corporation (BBC), where internal managers have reviewed the demographics of on-air contributors monthly since 2017 in an effort known as “the 50:50 Project” (BBC, 2021). </w:t>
       </w:r>
-      <w:commentRangeStart w:id="2"/>
-      <w:ins w:id="3" w:author="Kasandra Brabaw" w:date="2025-12-30T16:05:00Z">
-        <w:r>
-          <w:rPr>
-            <w:rFonts w:ascii="Times New Roman" w:eastAsia="Times New Roman" w:hAnsi="Times New Roman" w:cs="Times New Roman"/>
-          </w:rPr>
-          <w:t>[Added sentence on anecdotal evidence?]</w:t>
-        </w:r>
-        <w:commentRangeEnd w:id="2"/>
-        <w:r>
-          <w:rPr>
-            <w:rStyle w:val="CommentReference"/>
-            <w:rFonts w:ascii="Times New Roman" w:eastAsia="Times New Roman" w:hAnsi="Times New Roman" w:cs="Times New Roman"/>
-            <w:sz w:val="22"/>
-            <w:szCs w:val="22"/>
-          </w:rPr>
-          <w:commentReference w:id="2"/>
-        </w:r>
-        <w:r>
-          <w:rPr>
-            <w:rFonts w:ascii="Times New Roman" w:eastAsia="Times New Roman" w:hAnsi="Times New Roman" w:cs="Times New Roman"/>
-          </w:rPr>
-          <w:t xml:space="preserve"> </w:t>
-        </w:r>
-      </w:ins>
+      <w:r>
+        <w:rPr>
+          <w:rFonts w:ascii="Times New Roman" w:eastAsia="Times New Roman" w:hAnsi="Times New Roman" w:cs="Times New Roman"/>
+        </w:rPr>
+        <w:t>NPR, Salesforce, and the BBC have claimed to find value in such programs.</w:t>
+      </w:r>
+      <w:r>
+        <w:rPr>
+          <w:rFonts w:ascii="Times New Roman" w:eastAsia="Times New Roman" w:hAnsi="Times New Roman" w:cs="Times New Roman"/>
+        </w:rPr>
+        <w:t xml:space="preserve"> </w:t>
+      </w:r>
       <w:r>
         <w:rPr>
           <w:rFonts w:ascii="Times New Roman" w:eastAsia="Times New Roman" w:hAnsi="Times New Roman" w:cs="Times New Roman"/>
@@ -190,13 +195,27 @@
           <w:rFonts w:ascii="Times New Roman" w:eastAsia="Times New Roman" w:hAnsi="Times New Roman" w:cs="Times New Roman"/>
         </w:rPr>
       </w:pPr>
-      <w:bookmarkStart w:id="4" w:name="_wdz9zc34kzgm" w:colFirst="0" w:colLast="0"/>
-      <w:bookmarkEnd w:id="4"/>
-      <w:r>
-        <w:rPr>
-          <w:rFonts w:ascii="Times New Roman" w:eastAsia="Times New Roman" w:hAnsi="Times New Roman" w:cs="Times New Roman"/>
-        </w:rPr>
-        <w:t xml:space="preserve">Past research has suggested that feedback is highly motivating when it signals a clear gap between current outcomes and an explicit goal (Latham &amp; Locke, 1991; Locke &amp; Latham, 2002). Purely descriptive feedback, however —the type NPR, Salesforce, and the BBC rolled out and that is studied in this paper — simply reports on past choices or behavior without providing or highlighting an accompanying goal or norm. Descriptive feedback might summarize the percentage of past sources you interviewed who were women, your earnings, or your step count, but it would not recommend how many sources should be women, how much you should earn, or how many steps you should take, nor would it convey a social norm (or information about your progress towards such a target or norm; Larimer et al., 2023). </w:t>
+      <w:bookmarkStart w:id="2" w:name="_wdz9zc34kzgm" w:colFirst="0" w:colLast="0"/>
+      <w:bookmarkEnd w:id="2"/>
+      <w:r>
+        <w:rPr>
+          <w:rFonts w:ascii="Times New Roman" w:eastAsia="Times New Roman" w:hAnsi="Times New Roman" w:cs="Times New Roman"/>
+        </w:rPr>
+        <w:t xml:space="preserve">Past research has suggested that feedback is highly motivating when it signals a clear gap between current outcomes and an explicit goal (Latham &amp; Locke, 1991; Locke &amp; Latham, 2002). Purely descriptive feedback, however —the </w:t>
+      </w:r>
+      <w:proofErr w:type="gramStart"/>
+      <w:r>
+        <w:rPr>
+          <w:rFonts w:ascii="Times New Roman" w:eastAsia="Times New Roman" w:hAnsi="Times New Roman" w:cs="Times New Roman"/>
+        </w:rPr>
+        <w:t>type</w:t>
+      </w:r>
+      <w:proofErr w:type="gramEnd"/>
+      <w:r>
+        <w:rPr>
+          <w:rFonts w:ascii="Times New Roman" w:eastAsia="Times New Roman" w:hAnsi="Times New Roman" w:cs="Times New Roman"/>
+        </w:rPr>
+        <w:t xml:space="preserve"> NPR, Salesforce, and the BBC rolled out and that is studied in this paper — simply reports on past choices or behavior without providing or highlighting an accompanying goal or norm. Descriptive feedback might summarize the percentage of past sources you interviewed who were women, your earnings, or your step count, but it would not recommend how many sources should be women, how much you should earn, or how many steps you should take, nor would it convey a social norm (or information about your progress towards such a target or norm; Larimer et al., 2023). </w:t>
       </w:r>
     </w:p>
     <w:p>
@@ -207,8 +226,8 @@
           <w:rFonts w:ascii="Times New Roman" w:eastAsia="Times New Roman" w:hAnsi="Times New Roman" w:cs="Times New Roman"/>
         </w:rPr>
       </w:pPr>
-      <w:bookmarkStart w:id="5" w:name="_svnc7ksx686m" w:colFirst="0" w:colLast="0"/>
-      <w:bookmarkEnd w:id="5"/>
+      <w:bookmarkStart w:id="3" w:name="_svnc7ksx686m" w:colFirst="0" w:colLast="0"/>
+      <w:bookmarkEnd w:id="3"/>
       <w:r>
         <w:rPr>
           <w:rFonts w:ascii="Times New Roman" w:eastAsia="Times New Roman" w:hAnsi="Times New Roman" w:cs="Times New Roman"/>
@@ -225,13 +244,37 @@
           <w:rFonts w:ascii="Times New Roman" w:eastAsia="Times New Roman" w:hAnsi="Times New Roman" w:cs="Times New Roman"/>
         </w:rPr>
       </w:pPr>
-      <w:bookmarkStart w:id="6" w:name="_bc57kwbk464n" w:colFirst="0" w:colLast="0"/>
-      <w:bookmarkEnd w:id="6"/>
-      <w:r>
-        <w:rPr>
-          <w:rFonts w:ascii="Times New Roman" w:eastAsia="Times New Roman" w:hAnsi="Times New Roman" w:cs="Times New Roman"/>
-        </w:rPr>
-        <w:t xml:space="preserve">Just as feedback accompanied by goals can motivate behavior change, past research has shown that explicitly communicating what behavior is desirable (an “injunctive norm”) alongside feedback reliably changes behavior (Allcott, 2011; Bhanot, 2021; Cialdini et al., 2006; Tiefenbeck et al., 2018). For example, Tiefenbeck et al. (2018) demonstrated that smart shower meters displaying feedback on consumers’ water usage alongside an explicit injunctive norm to use less water, communicated via an image of a polar bear on a shrinking ice floe, reduced water usage by 22%. Similarly, Schultz et al. (2007) found that when households received feedback about their energy usage alongside an explicit injunctive norm communicating that conservation was desirable as well as a social comparison to the energy use of their neighbors, energy consumption dropped by 5.7%. However, consistent with other studies, providing consumers with energy consumption feedback alone had no effect. </w:t>
+      <w:bookmarkStart w:id="4" w:name="_bc57kwbk464n" w:colFirst="0" w:colLast="0"/>
+      <w:bookmarkEnd w:id="4"/>
+      <w:r>
+        <w:rPr>
+          <w:rFonts w:ascii="Times New Roman" w:eastAsia="Times New Roman" w:hAnsi="Times New Roman" w:cs="Times New Roman"/>
+        </w:rPr>
+        <w:t>Just as feedback accompanied by goals can motivate behavior change, past research has shown that explicitly communicating what behavior is desirable (an “injunctive norm”) alongside feedback reliably changes behavior (Allcott, 2011; Bhanot, 2021; Cialdini et al., 2006; Tiefenbeck et al., 2018). For example, Tiefenbeck et al. (2018) demonstrated that smart shower meters displaying feedback on consumers’ water usage alongside an explicit injunctive norm to use less water, communicated via an image of a polar bear on a shrinking ice floe, reduced water usage by 22%. Similarly, Schultz et al. (2007) found that when households received feedback about their energy usage alongside an explicit injunctive norm communicating that conservation was desirable as well as a social comparison to the energy use of their neighbors, energy consumption dropped by 5.7%. However, consistent with other studies, providing consumers with energy consumption feedbac</w:t>
+      </w:r>
+      <w:r>
+        <w:rPr>
+          <w:rFonts w:ascii="Times New Roman" w:eastAsia="Times New Roman" w:hAnsi="Times New Roman" w:cs="Times New Roman"/>
+        </w:rPr>
+        <w:t>k</w:t>
+      </w:r>
+      <w:r>
+        <w:rPr>
+          <w:rFonts w:ascii="Times New Roman" w:eastAsia="Times New Roman" w:hAnsi="Times New Roman" w:cs="Times New Roman"/>
+        </w:rPr>
+        <w:t xml:space="preserve"> alone</w:t>
+      </w:r>
+      <w:r>
+        <w:rPr>
+          <w:rFonts w:ascii="Times New Roman" w:eastAsia="Times New Roman" w:hAnsi="Times New Roman" w:cs="Times New Roman"/>
+        </w:rPr>
+        <w:t>, on average,</w:t>
+      </w:r>
+      <w:r>
+        <w:rPr>
+          <w:rFonts w:ascii="Times New Roman" w:eastAsia="Times New Roman" w:hAnsi="Times New Roman" w:cs="Times New Roman"/>
+        </w:rPr>
+        <w:t xml:space="preserve"> had no effect. </w:t>
       </w:r>
     </w:p>
     <w:p>
@@ -280,8 +323,8 @@
           <w:bCs/>
         </w:rPr>
       </w:pPr>
-      <w:bookmarkStart w:id="7" w:name="_immj20lxp7l1" w:colFirst="0" w:colLast="0"/>
-      <w:bookmarkEnd w:id="7"/>
+      <w:bookmarkStart w:id="5" w:name="_immj20lxp7l1" w:colFirst="0" w:colLast="0"/>
+      <w:bookmarkEnd w:id="5"/>
       <w:r>
         <w:rPr>
           <w:rFonts w:ascii="Times New Roman" w:eastAsia="Times New Roman" w:hAnsi="Times New Roman" w:cs="Times New Roman"/>
@@ -299,13 +342,25 @@
           <w:rFonts w:ascii="Times New Roman" w:eastAsia="Times New Roman" w:hAnsi="Times New Roman" w:cs="Times New Roman"/>
         </w:rPr>
       </w:pPr>
-      <w:bookmarkStart w:id="8" w:name="_vhzaypwd78wx" w:colFirst="0" w:colLast="0"/>
-      <w:bookmarkEnd w:id="8"/>
-      <w:r>
-        <w:rPr>
-          <w:rFonts w:ascii="Times New Roman" w:eastAsia="Times New Roman" w:hAnsi="Times New Roman" w:cs="Times New Roman"/>
-        </w:rPr>
-        <w:t xml:space="preserve">Promoting diversity has become a priority for many organizations, with companies around the world investing substantially in diversity initiatives and making public commitments to increase the representation of women and minorities in their ranks (Kirkland &amp; Bohnet, 2017; Society for Human Resource Management [SHRM], 2022). Despite these efforts, many organizations have not yet managed to build a diverse workforce (Field et al., 2023) and remain eager for new tools to support their diversification goals given the potential benefits of harnessing all types of talent (Richard, 2000; Hsieh et al., 2019; cf. Jehn et al., 1997). Providing regular feedback to employees about the demographics of whom they have previously chosen to spotlight, hire and promote is an approach some organizations (such as NPR, Salesforce, and the BBC) are adopting in the hopes that such feedback will spur decision makers to select more diverse candidates, but it is an open question whether purely descriptive feedback can be an effective intervention. </w:t>
+      <w:bookmarkStart w:id="6" w:name="_vhzaypwd78wx" w:colFirst="0" w:colLast="0"/>
+      <w:bookmarkEnd w:id="6"/>
+      <w:r>
+        <w:rPr>
+          <w:rFonts w:ascii="Times New Roman" w:eastAsia="Times New Roman" w:hAnsi="Times New Roman" w:cs="Times New Roman"/>
+        </w:rPr>
+        <w:t>Promoting diversity has become a priority for many organizations, with companies around the world investing substantially in diversity initiatives and making public commitments to increase the representation of women and minorities in their ranks (Kirkland &amp; Bohnet, 2017; Society for Human Resource Management [SHRM], 2022). Despite these efforts, many organizations have not yet managed to build a diverse workforce (Field et al., 2023) and remain eager for new tools to support their diversification goals given the potential benefits of harnessing all types of talent (Richard, 2000; Hsieh et al., 2019; cf. Jehn et al., 199</w:t>
+      </w:r>
+      <w:r>
+        <w:rPr>
+          <w:rFonts w:ascii="Times New Roman" w:eastAsia="Times New Roman" w:hAnsi="Times New Roman" w:cs="Times New Roman"/>
+        </w:rPr>
+        <w:t>9</w:t>
+      </w:r>
+      <w:r>
+        <w:rPr>
+          <w:rFonts w:ascii="Times New Roman" w:eastAsia="Times New Roman" w:hAnsi="Times New Roman" w:cs="Times New Roman"/>
+        </w:rPr>
+        <w:t xml:space="preserve">). Providing regular feedback to employees about the demographics of whom they have previously chosen to spotlight, hire and promote is an approach some organizations (such as NPR, Salesforce, and the BBC) are adopting in the hopes that such feedback will spur decision makers to select more diverse candidates, but it is an open question whether purely descriptive feedback can be an effective intervention. </w:t>
       </w:r>
     </w:p>
     <w:p>
@@ -316,8 +371,8 @@
           <w:rFonts w:ascii="Times New Roman" w:eastAsia="Times New Roman" w:hAnsi="Times New Roman" w:cs="Times New Roman"/>
         </w:rPr>
       </w:pPr>
-      <w:bookmarkStart w:id="9" w:name="_bo3tm86pjme" w:colFirst="0" w:colLast="0"/>
-      <w:bookmarkEnd w:id="9"/>
+      <w:bookmarkStart w:id="7" w:name="_bo3tm86pjme" w:colFirst="0" w:colLast="0"/>
+      <w:bookmarkEnd w:id="7"/>
       <w:r>
         <w:rPr>
           <w:rFonts w:ascii="Times New Roman" w:eastAsia="Times New Roman" w:hAnsi="Times New Roman" w:cs="Times New Roman"/>
@@ -344,7 +399,21 @@
         <w:rPr>
           <w:rFonts w:ascii="Times New Roman" w:eastAsia="Times New Roman" w:hAnsi="Times New Roman" w:cs="Times New Roman"/>
         </w:rPr>
-        <w:t xml:space="preserve">In many societies worldwide, it is considered unacceptable to exhibit racial or gender prejudice, with legal frameworks and organizational policies supporting diversity across numerous countries (e.g., the UK Equality Act 2010; EU Council Directive 2000/43/EC; Civil Rights Act of 1964, Álvarez-Benjumea, 2023). In the United States, for example, outward expressions of prejudice are both a societally sanctioned norm violation (Álvarez-Benjumea, 2023) and a violation of the law, which prohibits acts of discrimination based on gender or race (Civil Rights Act of 1964). Similarly, in the European Union, the Racial Equality Directive explicitly prohibits racial discrimination in the labor market, codifying the region’s strong normative commitment to equal treatment regardless of racial or ethnic origin (Council Directive 2000/43/EC). Moreover, many organizations have explicitly committed to increasing the representation of women and racial minorities (among other groups) within their ranks (Ellis, 2025). And despite recent rollbacks of diversity, equity, and inclusion (DEI) policies at some organizations in the United States (Heaton, 2025), recent surveys indicate that the majority of Americans still hold favorable views about DEI (Minkin, 2024; Kidwai, 2025). </w:t>
+        <w:t xml:space="preserve">In many societies worldwide, it is considered unacceptable to exhibit racial or gender prejudice, with legal frameworks and organizational policies supporting diversity across numerous countries (e.g., the UK Equality Act 2010; EU Council Directive 2000/43/EC; Civil Rights Act of 1964, Álvarez-Benjumea, 2023). In the United States, for example, outward expressions of prejudice are both a societally sanctioned norm violation (Álvarez-Benjumea, 2023) and a violation of the law, which prohibits acts of discrimination based on gender or race (Civil Rights Act of 1964). Similarly, in the European Union, the Racial Equality Directive explicitly prohibits racial discrimination in the labor market, codifying the region’s strong normative commitment to equal treatment regardless of racial or ethnic origin (Council Directive 2000/43/EC). Moreover, many organizations have explicitly committed to increasing the representation of women and racial minorities (among other groups) within their ranks (Ellis, 2025). And despite recent rollbacks of diversity, equity, and inclusion (DEI) policies at some organizations in the United States (Heaton, 2025), recent surveys indicate that </w:t>
+      </w:r>
+      <w:proofErr w:type="gramStart"/>
+      <w:r>
+        <w:rPr>
+          <w:rFonts w:ascii="Times New Roman" w:eastAsia="Times New Roman" w:hAnsi="Times New Roman" w:cs="Times New Roman"/>
+        </w:rPr>
+        <w:t>the majority of</w:t>
+      </w:r>
+      <w:proofErr w:type="gramEnd"/>
+      <w:r>
+        <w:rPr>
+          <w:rFonts w:ascii="Times New Roman" w:eastAsia="Times New Roman" w:hAnsi="Times New Roman" w:cs="Times New Roman"/>
+        </w:rPr>
+        <w:t xml:space="preserve"> Americans still hold favorable views about DEI (Minkin, 2024; Kidwai, 2025). </w:t>
       </w:r>
     </w:p>
     <w:p>
@@ -381,7 +450,19 @@
         <w:rPr>
           <w:rFonts w:ascii="Times New Roman" w:eastAsia="Times New Roman" w:hAnsi="Times New Roman" w:cs="Times New Roman"/>
         </w:rPr>
-        <w:t>We propose that when descriptive feedback reveals that an evaluator’s past selections included few women or racial minorities, even in the absence of a goal, target or explicit norm, the prevalent implicit injunctive norm that prejudice is undesirable may come to mind (Barr et al., 2018; Dovidio &amp; Gaertner, 2004). And we theorize that this implicit injunctive norm will trigger concerns that past selection patterns could be interpreted as prejudiced, either by others or by themselves. We predict that this realization will activate a motivation to respond without prejudice—prompting evaluators to adjust their behavior to avoid appearing biased, driven by both external reputational concerns and internal desires to maintain a positive self-view (Plant &amp; Devine, 1998, 2009). In this way, we theorize that descriptive feedback about the race and gender of those who have been selected for opportunities in the past that conveys these groups have been left out will lead evaluators to adjust their behavior to make more inclusive selection decisions (i.e., selecting more women and racial minorities) in the future due to existing, implicit injunctive norms, which need not be explicitly stated in this case. In doing so, we provide evidence that sharing descriptive feedback about past selectees is a low-cost intervention that can generally be employed by managers to increase the representation of underrepresented demographic groups without relying on quotas or other illegal or heavy-handed policies that can spark backlash (Dobbin &amp; Kalev, 2016; Leslie, 2019).</w:t>
+        <w:t xml:space="preserve">We propose that when descriptive feedback reveals that an evaluator’s past selections included few women or racial minorities, even in the absence of a goal, target or explicit norm, the prevalent implicit injunctive norm that prejudice is undesirable may come to mind (Barr et al., 2018; Dovidio &amp; Gaertner, 2004). And we theorize that this implicit injunctive norm will trigger concerns that past selection patterns could be interpreted as prejudiced, either by others or by themselves. We predict that this realization will activate </w:t>
+      </w:r>
+      <w:r>
+        <w:rPr>
+          <w:rFonts w:ascii="Times New Roman" w:eastAsia="Times New Roman" w:hAnsi="Times New Roman" w:cs="Times New Roman"/>
+        </w:rPr>
+        <w:t>motivation</w:t>
+      </w:r>
+      <w:r>
+        <w:rPr>
+          <w:rFonts w:ascii="Times New Roman" w:eastAsia="Times New Roman" w:hAnsi="Times New Roman" w:cs="Times New Roman"/>
+        </w:rPr>
+        <w:t xml:space="preserve"> to respond without prejudice—prompting evaluators to adjust their behavior to avoid appearing biased, driven by both external reputational concerns and internal desires to maintain a positive self-view (Plant &amp; Devine, 1998, 2009). In this way, we theorize that descriptive feedback about the race and gender of those who have been selected for opportunities in the past that conveys these groups have been left out will lead evaluators to adjust their behavior to make more inclusive selection decisions (i.e., selecting more women and racial minorities) in the future due to existing, implicit injunctive norms, which need not be explicitly stated in this case. In doing so, we provide evidence that sharing descriptive feedback about past selectees is a low-cost intervention that can generally be employed by managers to increase the representation of underrepresented demographic groups without relying on quotas or other illegal or heavy-handed policies that can spark backlash (Dobbin &amp; Kalev, 2016; Leslie, 2019).</w:t>
       </w:r>
     </w:p>
     <w:p>
@@ -409,8 +490,8 @@
           <w:rFonts w:ascii="Times New Roman" w:eastAsia="Times New Roman" w:hAnsi="Times New Roman" w:cs="Times New Roman"/>
         </w:rPr>
       </w:pPr>
-      <w:bookmarkStart w:id="10" w:name="_rnxsuyosel9m" w:colFirst="0" w:colLast="0"/>
-      <w:bookmarkEnd w:id="10"/>
+      <w:bookmarkStart w:id="8" w:name="_rnxsuyosel9m" w:colFirst="0" w:colLast="0"/>
+      <w:bookmarkEnd w:id="8"/>
       <w:r>
         <w:rPr>
           <w:rFonts w:ascii="Times New Roman" w:eastAsia="Times New Roman" w:hAnsi="Times New Roman" w:cs="Times New Roman"/>
@@ -426,8 +507,8 @@
           <w:rFonts w:ascii="Times New Roman" w:eastAsia="Times New Roman" w:hAnsi="Times New Roman" w:cs="Times New Roman"/>
         </w:rPr>
       </w:pPr>
-      <w:bookmarkStart w:id="11" w:name="_9gzifa6fc6b2" w:colFirst="0" w:colLast="0"/>
-      <w:bookmarkEnd w:id="11"/>
+      <w:bookmarkStart w:id="9" w:name="_9gzifa6fc6b2" w:colFirst="0" w:colLast="0"/>
+      <w:bookmarkEnd w:id="9"/>
       <w:r>
         <w:rPr>
           <w:rFonts w:ascii="Times New Roman" w:eastAsia="Times New Roman" w:hAnsi="Times New Roman" w:cs="Times New Roman"/>
@@ -444,8 +525,8 @@
           <w:rFonts w:ascii="Times New Roman" w:eastAsia="Times New Roman" w:hAnsi="Times New Roman" w:cs="Times New Roman"/>
         </w:rPr>
       </w:pPr>
-      <w:bookmarkStart w:id="12" w:name="_yu4f52e7wrrb" w:colFirst="0" w:colLast="0"/>
-      <w:bookmarkEnd w:id="12"/>
+      <w:bookmarkStart w:id="10" w:name="_yu4f52e7wrrb" w:colFirst="0" w:colLast="0"/>
+      <w:bookmarkEnd w:id="10"/>
       <w:r>
         <w:rPr>
           <w:rFonts w:ascii="Times New Roman" w:eastAsia="Times New Roman" w:hAnsi="Times New Roman" w:cs="Times New Roman"/>
@@ -461,8 +542,8 @@
           <w:rFonts w:ascii="Times New Roman" w:eastAsia="Times New Roman" w:hAnsi="Times New Roman" w:cs="Times New Roman"/>
         </w:rPr>
       </w:pPr>
-      <w:bookmarkStart w:id="13" w:name="_r9s8dqxoer1i" w:colFirst="0" w:colLast="0"/>
-      <w:bookmarkEnd w:id="13"/>
+      <w:bookmarkStart w:id="11" w:name="_r9s8dqxoer1i" w:colFirst="0" w:colLast="0"/>
+      <w:bookmarkEnd w:id="11"/>
       <w:r>
         <w:rPr>
           <w:rFonts w:ascii="Times New Roman" w:eastAsia="Times New Roman" w:hAnsi="Times New Roman" w:cs="Times New Roman"/>
@@ -478,8 +559,8 @@
           <w:rFonts w:ascii="Times New Roman" w:eastAsia="Times New Roman" w:hAnsi="Times New Roman" w:cs="Times New Roman"/>
         </w:rPr>
       </w:pPr>
-      <w:bookmarkStart w:id="14" w:name="_d2e5pbg5xp0u" w:colFirst="0" w:colLast="0"/>
-      <w:bookmarkEnd w:id="14"/>
+      <w:bookmarkStart w:id="12" w:name="_d2e5pbg5xp0u" w:colFirst="0" w:colLast="0"/>
+      <w:bookmarkEnd w:id="12"/>
       <w:r>
         <w:rPr>
           <w:rFonts w:ascii="Times New Roman" w:eastAsia="Times New Roman" w:hAnsi="Times New Roman" w:cs="Times New Roman"/>
@@ -491,7 +572,33 @@
           <w:rFonts w:ascii="Times New Roman" w:eastAsia="Times New Roman" w:hAnsi="Times New Roman" w:cs="Times New Roman"/>
         </w:rPr>
         <w:lastRenderedPageBreak/>
-        <w:t xml:space="preserve">separately) (Bohnet &amp; Bazerman, 2016), and make sets of selection decisions rather than one-at-a-time selection decisions, they favor more diverse candidates (Chang et. al., 2020). We hold all such presentation factors constant across conditions in all of our studies, thereby isolating the casual effect of descriptive feedback about past portfolio composition on subsequent selections. </w:t>
+        <w:t xml:space="preserve">separately) (Bohnet </w:t>
+      </w:r>
+      <w:r>
+        <w:rPr>
+          <w:rFonts w:ascii="Times New Roman" w:eastAsia="Times New Roman" w:hAnsi="Times New Roman" w:cs="Times New Roman"/>
+        </w:rPr>
+        <w:t>et al.</w:t>
+      </w:r>
+      <w:r>
+        <w:rPr>
+          <w:rFonts w:ascii="Times New Roman" w:eastAsia="Times New Roman" w:hAnsi="Times New Roman" w:cs="Times New Roman"/>
+        </w:rPr>
+        <w:t xml:space="preserve">, 2016), and make sets of selection decisions rather than one-at-a-time selection decisions, they favor more diverse candidates (Chang et al., 2020). We hold all such presentation factors constant across conditions in </w:t>
+      </w:r>
+      <w:proofErr w:type="gramStart"/>
+      <w:r>
+        <w:rPr>
+          <w:rFonts w:ascii="Times New Roman" w:eastAsia="Times New Roman" w:hAnsi="Times New Roman" w:cs="Times New Roman"/>
+        </w:rPr>
+        <w:t>all of</w:t>
+      </w:r>
+      <w:proofErr w:type="gramEnd"/>
+      <w:r>
+        <w:rPr>
+          <w:rFonts w:ascii="Times New Roman" w:eastAsia="Times New Roman" w:hAnsi="Times New Roman" w:cs="Times New Roman"/>
+        </w:rPr>
+        <w:t xml:space="preserve"> our studies, thereby isolating the casual effect of descriptive feedback about past portfolio composition on subsequent selections. </w:t>
       </w:r>
     </w:p>
     <w:p>
@@ -503,8 +610,8 @@
           <w:rFonts w:ascii="Times New Roman" w:eastAsia="Times New Roman" w:hAnsi="Times New Roman" w:cs="Times New Roman"/>
         </w:rPr>
       </w:pPr>
-      <w:bookmarkStart w:id="15" w:name="_rio1jvyupwfx" w:colFirst="0" w:colLast="0"/>
-      <w:bookmarkEnd w:id="15"/>
+      <w:bookmarkStart w:id="13" w:name="_rio1jvyupwfx" w:colFirst="0" w:colLast="0"/>
+      <w:bookmarkEnd w:id="13"/>
       <w:r>
         <w:rPr>
           <w:rFonts w:ascii="Times New Roman" w:eastAsia="Times New Roman" w:hAnsi="Times New Roman" w:cs="Times New Roman"/>
@@ -521,8 +628,8 @@
           <w:rFonts w:ascii="Times New Roman" w:eastAsia="Times New Roman" w:hAnsi="Times New Roman" w:cs="Times New Roman"/>
         </w:rPr>
       </w:pPr>
-      <w:bookmarkStart w:id="16" w:name="_bt1hlry6hjl9" w:colFirst="0" w:colLast="0"/>
-      <w:bookmarkEnd w:id="16"/>
+      <w:bookmarkStart w:id="14" w:name="_bt1hlry6hjl9" w:colFirst="0" w:colLast="0"/>
+      <w:bookmarkEnd w:id="14"/>
       <w:r>
         <w:rPr>
           <w:rFonts w:ascii="Times New Roman" w:eastAsia="Times New Roman" w:hAnsi="Times New Roman" w:cs="Times New Roman"/>
@@ -539,8 +646,8 @@
           <w:rFonts w:ascii="Times New Roman" w:eastAsia="Times New Roman" w:hAnsi="Times New Roman" w:cs="Times New Roman"/>
         </w:rPr>
       </w:pPr>
-      <w:bookmarkStart w:id="17" w:name="_pxbygewyqr9y" w:colFirst="0" w:colLast="0"/>
-      <w:bookmarkEnd w:id="17"/>
+      <w:bookmarkStart w:id="15" w:name="_pxbygewyqr9y" w:colFirst="0" w:colLast="0"/>
+      <w:bookmarkEnd w:id="15"/>
       <w:r>
         <w:rPr>
           <w:rFonts w:ascii="Times New Roman" w:eastAsia="Times New Roman" w:hAnsi="Times New Roman" w:cs="Times New Roman"/>
@@ -557,8 +664,8 @@
           <w:rFonts w:ascii="Times New Roman" w:eastAsia="Times New Roman" w:hAnsi="Times New Roman" w:cs="Times New Roman"/>
         </w:rPr>
       </w:pPr>
-      <w:bookmarkStart w:id="18" w:name="_o8x8j2u2exdp" w:colFirst="0" w:colLast="0"/>
-      <w:bookmarkEnd w:id="18"/>
+      <w:bookmarkStart w:id="16" w:name="_o8x8j2u2exdp" w:colFirst="0" w:colLast="0"/>
+      <w:bookmarkEnd w:id="16"/>
     </w:p>
     <w:p>
       <w:pPr>
@@ -571,8 +678,8 @@
           <w:bCs/>
         </w:rPr>
       </w:pPr>
-      <w:bookmarkStart w:id="19" w:name="_4mcprv57e7dt" w:colFirst="0" w:colLast="0"/>
-      <w:bookmarkEnd w:id="19"/>
+      <w:bookmarkStart w:id="17" w:name="_4mcprv57e7dt" w:colFirst="0" w:colLast="0"/>
+      <w:bookmarkEnd w:id="17"/>
       <w:r>
         <w:rPr>
           <w:rFonts w:ascii="Times New Roman" w:eastAsia="Times New Roman" w:hAnsi="Times New Roman" w:cs="Times New Roman"/>
@@ -590,8 +697,8 @@
           <w:rFonts w:ascii="Times New Roman" w:eastAsia="Times New Roman" w:hAnsi="Times New Roman" w:cs="Times New Roman"/>
         </w:rPr>
       </w:pPr>
-      <w:bookmarkStart w:id="20" w:name="_hm91b3lhoqcy" w:colFirst="0" w:colLast="0"/>
-      <w:bookmarkEnd w:id="20"/>
+      <w:bookmarkStart w:id="18" w:name="_hm91b3lhoqcy" w:colFirst="0" w:colLast="0"/>
+      <w:bookmarkEnd w:id="18"/>
       <w:r>
         <w:rPr>
           <w:rFonts w:ascii="Times New Roman" w:eastAsia="Times New Roman" w:hAnsi="Times New Roman" w:cs="Times New Roman"/>
@@ -610,14 +717,81 @@
         <w:rPr>
           <w:rFonts w:ascii="Times New Roman" w:eastAsia="Times New Roman" w:hAnsi="Times New Roman" w:cs="Times New Roman"/>
         </w:rPr>
-        <w:t xml:space="preserve"> = 6,502), including one framed field experiment (Harrison &amp; List, 2004), to examine how descriptive feedback about a portfolio of past choices affects subsequent selection decisions. In most of our studies, we employ a candidate selection paradigm illustrated in Figure 1. Participants begin by choosing a portfolio of six to seven candidates (e.g., panelists, authors) from a larger candidate pool including twenty-four to twenty-six options (in Study 1, participants are simply told to imagine they have made prior selections and informed about the composition of those prior selections). After making their initial selections (or being told about them in Study 1), participants are randomly assigned to receive two to three pieces of descriptive feedback summarizing the characteristics of their initial selectees. Participants assigned to a treatment condition receive feedback summarizing either the gender (Studies 1, 3B, 4B and 5) or racial (Studies 3A and 4A) composition of their initially selected candidates (e.g., the percentage who were female; the percentage who were racial minorities) alongside one or two pieces of additional descriptive feedback about their initially selected candidates to both (1) obfuscate the purpose of the research and (2) measure the impact of such feedback focused on non-DEI-related characteristics of past selectees (e.g., the percentage of prior selectees who were CEOs; the percentage who were genre-spanning writers). Participants assigned to the control condition also receive descriptive feedback about their initially selected candidates (e.g., the percentage who were technologists; the percentage who were born in the 1800s), but this feedback never references the race or gender composition of prior selectees. Finally, participants are given the opportunity to select one or more additional candidates to add to the group (e.g., of panelists or authors) </w:t>
+        <w:t xml:space="preserve"> = 6,502), including one framed field experiment (Harrison &amp; List, 2004), to examine how descriptive feedback about a portfolio of past choices affects subsequent selection decisions. In most of our studies, we employ a candidate selection paradigm illustrated in Figure 1. Participants begin by choosing a portfolio of six to seven candidates (e.g., panelists, authors) from a larger candidate pool including twenty-four to twenty-six options (in Study 1, participants are simply told to imagine they have made prior selections and informed about the composition of those prior selections). After making their initial selections (or being told about them in Study 1), participants are randomly assigned to receive two to three pieces of descriptive feedback summarizing the characteristics of their initial selectees. Participants assigned to a treatment condition receive feedback summarizing either the gender (Studies 1, 3B, 4B and 5) or racial (Studies 3A and 4A) composition of their initially selected candidates (e.g., the percentage who were female; the percentage who were racial minorities) alongside one or two pieces of additional descriptive feedback about their initially selected candidates to both (1) obfuscate the purpose of the research and (2) measure the impact of such feedback focused on non-DEI-related characteristics of past selectees (e.g., the percentage of prior selectees who were CEOs; the percentage who were genre-spanning writers). Participants assigned to the control condition also receive descriptive feedback about their initially selected candidates (e.g., the percentage who were technologists; the percentage who were born in the 1800s), but this feedback never references the race or gender composition of prior selectees. Finally, participants are given the opportunity to select one or more additional candidates to add to the group (e.g.</w:t>
+      </w:r>
+      <w:proofErr w:type="gramStart"/>
+      <w:r>
+        <w:rPr>
+          <w:rFonts w:ascii="Times New Roman" w:eastAsia="Times New Roman" w:hAnsi="Times New Roman" w:cs="Times New Roman"/>
+        </w:rPr>
+        <w:t>, of</w:t>
+      </w:r>
+      <w:proofErr w:type="gramEnd"/>
+      <w:r>
+        <w:rPr>
+          <w:rFonts w:ascii="Times New Roman" w:eastAsia="Times New Roman" w:hAnsi="Times New Roman" w:cs="Times New Roman"/>
+        </w:rPr>
+        <w:t xml:space="preserve"> panelists or authors) </w:t>
       </w:r>
       <w:r>
         <w:rPr>
           <w:rFonts w:ascii="Times New Roman" w:eastAsia="Times New Roman" w:hAnsi="Times New Roman" w:cs="Times New Roman"/>
         </w:rPr>
         <w:lastRenderedPageBreak/>
-        <w:t>that they just created. Our outcomes of interest are the attributes of these subsequent selectees—and in particular, their gender (in Studies 1, 3B, 4B and 5) or race (in Studies 3A and 4A).</w:t>
+        <w:t xml:space="preserve">that they just created. Our outcomes of interest are the attributes of these subsequent selectees—and </w:t>
+      </w:r>
+      <w:proofErr w:type="gramStart"/>
+      <w:r>
+        <w:rPr>
+          <w:rFonts w:ascii="Times New Roman" w:eastAsia="Times New Roman" w:hAnsi="Times New Roman" w:cs="Times New Roman"/>
+        </w:rPr>
+        <w:t>in particular</w:t>
+      </w:r>
+      <w:proofErr w:type="gramEnd"/>
+      <w:r>
+        <w:rPr>
+          <w:rFonts w:ascii="Times New Roman" w:eastAsia="Times New Roman" w:hAnsi="Times New Roman" w:cs="Times New Roman"/>
+        </w:rPr>
+        <w:t>, their gender (in Studies 1, 3B, 4B and 5) or race (in Studies 3A and 4A).</w:t>
+      </w:r>
+      <w:r>
+        <w:rPr>
+          <w:rFonts w:ascii="Times New Roman" w:eastAsia="Times New Roman" w:hAnsi="Times New Roman" w:cs="Times New Roman"/>
+        </w:rPr>
+        <w:t xml:space="preserve"> </w:t>
+      </w:r>
+      <w:r>
+        <w:rPr>
+          <w:rFonts w:ascii="Times New Roman" w:eastAsia="Times New Roman" w:hAnsi="Times New Roman" w:cs="Times New Roman"/>
+        </w:rPr>
+        <w:t>Data for Studies 1–</w:t>
+      </w:r>
+      <w:r>
+        <w:rPr>
+          <w:rFonts w:ascii="Times New Roman" w:eastAsia="Times New Roman" w:hAnsi="Times New Roman" w:cs="Times New Roman"/>
+        </w:rPr>
+        <w:t>5</w:t>
+      </w:r>
+      <w:r>
+        <w:rPr>
+          <w:rFonts w:ascii="Times New Roman" w:eastAsia="Times New Roman" w:hAnsi="Times New Roman" w:cs="Times New Roman"/>
+        </w:rPr>
+        <w:t xml:space="preserve"> as well as analysis code for all studies can be found on OSF: </w:t>
+      </w:r>
+      <w:hyperlink r:id="rId7" w:history="1">
+        <w:r>
+          <w:rPr>
+            <w:rStyle w:val="Hyperlink"/>
+            <w:rFonts w:ascii="Times New Roman" w:eastAsia="Times New Roman" w:hAnsi="Times New Roman" w:cs="Times New Roman"/>
+          </w:rPr>
+          <w:t>https://osf.io/zxyw2/</w:t>
+        </w:r>
+      </w:hyperlink>
+      <w:r>
+        <w:rPr>
+          <w:rFonts w:ascii="Times New Roman" w:eastAsia="Times New Roman" w:hAnsi="Times New Roman" w:cs="Times New Roman"/>
+        </w:rPr>
+        <w:t>.</w:t>
       </w:r>
     </w:p>
     <w:p>
@@ -685,8 +859,8 @@
           <w:rFonts w:ascii="Times New Roman" w:eastAsia="Times New Roman" w:hAnsi="Times New Roman" w:cs="Times New Roman"/>
         </w:rPr>
       </w:pPr>
-      <w:bookmarkStart w:id="21" w:name="_bt88wvx6ckce" w:colFirst="0" w:colLast="0"/>
-      <w:bookmarkEnd w:id="21"/>
+      <w:bookmarkStart w:id="19" w:name="_bt88wvx6ckce" w:colFirst="0" w:colLast="0"/>
+      <w:bookmarkEnd w:id="19"/>
       <w:r>
         <w:rPr>
           <w:rFonts w:ascii="Times New Roman" w:eastAsia="Times New Roman" w:hAnsi="Times New Roman" w:cs="Times New Roman"/>
@@ -737,14 +911,8 @@
         <w:rPr>
           <w:rFonts w:ascii="Times New Roman" w:eastAsia="Times New Roman" w:hAnsi="Times New Roman" w:cs="Times New Roman"/>
         </w:rPr>
-        <w:t xml:space="preserve">In Study 1, participants imagined assuming the role of National Public Radio (NPR) producers selecting experts to interview for stories about the future of work in America. We tested the effect of </w:t>
-      </w:r>
-      <w:r>
-        <w:rPr>
-          <w:rFonts w:ascii="Times New Roman" w:eastAsia="Times New Roman" w:hAnsi="Times New Roman" w:cs="Times New Roman"/>
-        </w:rPr>
         <w:lastRenderedPageBreak/>
-        <w:t>providing participants with descriptive feedback about the gender composition of their previously selected expert sources on their subsequent hypothetical selections of experts for future NPR stories. This study was designed to imitate the real feedback system currently used at NPR to provide producers with summary statistics about their past sources (Fu, 2021).</w:t>
+        <w:t>In Study 1, participants imagined assuming the role of National Public Radio (NPR) producers selecting experts to interview for stories about the future of work in America. We tested the effect of providing participants with descriptive feedback about the gender composition of their previously selected expert sources on their subsequent hypothetical selections of experts for future NPR stories. This study was designed to imitate the real feedback system currently used at NPR to provide producers with summary statistics about their past sources (Fu, 2021).</w:t>
       </w:r>
     </w:p>
     <w:p>
@@ -786,7 +954,7 @@
         </w:rPr>
         <w:t>. As pre-registered (</w:t>
       </w:r>
-      <w:hyperlink r:id="rId10">
+      <w:hyperlink r:id="rId8">
         <w:r>
           <w:rPr>
             <w:rFonts w:ascii="Times New Roman" w:eastAsia="Times New Roman" w:hAnsi="Times New Roman" w:cs="Times New Roman"/>
@@ -836,7 +1004,19 @@
         <w:rPr>
           <w:rFonts w:ascii="Times New Roman" w:eastAsia="Times New Roman" w:hAnsi="Times New Roman" w:cs="Times New Roman"/>
         </w:rPr>
-        <w:t>Participants were told to imagine they worked as producers at NPR, and were responsible for identifying and booking expert sources to interview for various news segments and stories. Participants were informed that over the past three months, they had been working on a series of stories about the future of work in America and had selected and interviewed a portfolio of ten experts for these stories.</w:t>
+        <w:t xml:space="preserve">Participants were told to imagine they worked as producers at </w:t>
+      </w:r>
+      <w:r>
+        <w:rPr>
+          <w:rFonts w:ascii="Times New Roman" w:eastAsia="Times New Roman" w:hAnsi="Times New Roman" w:cs="Times New Roman"/>
+        </w:rPr>
+        <w:t>NPR and</w:t>
+      </w:r>
+      <w:r>
+        <w:rPr>
+          <w:rFonts w:ascii="Times New Roman" w:eastAsia="Times New Roman" w:hAnsi="Times New Roman" w:cs="Times New Roman"/>
+        </w:rPr>
+        <w:t xml:space="preserve"> were responsible for identifying and booking expert sources to interview for various news segments and stories. Participants were informed that over the past three months, they had been working on a series of stories about the future of work in America and had selected and interviewed a portfolio of ten experts for these stories.</w:t>
       </w:r>
     </w:p>
     <w:p>
@@ -951,14 +1131,8 @@
         <w:rPr>
           <w:rFonts w:ascii="Times New Roman" w:eastAsia="Times New Roman" w:hAnsi="Times New Roman" w:cs="Times New Roman"/>
         </w:rPr>
-        <w:t xml:space="preserve">We also used stimulus sampling for exactly what descriptive feedback participants received about their past sources. Participants were told that 10% (or 20%) of experts they had featured in the last three </w:t>
-      </w:r>
-      <w:r>
-        <w:rPr>
-          <w:rFonts w:ascii="Times New Roman" w:eastAsia="Times New Roman" w:hAnsi="Times New Roman" w:cs="Times New Roman"/>
-        </w:rPr>
         <w:lastRenderedPageBreak/>
-        <w:t xml:space="preserve">months were women, 30% (or 50%) were under 50 years old, 10% (or 70%) were based on the West Coast, and 50% (or 10%) worked at a university. </w:t>
+        <w:t xml:space="preserve">We also used stimulus sampling for exactly what descriptive feedback participants received about their past sources. Participants were told that 10% (or 20%) of experts they had featured in the last three months were women, 30% (or 50%) were under 50 years old, 10% (or 70%) were based on the West Coast, and 50% (or 10%) worked at a university. </w:t>
       </w:r>
     </w:p>
     <w:p>
@@ -1167,14 +1341,14 @@
           <w:rFonts w:ascii="Times New Roman" w:eastAsia="Times New Roman" w:hAnsi="Times New Roman" w:cs="Times New Roman"/>
         </w:rPr>
         <w:tab/>
-        <w:t xml:space="preserve">To formally test whether offering feedback about the percentage of past experts who were women had a larger effect on the subsequent selection of women experts than offering feedback about other attributes had on the subsequent selection of experts with those attributes, we constructed three systems of simultaneous equations (Zellner, 1962). For each system, we included a pair of equations: one modeling the effect of random assignment to receive gender feedback and one modeling the effect of random assignment to receive feedback on another expert attribute (i.e., past selectees who were under 50 years old, based on the West Coast, or worked at a university, see Table 2, Models 5-8). We then used Wald </w:t>
+        <w:t xml:space="preserve">To formally test whether offering feedback about the percentage of past experts who were women had a larger effect on the subsequent selection of women experts than offering feedback about other attributes had on the subsequent selection of experts with those attributes, we constructed three systems of simultaneous equations (Zellner, 1962). For each system, we included a pair of equations: one modeling the effect of random assignment to receive gender feedback and one modeling the effect of random </w:t>
       </w:r>
       <w:r>
         <w:rPr>
           <w:rFonts w:ascii="Times New Roman" w:eastAsia="Times New Roman" w:hAnsi="Times New Roman" w:cs="Times New Roman"/>
         </w:rPr>
         <w:lastRenderedPageBreak/>
-        <w:t>tests to compare the treatment effects estimated in the paired equations, which confirmed that the effect of assignment to the gender feedback condition on the proportion of women experts selected was significantly larger than the effects of assignment to receive descriptive feedback about the percentage of past experts who were (1) under 50 years old (</w:t>
+        <w:t>assignment to receive feedback on another expert attribute (i.e., past selectees who were under 50 years old, based on the West Coast, or worked at a university, see Table 2, Models 5-8). We then used Wald tests to compare the treatment effects estimated in the paired equations, which confirmed that the effect of assignment to the gender feedback condition on the proportion of women experts selected was significantly larger than the effects of assignment to receive descriptive feedback about the percentage of past experts who were (1) under 50 years old (</w:t>
       </w:r>
       <w:r>
         <w:rPr>
@@ -1379,8 +1553,8 @@
           <w:szCs w:val="22"/>
         </w:rPr>
       </w:pPr>
-      <w:bookmarkStart w:id="22" w:name="_j8c7csy2fu8m" w:colFirst="0" w:colLast="0"/>
-      <w:bookmarkEnd w:id="22"/>
+      <w:bookmarkStart w:id="20" w:name="_j8c7csy2fu8m" w:colFirst="0" w:colLast="0"/>
+      <w:bookmarkEnd w:id="20"/>
       <w:r>
         <w:rPr>
           <w:sz w:val="22"/>
@@ -1401,14 +1575,40 @@
           <w:rFonts w:ascii="Times New Roman" w:eastAsia="Times New Roman" w:hAnsi="Times New Roman" w:cs="Times New Roman"/>
         </w:rPr>
         <w:tab/>
-        <w:t xml:space="preserve">In Study 2, we conducted a framed field experiment (Harrison &amp; List, 2004) to extend our key findings in an in-person, real choice environment in which participants were not aware they were under study. According to Harrison &amp; List (2004, p. 1014), a framed field experiment is “one that uses participants from the specific population of interest (a nonstandard subject pool) and incorporates field context into the commodity, task, or information participants use, making the setting more realistic than a conventional lab experiment.” Our framed field experiment extends our prior findings by examining whether they apply in a setting where people were making real decisions with real impact to their community and were unaware that they were in a research study. Specifically, here we tested whether our </w:t>
+        <w:t xml:space="preserve">In Study 2, we conducted a framed field experiment (Harrison &amp; List, 2004) to extend our key findings in an in-person, real choice environment in which participants were not aware they were under study. According to Harrison &amp; List (2004, p. 1014), a framed field experiment is “one that uses participants from the specific population of interest (a nonstandard subject pool) and incorporates field context into the commodity, task, or information participants use, making the setting more realistic than a conventional lab experiment.” Our framed field experiment extends our prior findings by examining </w:t>
       </w:r>
       <w:r>
         <w:rPr>
           <w:rFonts w:ascii="Times New Roman" w:eastAsia="Times New Roman" w:hAnsi="Times New Roman" w:cs="Times New Roman"/>
         </w:rPr>
         <w:lastRenderedPageBreak/>
-        <w:t xml:space="preserve">key effect of descriptive feedback on selection decisions held when evaluators were making incentive-compatible choices about which prominent figures to feature in a public display in their organization. </w:t>
+        <w:t xml:space="preserve">whether they apply in a setting where people were making real decisions with real impact </w:t>
+      </w:r>
+      <w:r>
+        <w:rPr>
+          <w:rFonts w:ascii="Times New Roman" w:eastAsia="Times New Roman" w:hAnsi="Times New Roman" w:cs="Times New Roman"/>
+        </w:rPr>
+        <w:t>on</w:t>
+      </w:r>
+      <w:r>
+        <w:rPr>
+          <w:rFonts w:ascii="Times New Roman" w:eastAsia="Times New Roman" w:hAnsi="Times New Roman" w:cs="Times New Roman"/>
+        </w:rPr>
+        <w:t xml:space="preserve"> their community and were unaware that they were in a research study. Specifically, here we tested whether our key effect of descriptive feedback on selection decisions </w:t>
+      </w:r>
+      <w:proofErr w:type="gramStart"/>
+      <w:r>
+        <w:rPr>
+          <w:rFonts w:ascii="Times New Roman" w:eastAsia="Times New Roman" w:hAnsi="Times New Roman" w:cs="Times New Roman"/>
+        </w:rPr>
+        <w:t>held</w:t>
+      </w:r>
+      <w:proofErr w:type="gramEnd"/>
+      <w:r>
+        <w:rPr>
+          <w:rFonts w:ascii="Times New Roman" w:eastAsia="Times New Roman" w:hAnsi="Times New Roman" w:cs="Times New Roman"/>
+        </w:rPr>
+        <w:t xml:space="preserve"> when evaluators were making incentive-compatible choices about which prominent figures to feature in a public display in their organization. </w:t>
       </w:r>
     </w:p>
     <w:p>
@@ -1453,7 +1653,7 @@
         </w:rPr>
         <w:t>This study was pre-registered on AsPredicted (</w:t>
       </w:r>
-      <w:hyperlink r:id="rId11">
+      <w:hyperlink r:id="rId9">
         <w:r>
           <w:rPr>
             <w:rFonts w:ascii="Times New Roman" w:eastAsia="Times New Roman" w:hAnsi="Times New Roman" w:cs="Times New Roman"/>
@@ -1534,14 +1734,8 @@
         <w:rPr>
           <w:rFonts w:ascii="Times New Roman" w:eastAsia="Times New Roman" w:hAnsi="Times New Roman" w:cs="Times New Roman"/>
         </w:rPr>
-        <w:t xml:space="preserve">Participants were instructed to vote for an initial portfolio of six biographies they would recommend for the on-campus display. After making their initial selections, participants were randomly </w:t>
-      </w:r>
-      <w:r>
-        <w:rPr>
-          <w:rFonts w:ascii="Times New Roman" w:eastAsia="Times New Roman" w:hAnsi="Times New Roman" w:cs="Times New Roman"/>
-        </w:rPr>
         <w:lastRenderedPageBreak/>
-        <w:t xml:space="preserve">assigned to either (1) the </w:t>
+        <w:t xml:space="preserve">Participants were instructed to vote for an initial portfolio of six biographies they would recommend for the on-campus display. After making their initial selections, participants were randomly assigned to either (1) the </w:t>
       </w:r>
       <w:r>
         <w:rPr>
@@ -1785,7 +1979,14 @@
         <w:rPr>
           <w:rFonts w:ascii="Times New Roman" w:eastAsia="Times New Roman" w:hAnsi="Times New Roman" w:cs="Times New Roman"/>
         </w:rPr>
-        <w:t xml:space="preserve"> to predict whether the seventh and final biography participants selected in this field experiment featured a woman. Our primary predictor was an indicator for assignment to the </w:t>
+        <w:t xml:space="preserve"> to predict whether the seventh and final biography participants selected in this field experiment featured a </w:t>
+      </w:r>
+      <w:r>
+        <w:rPr>
+          <w:rFonts w:ascii="Times New Roman" w:eastAsia="Times New Roman" w:hAnsi="Times New Roman" w:cs="Times New Roman"/>
+        </w:rPr>
+        <w:lastRenderedPageBreak/>
+        <w:t xml:space="preserve">woman. Our primary predictor was an indicator for assignment to the </w:t>
       </w:r>
       <w:r>
         <w:rPr>
@@ -1799,14 +2000,7 @@
         <w:rPr>
           <w:rFonts w:ascii="Times New Roman" w:eastAsia="Times New Roman" w:hAnsi="Times New Roman" w:cs="Times New Roman"/>
         </w:rPr>
-        <w:t xml:space="preserve">condition. As shown in Figure 3B and Model 1 of Table 3, participants were significantly more likely to choose a </w:t>
-      </w:r>
-      <w:r>
-        <w:rPr>
-          <w:rFonts w:ascii="Times New Roman" w:eastAsia="Times New Roman" w:hAnsi="Times New Roman" w:cs="Times New Roman"/>
-        </w:rPr>
-        <w:lastRenderedPageBreak/>
-        <w:t xml:space="preserve">biography featuring a woman as their seventh and final selection in the </w:t>
+        <w:t xml:space="preserve">condition. As shown in Figure 3B and Model 1 of Table 3, participants were significantly more likely to choose a biography featuring a woman as their seventh and final selection in the </w:t>
       </w:r>
       <w:r>
         <w:rPr>
@@ -2075,8 +2269,8 @@
           <w:szCs w:val="22"/>
         </w:rPr>
       </w:pPr>
-      <w:bookmarkStart w:id="23" w:name="_wgyu4jourrdv" w:colFirst="0" w:colLast="0"/>
-      <w:bookmarkEnd w:id="23"/>
+      <w:bookmarkStart w:id="21" w:name="_wgyu4jourrdv" w:colFirst="0" w:colLast="0"/>
+      <w:bookmarkEnd w:id="21"/>
       <w:r>
         <w:rPr>
           <w:sz w:val="22"/>
@@ -2098,7 +2292,26 @@
         <w:rPr>
           <w:rFonts w:ascii="Times New Roman" w:eastAsia="Times New Roman" w:hAnsi="Times New Roman" w:cs="Times New Roman"/>
         </w:rPr>
-        <w:t xml:space="preserve">In Studies 3A and 3B, participants again made a real decision (akin to Study 2) and selected a set of films about famous figures from history to include in a real Facebook advertising campaign. In Study 3A, we moved beyond testing the effect of providing descriptive feedback about the gender of prior selectees to testing the effect of descriptive feedback about the race of initial selectees’ on subsequent selections. </w:t>
+        <w:t xml:space="preserve">In Studies 3A and 3B, participants again made a real decision (akin to Study 2) and selected a set of films about famous figures from history to include in a real Facebook advertising campaign. In Study 3A, we moved beyond testing the effect of providing descriptive feedback about the gender of prior selectees to testing the effect of descriptive feedback about the race of initial </w:t>
+      </w:r>
+      <w:r>
+        <w:rPr>
+          <w:rFonts w:ascii="Times New Roman" w:eastAsia="Times New Roman" w:hAnsi="Times New Roman" w:cs="Times New Roman"/>
+        </w:rPr>
+        <w:t>selectees</w:t>
+      </w:r>
+      <w:r>
+        <w:rPr>
+          <w:rFonts w:ascii="Times New Roman" w:eastAsia="Times New Roman" w:hAnsi="Times New Roman" w:cs="Times New Roman"/>
+        </w:rPr>
+        <w:t xml:space="preserve"> on subsequent </w:t>
+      </w:r>
+      <w:r>
+        <w:rPr>
+          <w:rFonts w:ascii="Times New Roman" w:eastAsia="Times New Roman" w:hAnsi="Times New Roman" w:cs="Times New Roman"/>
+        </w:rPr>
+        <w:lastRenderedPageBreak/>
+        <w:t xml:space="preserve">selections. </w:t>
       </w:r>
     </w:p>
     <w:p>
@@ -2108,8 +2321,8 @@
         <w:keepLines w:val="0"/>
         <w:widowControl w:val="0"/>
       </w:pPr>
-      <w:bookmarkStart w:id="24" w:name="_vrtuv94miurq" w:colFirst="0" w:colLast="0"/>
-      <w:bookmarkEnd w:id="24"/>
+      <w:bookmarkStart w:id="22" w:name="_vrtuv94miurq" w:colFirst="0" w:colLast="0"/>
+      <w:bookmarkEnd w:id="22"/>
       <w:r>
         <w:rPr>
           <w:sz w:val="22"/>
@@ -2134,7 +2347,6 @@
           <w:b/>
           <w:bCs/>
         </w:rPr>
-        <w:lastRenderedPageBreak/>
         <w:t>Methods</w:t>
       </w:r>
     </w:p>
@@ -2161,7 +2373,7 @@
         </w:rPr>
         <w:t>As pre-registered (</w:t>
       </w:r>
-      <w:hyperlink r:id="rId12">
+      <w:hyperlink r:id="rId10">
         <w:r>
           <w:rPr>
             <w:rFonts w:ascii="Times New Roman" w:eastAsia="Times New Roman" w:hAnsi="Times New Roman" w:cs="Times New Roman"/>
@@ -2300,7 +2512,14 @@
         <w:rPr>
           <w:rFonts w:ascii="Times New Roman" w:eastAsia="Times New Roman" w:hAnsi="Times New Roman" w:cs="Times New Roman"/>
         </w:rPr>
-        <w:t xml:space="preserve">condition, participants always received descriptive feedback about the percentage of films they had selected that featured a racial minority protagonist alongside two randomly drawn pieces of feedback from the list of film attributes summarized in the </w:t>
+        <w:t xml:space="preserve">condition, participants always received descriptive feedback about the percentage of films </w:t>
+      </w:r>
+      <w:r>
+        <w:rPr>
+          <w:rFonts w:ascii="Times New Roman" w:eastAsia="Times New Roman" w:hAnsi="Times New Roman" w:cs="Times New Roman"/>
+        </w:rPr>
+        <w:lastRenderedPageBreak/>
+        <w:t xml:space="preserve">they had selected that featured a racial minority protagonist alongside two randomly drawn pieces of feedback from the list of film attributes summarized in the </w:t>
       </w:r>
       <w:r>
         <w:rPr>
@@ -2314,14 +2533,7 @@
         <w:rPr>
           <w:rFonts w:ascii="Times New Roman" w:eastAsia="Times New Roman" w:hAnsi="Times New Roman" w:cs="Times New Roman"/>
         </w:rPr>
-        <w:t xml:space="preserve"> condition. After receiving </w:t>
-      </w:r>
-      <w:r>
-        <w:rPr>
-          <w:rFonts w:ascii="Times New Roman" w:eastAsia="Times New Roman" w:hAnsi="Times New Roman" w:cs="Times New Roman"/>
-        </w:rPr>
-        <w:lastRenderedPageBreak/>
-        <w:t>descriptive feedback on the composition of their initial film selections, participants selected an eighth and final film for the Facebook campaign from the original set, where their prior selections were highlighted. See Materials Section: Study 3A in the Appendix for complete study materials.</w:t>
+        <w:t xml:space="preserve"> condition. After receiving descriptive feedback on the composition of their initial film selections, participants selected an eighth and final film for the Facebook campaign from the original set, where their prior selections were highlighted. See Materials Section: Study 3A in the Appendix for complete study materials.</w:t>
       </w:r>
     </w:p>
     <w:p>
@@ -2549,7 +2761,19 @@
         <w:rPr>
           <w:rFonts w:ascii="Times New Roman" w:eastAsia="Times New Roman" w:hAnsi="Times New Roman" w:cs="Times New Roman"/>
         </w:rPr>
-        <w:t> = .006), (2) release year prior to 2010 (</w:t>
+        <w:t xml:space="preserve"> = .006), (2) release year </w:t>
+      </w:r>
+      <w:r>
+        <w:rPr>
+          <w:rFonts w:ascii="Times New Roman" w:eastAsia="Times New Roman" w:hAnsi="Times New Roman" w:cs="Times New Roman"/>
+        </w:rPr>
+        <w:t xml:space="preserve">after </w:t>
+      </w:r>
+      <w:r>
+        <w:rPr>
+          <w:rFonts w:ascii="Times New Roman" w:eastAsia="Times New Roman" w:hAnsi="Times New Roman" w:cs="Times New Roman"/>
+        </w:rPr>
+        <w:t>2010 (</w:t>
       </w:r>
       <w:r>
         <w:rPr>
@@ -2605,25 +2829,38 @@
         <w:rPr>
           <w:rFonts w:ascii="Times New Roman" w:eastAsia="Times New Roman" w:hAnsi="Times New Roman" w:cs="Times New Roman"/>
         </w:rPr>
-        <w:t> = .009) on subsequent selections of an 8th and final biopic with, respectively, a (1) budget above $40M, (2) release year prior to 2010 or (3) average duration of over two hours.</w:t>
+        <w:t xml:space="preserve"> = .009) on subsequent selections of an 8th and final biopic with, respectively, a (1) budget above $40M, (2) release year </w:t>
+      </w:r>
+      <w:r>
+        <w:rPr>
+          <w:rFonts w:ascii="Times New Roman" w:eastAsia="Times New Roman" w:hAnsi="Times New Roman" w:cs="Times New Roman"/>
+        </w:rPr>
+        <w:t>after</w:t>
+      </w:r>
+      <w:r>
+        <w:rPr>
+          <w:rFonts w:ascii="Times New Roman" w:eastAsia="Times New Roman" w:hAnsi="Times New Roman" w:cs="Times New Roman"/>
+        </w:rPr>
+        <w:t xml:space="preserve"> 2010 or (3) average duration of over two hours.</w:t>
       </w:r>
     </w:p>
     <w:p>
       <w:pPr>
         <w:pStyle w:val="Heading3"/>
-        <w:ind w:firstLine="720"/>
+        <w:ind w:left="0" w:firstLine="720"/>
         <w:rPr>
           <w:sz w:val="22"/>
           <w:szCs w:val="22"/>
         </w:rPr>
       </w:pPr>
-      <w:bookmarkStart w:id="25" w:name="_r825n1atmpig" w:colFirst="0" w:colLast="0"/>
-      <w:bookmarkEnd w:id="25"/>
+      <w:bookmarkStart w:id="23" w:name="_r825n1atmpig" w:colFirst="0" w:colLast="0"/>
+      <w:bookmarkEnd w:id="23"/>
       <w:r>
         <w:rPr>
           <w:sz w:val="22"/>
           <w:szCs w:val="22"/>
         </w:rPr>
+        <w:lastRenderedPageBreak/>
         <w:t>4.2 Study 3B</w:t>
       </w:r>
     </w:p>
@@ -2639,14 +2876,7 @@
         <w:rPr>
           <w:rFonts w:ascii="Times New Roman" w:eastAsia="Times New Roman" w:hAnsi="Times New Roman" w:cs="Times New Roman"/>
         </w:rPr>
-        <w:t xml:space="preserve">In this study, we sought to replicate our key findings from Study 3A about how feedback affects real selection decisions, but this time we provide descriptive feedback about the gender of the </w:t>
-      </w:r>
-      <w:r>
-        <w:rPr>
-          <w:rFonts w:ascii="Times New Roman" w:eastAsia="Times New Roman" w:hAnsi="Times New Roman" w:cs="Times New Roman"/>
-        </w:rPr>
-        <w:lastRenderedPageBreak/>
-        <w:t>protagonists in films selected for inclusion in a Facebook advertising campaign rather than feedback about the race of the films’ protagonists.</w:t>
+        <w:t>In this study, we sought to replicate our key findings from Study 3A about how feedback affects real selection decisions, but this time we provide descriptive feedback about the gender of the protagonists in films selected for inclusion in a Facebook advertising campaign rather than feedback about the race of the films’ protagonists.</w:t>
       </w:r>
       <w:r>
         <w:t xml:space="preserve"> </w:t>
@@ -2694,7 +2924,7 @@
         </w:rPr>
         <w:t>As pre-registered (</w:t>
       </w:r>
-      <w:hyperlink r:id="rId13">
+      <w:hyperlink r:id="rId11">
         <w:r>
           <w:rPr>
             <w:rFonts w:ascii="Times New Roman" w:eastAsia="Times New Roman" w:hAnsi="Times New Roman" w:cs="Times New Roman"/>
@@ -2745,7 +2975,19 @@
         <w:rPr>
           <w:rFonts w:ascii="Times New Roman" w:eastAsia="Times New Roman" w:hAnsi="Times New Roman" w:cs="Times New Roman"/>
         </w:rPr>
-        <w:t xml:space="preserve">The procedure in this study was nearly identical to the procedure described in Study 3A with a few small differences. First, the set of 25 biopics participants could choose to feature in a Facebook advertisement differed — the selection set in this study included 19 films featuring male protagonists and 6 featuring female protagonists (24% of the protagonist pool were women). Second, participants began by selecting an initial portfolio of six films for inclusion in the Facebook advertising campaign instead of seven (to establish our results generalize across selection set size). Finally, the brief description provided of each film did not state the length of the film; instead, it presented information about the film protagonist’s profession  (e.g., “A film about George W. Bush. Who was he? 43rd U.S. President.”). </w:t>
+        <w:t xml:space="preserve">The procedure in this study was nearly identical to the procedure described in Study 3A with a few small differences. First, the set of 25 biopics participants could choose to feature in a Facebook advertisement differed — the selection set in this study included 19 films featuring male protagonists and 6 featuring female protagonists (24% of the protagonist pool were women). Second, participants began by selecting an initial portfolio of six films for inclusion in the Facebook advertising campaign instead of seven (to establish our results generalize across selection set size). Finally, the brief description provided of each film did not state the length of the film; instead, it presented information about the film protagonist’s </w:t>
+      </w:r>
+      <w:r>
+        <w:rPr>
+          <w:rFonts w:ascii="Times New Roman" w:eastAsia="Times New Roman" w:hAnsi="Times New Roman" w:cs="Times New Roman"/>
+        </w:rPr>
+        <w:t>profession (</w:t>
+      </w:r>
+      <w:r>
+        <w:rPr>
+          <w:rFonts w:ascii="Times New Roman" w:eastAsia="Times New Roman" w:hAnsi="Times New Roman" w:cs="Times New Roman"/>
+        </w:rPr>
+        <w:t xml:space="preserve">e.g., “A film about George W. Bush. Who was he? 43rd U.S. President.”). </w:t>
       </w:r>
     </w:p>
     <w:p>
@@ -2831,7 +3073,14 @@
         <w:rPr>
           <w:rFonts w:ascii="Times New Roman" w:eastAsia="Times New Roman" w:hAnsi="Times New Roman" w:cs="Times New Roman"/>
         </w:rPr>
-        <w:t xml:space="preserve">condition, participants always received feedback about the percentage of films they had selected featuring a woman protagonist. This information was provided alongside two additional pieces of descriptive feedback about their set of selected films. The two additional pieces of descriptive feedback provided were randomly drawn from the list of three descriptive statistics provided in the </w:t>
+        <w:t xml:space="preserve">condition, participants always received feedback about the percentage of films they had selected featuring a woman protagonist. This information was provided alongside two additional </w:t>
+      </w:r>
+      <w:r>
+        <w:rPr>
+          <w:rFonts w:ascii="Times New Roman" w:eastAsia="Times New Roman" w:hAnsi="Times New Roman" w:cs="Times New Roman"/>
+        </w:rPr>
+        <w:lastRenderedPageBreak/>
+        <w:t xml:space="preserve">pieces of descriptive feedback about their set of selected films. The two additional pieces of descriptive feedback provided were randomly drawn from the list of three descriptive statistics provided in the </w:t>
       </w:r>
       <w:r>
         <w:rPr>
@@ -2845,14 +3094,7 @@
         <w:rPr>
           <w:rFonts w:ascii="Times New Roman" w:eastAsia="Times New Roman" w:hAnsi="Times New Roman" w:cs="Times New Roman"/>
         </w:rPr>
-        <w:t xml:space="preserve"> condition. After receiving (condition-dependent) descriptive feedback about the </w:t>
-      </w:r>
-      <w:r>
-        <w:rPr>
-          <w:rFonts w:ascii="Times New Roman" w:eastAsia="Times New Roman" w:hAnsi="Times New Roman" w:cs="Times New Roman"/>
-        </w:rPr>
-        <w:lastRenderedPageBreak/>
-        <w:t>composition of their initial set of six film selections, participants selected a seventh and final film for the Facebook campaign from the original film candidate set, where their prior selections were highlighted as a reminder. See Materials Section: Study 3B in the Appendix for complete study materials.</w:t>
+        <w:t xml:space="preserve"> condition. After receiving (condition-dependent) descriptive feedback about the composition of their initial set of six film selections, participants selected a seventh and final film for the Facebook campaign from the original film candidate set, where their prior selections were highlighted as a reminder. See Materials Section: Study 3B in the Appendix for complete study materials.</w:t>
       </w:r>
     </w:p>
     <w:p>
@@ -3129,7 +3371,19 @@
         <w:rPr>
           <w:rFonts w:ascii="Times New Roman" w:eastAsia="Times New Roman" w:hAnsi="Times New Roman" w:cs="Times New Roman"/>
         </w:rPr>
-        <w:t xml:space="preserve"> &lt; .001), or (3) release year prior to 2010 (</w:t>
+        <w:t xml:space="preserve"> &lt; .001), or (3) release year </w:t>
+      </w:r>
+      <w:r>
+        <w:rPr>
+          <w:rFonts w:ascii="Times New Roman" w:eastAsia="Times New Roman" w:hAnsi="Times New Roman" w:cs="Times New Roman"/>
+        </w:rPr>
+        <w:t>after</w:t>
+      </w:r>
+      <w:r>
+        <w:rPr>
+          <w:rFonts w:ascii="Times New Roman" w:eastAsia="Times New Roman" w:hAnsi="Times New Roman" w:cs="Times New Roman"/>
+        </w:rPr>
+        <w:t xml:space="preserve"> 2010 (</w:t>
       </w:r>
       <w:r>
         <w:rPr>
@@ -3157,7 +3411,26 @@
         <w:rPr>
           <w:rFonts w:ascii="Times New Roman" w:eastAsia="Times New Roman" w:hAnsi="Times New Roman" w:cs="Times New Roman"/>
         </w:rPr>
-        <w:t xml:space="preserve"> &lt; .001) on subsequent selections of a 7th and final biopic with, respectively, a (1) budget above $40M, (2) political leader protagonist, or (3) release year prior to 2010 (in fact, all other types of feedback had insignificant effects on subsequent film selections).</w:t>
+        <w:t xml:space="preserve"> &lt; .001) on subsequent selections of a 7th and final biopic with, respectively, a (1) budget above $40M, (2) political leader </w:t>
+      </w:r>
+      <w:r>
+        <w:rPr>
+          <w:rFonts w:ascii="Times New Roman" w:eastAsia="Times New Roman" w:hAnsi="Times New Roman" w:cs="Times New Roman"/>
+        </w:rPr>
+        <w:lastRenderedPageBreak/>
+        <w:t xml:space="preserve">protagonist, or (3) release year </w:t>
+      </w:r>
+      <w:r>
+        <w:rPr>
+          <w:rFonts w:ascii="Times New Roman" w:eastAsia="Times New Roman" w:hAnsi="Times New Roman" w:cs="Times New Roman"/>
+        </w:rPr>
+        <w:t>after</w:t>
+      </w:r>
+      <w:r>
+        <w:rPr>
+          <w:rFonts w:ascii="Times New Roman" w:eastAsia="Times New Roman" w:hAnsi="Times New Roman" w:cs="Times New Roman"/>
+        </w:rPr>
+        <w:t xml:space="preserve"> 2010 (in fact, all other types of feedback had insignificant effects on subsequent film selections).</w:t>
       </w:r>
     </w:p>
     <w:p>
@@ -3193,14 +3466,25 @@
           <w:b/>
           <w:bCs/>
         </w:rPr>
-        <w:lastRenderedPageBreak/>
         <w:tab/>
       </w:r>
       <w:r>
         <w:rPr>
           <w:rFonts w:ascii="Times New Roman" w:eastAsia="Times New Roman" w:hAnsi="Times New Roman" w:cs="Times New Roman"/>
         </w:rPr>
-        <w:t xml:space="preserve">Across two experiments involving incentivized decisions, we found that providing descriptive feedback about the race (Study 3A) or gender (Study 3B) of protagonists featured in past films selected for a marketing campaign significantly increased the likelihood that participants subsequently selected films featuring women or racial minorities, respectively. One possible alternative explanation for our findings is that providing participants with feedback about the race or gender of past selections signaled that we valued racial or gender diversity. For example, when participants first selected films, they might have chosen based on personal preferences. But when they received descriptive feedback summarizing the attributes of their selected biopics, evaluators may have inferred that protagonist race (in Study 3A) or gender (in Study 3B) were of particular significance to the experimenter and attended to these attributes more in subsequent decisions as a result of a “demand effect” (Orne, 1962; Zizzo, 2010). If this alternative explanation were driving our effects, however, we would also expect participants to respond to the “demand effect” inherent in receiving feedback about other attributes of their selected films (e.g., feedback about a film’s budget or year of release), but we found no such patterns. </w:t>
+        <w:t xml:space="preserve">Across two experiments involving incentivized decisions, we found that providing descriptive feedback about the race (Study 3A) or gender (Study 3B) of protagonists featured in past films selected for a marketing campaign significantly increased the likelihood that participants subsequently selected films featuring women or racial minorities, respectively. One possible alternative explanation for our findings is that providing participants with feedback about the race or gender of past selections signaled that we </w:t>
+      </w:r>
+      <w:r>
+        <w:rPr>
+          <w:rFonts w:ascii="Times New Roman" w:eastAsia="Times New Roman" w:hAnsi="Times New Roman" w:cs="Times New Roman"/>
+        </w:rPr>
+        <w:t>value</w:t>
+      </w:r>
+      <w:r>
+        <w:rPr>
+          <w:rFonts w:ascii="Times New Roman" w:eastAsia="Times New Roman" w:hAnsi="Times New Roman" w:cs="Times New Roman"/>
+        </w:rPr>
+        <w:t xml:space="preserve"> racial or gender diversity. For example, when participants first selected films, they might have chosen based on personal preferences. But when they received descriptive feedback summarizing the attributes of their selected biopics, evaluators may have inferred that protagonist race (in Study 3A) or gender (in Study 3B) were of particular significance to the experimenter and attended to these attributes more in subsequent decisions as a result of a “demand effect” (Orne, 1962; Zizzo, 2010). If this alternative explanation were driving our effects, however, we would also expect participants to respond to the “demand effect” inherent in receiving feedback about other attributes of their selected films (e.g., feedback about a film’s budget or year of release), but we found no such patterns. </w:t>
       </w:r>
     </w:p>
     <w:p>
@@ -3216,14 +3500,50 @@
         <w:rPr>
           <w:rFonts w:ascii="Times New Roman" w:eastAsia="Times New Roman" w:hAnsi="Times New Roman" w:cs="Times New Roman"/>
         </w:rPr>
-        <w:t xml:space="preserve">However, to further rule out a “demand effect” explanation for our findings, we conducted two supplemental experiments (Studies S2A and S2B, detailed in pages 7-11 in the Appendix). In both studies, we employed a 2x2 design, crossing our original gender feedback manipulation with the addition of an explicit injunctive norm message (i.e., “The organization planning this event cares deeply about presenting a diversity of speakers in terms of [their experience in CEO roles, their experience as company founders, their background in the technology industry] and their gender.”) to the participant emphasizing the importance of making diverse selections. In Study S2A, participants made hypothetical selections of corporate speakers to join a high-profile panel, while in Study S2B, participants made incentivized selections of podcasts hosted by prominent men and women to include in a Facebook advertisement. Across both studies, we replicated our finding from Study 3B: descriptive feedback about the gender of past selectees increased the likelihood that participants subsequently selected a woman. However, explicitly highlighting the importance of making diverse selections (via an explicit injunctive norm </w:t>
+        <w:t xml:space="preserve">However, to further rule out a “demand effect” explanation for our findings, we conducted two supplemental experiments (Studies S2A and S2B, detailed in pages 7-11 in the Appendix). </w:t>
+      </w:r>
+      <w:r>
+        <w:rPr>
+          <w:rFonts w:ascii="Times New Roman" w:eastAsia="Times New Roman" w:hAnsi="Times New Roman" w:cs="Times New Roman"/>
+        </w:rPr>
+        <w:t xml:space="preserve">In both studies, we employed a 2x2 design, crossing our original gender feedback manipulation with the addition of a values-based injunctive message </w:t>
+      </w:r>
+      <w:r>
+        <w:rPr>
+          <w:rFonts w:ascii="Times New Roman" w:eastAsia="Times New Roman" w:hAnsi="Times New Roman" w:cs="Times New Roman"/>
+        </w:rPr>
+        <w:t>(i.e., “The organization planning this event cares deeply about presenting a diversity of speakers in terms of [their experience in CEO roles, their experience as company founders, their background in the technology industry] and their gender.”) to the participant emphasizing the importance of making diverse selections.</w:t>
+      </w:r>
+      <w:r>
+        <w:rPr>
+          <w:rFonts w:ascii="Times New Roman" w:eastAsia="Times New Roman" w:hAnsi="Times New Roman" w:cs="Times New Roman"/>
+        </w:rPr>
+        <w:t xml:space="preserve"> </w:t>
+      </w:r>
+      <w:r>
+        <w:rPr>
+          <w:rFonts w:ascii="Times New Roman" w:eastAsia="Times New Roman" w:hAnsi="Times New Roman" w:cs="Times New Roman"/>
+        </w:rPr>
+        <w:t>This message was designed to parallel real-world organizational communications, which typically signal that diversity is valued rather than issue direct commands about whom to select</w:t>
+      </w:r>
+      <w:r>
+        <w:rPr>
+          <w:rFonts w:ascii="Times New Roman" w:eastAsia="Times New Roman" w:hAnsi="Times New Roman" w:cs="Times New Roman"/>
+        </w:rPr>
+        <w:t xml:space="preserve">. </w:t>
+      </w:r>
+      <w:r>
+        <w:rPr>
+          <w:rFonts w:ascii="Times New Roman" w:eastAsia="Times New Roman" w:hAnsi="Times New Roman" w:cs="Times New Roman"/>
+        </w:rPr>
+        <w:t xml:space="preserve">In Study S2A, participants made hypothetical selections of corporate </w:t>
       </w:r>
       <w:r>
         <w:rPr>
           <w:rFonts w:ascii="Times New Roman" w:eastAsia="Times New Roman" w:hAnsi="Times New Roman" w:cs="Times New Roman"/>
         </w:rPr>
         <w:lastRenderedPageBreak/>
-        <w:t>message) did not significantly increase the selection of women candidates (in S2A: the message produced a regression-estimated 3% increase in the selection of women panelists, </w:t>
+        <w:t>speakers to join a high-profile panel, while in Study S2B, participants made incentivized selections of podcasts hosted by prominent men and women to include in a Facebook advertisement. Across both studies, we replicated our finding from Study 3B: descriptive feedback about the gender of past selectees increased the likelihood that participants subsequently selected a woman. However, explicitly highlighting the importance of making diverse selections (via an explicit injunctive norm message) did not significantly increase the selection of women candidates (in S2A: the message produced a regression-estimated 3% increase in the selection of women panelists, </w:t>
       </w:r>
       <w:r>
         <w:rPr>
@@ -3422,13 +3742,14 @@
           <w:szCs w:val="22"/>
         </w:rPr>
       </w:pPr>
-      <w:bookmarkStart w:id="26" w:name="_hct56pqxjd44" w:colFirst="0" w:colLast="0"/>
-      <w:bookmarkEnd w:id="26"/>
+      <w:bookmarkStart w:id="24" w:name="_hct56pqxjd44" w:colFirst="0" w:colLast="0"/>
+      <w:bookmarkEnd w:id="24"/>
       <w:r>
         <w:rPr>
           <w:sz w:val="22"/>
           <w:szCs w:val="22"/>
         </w:rPr>
+        <w:lastRenderedPageBreak/>
         <w:t>5</w:t>
       </w:r>
       <w:r>
@@ -3506,7 +3827,7 @@
         </w:rPr>
         <w:t>As pre-registered (</w:t>
       </w:r>
-      <w:hyperlink r:id="rId14">
+      <w:hyperlink r:id="rId12">
         <w:r>
           <w:rPr>
             <w:rFonts w:ascii="Times New Roman" w:eastAsia="Times New Roman" w:hAnsi="Times New Roman" w:cs="Times New Roman"/>
@@ -3520,14 +3841,7 @@
         <w:rPr>
           <w:rFonts w:ascii="Times New Roman" w:eastAsia="Times New Roman" w:hAnsi="Times New Roman" w:cs="Times New Roman"/>
         </w:rPr>
-        <w:t xml:space="preserve">), we recruited 1,000 participants on Amazon’s MTurk. Participants were based in the U.S., had a minimum 90% approval rate and at least 1,000 prior completions, and were paid $0.75 to complete a 3-minute survey (47.6% men, </w:t>
-      </w:r>
-      <w:r>
-        <w:rPr>
-          <w:rFonts w:ascii="Times New Roman" w:eastAsia="Times New Roman" w:hAnsi="Times New Roman" w:cs="Times New Roman"/>
-        </w:rPr>
-        <w:lastRenderedPageBreak/>
-        <w:t>51.5% women; M</w:t>
+        <w:t>), we recruited 1,000 participants on Amazon’s MTurk. Participants were based in the U.S., had a minimum 90% approval rate and at least 1,000 prior completions, and were paid $0.75 to complete a 3-minute survey (47.6% men, 51.5% women; M</w:t>
       </w:r>
       <w:r>
         <w:rPr>
@@ -3704,14 +4018,14 @@
         <w:rPr>
           <w:rFonts w:ascii="Times New Roman" w:eastAsia="Times New Roman" w:hAnsi="Times New Roman" w:cs="Times New Roman"/>
         </w:rPr>
-        <w:t xml:space="preserve">. To assess the extent to which participants considered internal motives (e.g., image concerns) when deciding which final author to select, we adapted four items from Plant and Devine’s (1998) internal motivation to respond without prejudice scale (e.g., “Given my personal values and beliefs, an important factor in my selection of the seventh author to add to my list was my desire to promote the success of racial minorities.”; Cronbach’s α = 0.93). Each item was collected on a scale from 1 (Strongly disagree) to 7 (Strongly agree). As pre-registered, we collapsed the </w:t>
+        <w:t xml:space="preserve">. To assess the extent to which participants considered internal motives (e.g., image concerns) when deciding which final author to select, we adapted </w:t>
       </w:r>
       <w:r>
         <w:rPr>
           <w:rFonts w:ascii="Times New Roman" w:eastAsia="Times New Roman" w:hAnsi="Times New Roman" w:cs="Times New Roman"/>
         </w:rPr>
         <w:lastRenderedPageBreak/>
-        <w:t>items into a single scale by z-scoring</w:t>
+        <w:t>four items from Plant and Devine’s (1998) internal motivation to respond without prejudice scale (e.g., “Given my personal values and beliefs, an important factor in my selection of the seventh author to add to my list was my desire to promote the success of racial minorities.”; Cronbach’s α = 0.93). Each item was collected on a scale from 1 (Strongly disagree) to 7 (Strongly agree). As pre-registered, we collapsed the items into a single scale by z-scoring</w:t>
       </w:r>
       <w:r>
         <w:rPr>
@@ -3748,7 +4062,19 @@
         <w:rPr>
           <w:rFonts w:ascii="Times New Roman" w:eastAsia="Times New Roman" w:hAnsi="Times New Roman" w:cs="Times New Roman"/>
         </w:rPr>
-        <w:t xml:space="preserve">. To assess the extent to which participants considered external motives (e.g., reputational concerns) when deciding on which final author to select, we adapted three items from Plant and Devine’s external motivation to respond without prejudice scale (e.g., “When making my decision about who to select as my seventh author, I considered the social pressures I face to appear to promote racial minorities where they are typically underrepresented.”; Cronbach’s α = 0.90). Each item was collected on a scale from 1 (Strongly disagree) to 7 (Strongly agree). As pre-registered, we collapsed the items into a single scale by z-scoring and then averaging them. </w:t>
+        <w:t xml:space="preserve">. To assess the extent to which participants considered external motives (e.g., reputational concerns) when deciding on which final author to select, we adapted three items from Plant and Devine’s external motivation to respond without prejudice scale (e.g., “When making my decision about who to select as my seventh author, I considered the social pressures I face to appear to promote racial minorities where they are typically underrepresented.”; Cronbach’s α = 0.90). Each item was collected on a scale from 1 (Strongly disagree) to 7 (Strongly agree). As pre-registered, we collapsed the items </w:t>
+      </w:r>
+      <w:r>
+        <w:rPr>
+          <w:rFonts w:ascii="Times New Roman" w:eastAsia="Times New Roman" w:hAnsi="Times New Roman" w:cs="Times New Roman"/>
+        </w:rPr>
+        <w:t>on</w:t>
+      </w:r>
+      <w:r>
+        <w:rPr>
+          <w:rFonts w:ascii="Times New Roman" w:eastAsia="Times New Roman" w:hAnsi="Times New Roman" w:cs="Times New Roman"/>
+        </w:rPr>
+        <w:t xml:space="preserve"> a single scale by z-scoring and then averaging them. </w:t>
       </w:r>
     </w:p>
     <w:p>
@@ -3895,7 +4221,14 @@
         <w:rPr>
           <w:rFonts w:ascii="Times New Roman" w:eastAsia="Times New Roman" w:hAnsi="Times New Roman" w:cs="Times New Roman"/>
         </w:rPr>
-        <w:t> = 0.134, 95% CI = [0.075, 0.193], </w:t>
+        <w:t xml:space="preserve"> = </w:t>
+      </w:r>
+      <w:r>
+        <w:rPr>
+          <w:rFonts w:ascii="Times New Roman" w:eastAsia="Times New Roman" w:hAnsi="Times New Roman" w:cs="Times New Roman"/>
+        </w:rPr>
+        <w:lastRenderedPageBreak/>
+        <w:t>0.134, 95% CI = [0.075, 0.193], </w:t>
       </w:r>
       <w:r>
         <w:rPr>
@@ -3993,14 +4326,7 @@
         <w:rPr>
           <w:rFonts w:ascii="Times New Roman" w:eastAsia="Times New Roman" w:hAnsi="Times New Roman" w:cs="Times New Roman"/>
         </w:rPr>
-        <w:t xml:space="preserve">(1, </w:t>
-      </w:r>
-      <w:r>
-        <w:rPr>
-          <w:rFonts w:ascii="Times New Roman" w:eastAsia="Times New Roman" w:hAnsi="Times New Roman" w:cs="Times New Roman"/>
-        </w:rPr>
-        <w:lastRenderedPageBreak/>
-        <w:t>3984) = 5.26, </w:t>
+        <w:t>(1, 3984) = 5.26, </w:t>
       </w:r>
       <w:r>
         <w:rPr>
@@ -4134,6 +4460,7 @@
         <w:rPr>
           <w:rFonts w:ascii="Times New Roman" w:eastAsia="Times New Roman" w:hAnsi="Times New Roman" w:cs="Times New Roman"/>
         </w:rPr>
+        <w:lastRenderedPageBreak/>
         <w:t>Given these results, we next tested whether both internal and external motivation to respond without prejudice would continue to mediate in a multiple mediation model, following our pre-registration. This multiple mediation model allows us to address potential multicollinearity between these correlated measures (</w:t>
       </w:r>
       <w:r>
@@ -4162,14 +4489,7 @@
         <w:rPr>
           <w:rFonts w:ascii="Times New Roman" w:eastAsia="Times New Roman" w:hAnsi="Times New Roman" w:cs="Times New Roman"/>
         </w:rPr>
-        <w:t xml:space="preserve"> &lt; 0.001). The results suggested that, once we account for correlation </w:t>
-      </w:r>
-      <w:r>
-        <w:rPr>
-          <w:rFonts w:ascii="Times New Roman" w:eastAsia="Times New Roman" w:hAnsi="Times New Roman" w:cs="Times New Roman"/>
-        </w:rPr>
-        <w:lastRenderedPageBreak/>
-        <w:t xml:space="preserve">between the two constructs, internal motivation to respond without prejudice (indirect effect = 0.08, 95% CI = [0.042, 0.11]), significantly mediates our effect of interest while external motivation to respond without prejudice (indirect effect = -0.014, 95% CI = [-0.03, 0.00]) does not.  </w:t>
+        <w:t xml:space="preserve"> &lt; 0.001). The results suggested that, once we account for correlation between the two constructs, internal motivation to respond without prejudice (indirect effect = 0.08, 95% CI = [0.042, 0.11]), significantly mediates our effect of interest while external motivation to respond without prejudice (indirect effect = -0.014, 95% CI = [-0.03, 0.00]) does not.  </w:t>
       </w:r>
     </w:p>
     <w:p>
@@ -4180,8 +4500,8 @@
           <w:szCs w:val="22"/>
         </w:rPr>
       </w:pPr>
-      <w:bookmarkStart w:id="27" w:name="_pdz6rngjvth3" w:colFirst="0" w:colLast="0"/>
-      <w:bookmarkEnd w:id="27"/>
+      <w:bookmarkStart w:id="25" w:name="_pdz6rngjvth3" w:colFirst="0" w:colLast="0"/>
+      <w:bookmarkEnd w:id="25"/>
       <w:r>
         <w:rPr>
           <w:sz w:val="22"/>
@@ -4445,7 +4765,14 @@
         <w:rPr>
           <w:rFonts w:ascii="Times New Roman" w:eastAsia="Times New Roman" w:hAnsi="Times New Roman" w:cs="Times New Roman"/>
         </w:rPr>
-        <w:t>Given that liberals and conservatives differ not only in their attitudes toward diversity but also in their understanding of what diversity means (Howard, Cervone, &amp; Motyl, 2022), and that recent research suggests diversity initiatives may produce divergent reactions across the political spectrum (Hachem &amp; Dover, 2024), we also examine whether participants’ political ideology moderates the effect of providing descriptive feedback about the gender of past selectees.</w:t>
+        <w:t xml:space="preserve">Given that liberals and conservatives differ not only in their attitudes toward diversity but also in their understanding of what diversity means (Howard, Cervone, &amp; Motyl, 2022), and that recent research suggests diversity initiatives may produce divergent reactions across the political spectrum (Hachem &amp; Dover, 2024), we also examine whether participants’ political ideology moderates the effect of providing </w:t>
+      </w:r>
+      <w:r>
+        <w:rPr>
+          <w:rFonts w:ascii="Times New Roman" w:eastAsia="Times New Roman" w:hAnsi="Times New Roman" w:cs="Times New Roman"/>
+        </w:rPr>
+        <w:lastRenderedPageBreak/>
+        <w:t>descriptive feedback about the gender of past selectees.</w:t>
       </w:r>
     </w:p>
     <w:p>
@@ -4489,7 +4816,7 @@
         </w:rPr>
         <w:t>As pre-registered (</w:t>
       </w:r>
-      <w:hyperlink r:id="rId15">
+      <w:hyperlink r:id="rId13">
         <w:r>
           <w:rPr>
             <w:rFonts w:ascii="Times New Roman" w:eastAsia="Times New Roman" w:hAnsi="Times New Roman" w:cs="Times New Roman"/>
@@ -4503,14 +4830,7 @@
         <w:rPr>
           <w:rFonts w:ascii="Times New Roman" w:eastAsia="Times New Roman" w:hAnsi="Times New Roman" w:cs="Times New Roman"/>
         </w:rPr>
-        <w:t xml:space="preserve">), we recruited 1,000 participants through Prolific Academic. Participants were based in the U.S., had a minimum 90% approval rate and at least </w:t>
-      </w:r>
-      <w:r>
-        <w:rPr>
-          <w:rFonts w:ascii="Times New Roman" w:eastAsia="Times New Roman" w:hAnsi="Times New Roman" w:cs="Times New Roman"/>
-        </w:rPr>
-        <w:lastRenderedPageBreak/>
-        <w:t xml:space="preserve">1,000 prior completions, and were paid $0.75 to complete a 3-minute survey (48.0% men, 50.7% women, 1.1% non-binary; </w:t>
+        <w:t xml:space="preserve">), we recruited 1,000 participants through Prolific Academic. Participants were based in the U.S., had a minimum 90% approval rate and at least 1,000 prior completions, and were paid $0.75 to complete a 3-minute survey (48.0% men, 50.7% women, 1.1% non-binary; </w:t>
       </w:r>
       <w:r>
         <w:rPr>
@@ -4643,7 +4963,14 @@
         <w:rPr>
           <w:rFonts w:ascii="Times New Roman" w:eastAsia="Times New Roman" w:hAnsi="Times New Roman" w:cs="Times New Roman"/>
         </w:rPr>
-        <w:t xml:space="preserve">After making all decisions, participants were asked questions to assess their internal (Cronbach’s α = 0.93) and external (Cronbach’s α = 0.89) motivation to respond without prejudice, which were identical to the questions in Study 4A except for word changes made to focus on avoiding gender prejudice rather than racial prejudice. See Materials Section: Study 4B for full study materials. </w:t>
+        <w:t xml:space="preserve">After making all decisions, participants were asked questions to assess their internal (Cronbach’s </w:t>
+      </w:r>
+      <w:r>
+        <w:rPr>
+          <w:rFonts w:ascii="Times New Roman" w:eastAsia="Times New Roman" w:hAnsi="Times New Roman" w:cs="Times New Roman"/>
+        </w:rPr>
+        <w:lastRenderedPageBreak/>
+        <w:t xml:space="preserve">α = 0.93) and external (Cronbach’s α = 0.89) motivation to respond without prejudice, which were identical to the questions in Study 4A except for word changes made to focus on avoiding gender prejudice rather than racial prejudice. See Materials Section: Study 4B for full study materials. </w:t>
       </w:r>
     </w:p>
     <w:p>
@@ -4667,14 +4994,7 @@
         <w:rPr>
           <w:rFonts w:ascii="Times New Roman" w:eastAsia="Times New Roman" w:hAnsi="Times New Roman" w:cs="Times New Roman"/>
         </w:rPr>
-        <w:t xml:space="preserve">. To measure participants’ political orientation, we used the 7-point political </w:t>
-      </w:r>
-      <w:r>
-        <w:rPr>
-          <w:rFonts w:ascii="Times New Roman" w:eastAsia="Times New Roman" w:hAnsi="Times New Roman" w:cs="Times New Roman"/>
-        </w:rPr>
-        <w:lastRenderedPageBreak/>
-        <w:t>ideology scale from the American National Election Studies (ANES, 2022). Participants responded to the prompt “When it comes to politics, do you usually think of yourself as...?” on a scale ranging from 1 (Extremely liberal) to 7 (Extremely conservative), with 4 representing Moderate; middle of the road. This measure was centered at 4 (moderate) for analyses examining moderation effects.</w:t>
+        <w:t>. To measure participants’ political orientation, we used the 7-point political ideology scale from the American National Election Studies (ANES, 2022). Participants responded to the prompt “When it comes to politics, do you usually think of yourself as...?” on a scale ranging from 1 (Extremely liberal) to 7 (Extremely conservative), with 4 representing Moderate; middle of the road. This measure was centered at 4 (moderate) for analyses examining moderation effects.</w:t>
       </w:r>
     </w:p>
     <w:p>
@@ -4698,7 +5018,19 @@
         <w:rPr>
           <w:rFonts w:ascii="Times New Roman" w:eastAsia="Times New Roman" w:hAnsi="Times New Roman" w:cs="Times New Roman"/>
         </w:rPr>
-        <w:t>. To assess participants’ political party identification, we adapted the party identification item from the American National Election Studies (ANES, 2022). Participants were asked “Generally speaking, do you usually think of yourself as a Republican, a Democrat, or an Independent?” and selected one of three options: Democrat, Republican, or Independent. For regression analyses, party affiliation was dummy-coded with Republican as the reference category.</w:t>
+        <w:t xml:space="preserve">. To assess participants’ political party identification, we adapted the party identification item from the American National Election Studies (ANES, 2022). Participants were asked “Generally speaking, do you usually think of yourself as a Republican, a Democrat, or an Independent?” and selected one of three options: Democrat, Republican, or Independent. For regression analyses, party affiliation was </w:t>
+      </w:r>
+      <w:r>
+        <w:rPr>
+          <w:rFonts w:ascii="Times New Roman" w:eastAsia="Times New Roman" w:hAnsi="Times New Roman" w:cs="Times New Roman"/>
+        </w:rPr>
+        <w:t>dummy coded</w:t>
+      </w:r>
+      <w:r>
+        <w:rPr>
+          <w:rFonts w:ascii="Times New Roman" w:eastAsia="Times New Roman" w:hAnsi="Times New Roman" w:cs="Times New Roman"/>
+        </w:rPr>
+        <w:t xml:space="preserve"> with Republican as the reference category.</w:t>
       </w:r>
     </w:p>
     <w:p>
@@ -4905,6 +5237,7 @@
         <w:rPr>
           <w:rFonts w:ascii="Times New Roman" w:eastAsia="Times New Roman" w:hAnsi="Times New Roman" w:cs="Times New Roman"/>
         </w:rPr>
+        <w:lastRenderedPageBreak/>
         <w:t>In addition, as theorized, we found that the effect of providing descriptive feedback about the gender of initial selectees is significantly larger than the effect of providing descriptive feedback about whether participants’ initial selectees wrote works spanning multiple genres (</w:t>
       </w:r>
       <w:r>
@@ -4961,14 +5294,7 @@
         <w:rPr>
           <w:rFonts w:ascii="Times New Roman" w:eastAsia="Times New Roman" w:hAnsi="Times New Roman" w:cs="Times New Roman"/>
         </w:rPr>
-        <w:t xml:space="preserve"> &lt; .001), or </w:t>
-      </w:r>
-      <w:r>
-        <w:rPr>
-          <w:rFonts w:ascii="Times New Roman" w:eastAsia="Times New Roman" w:hAnsi="Times New Roman" w:cs="Times New Roman"/>
-        </w:rPr>
-        <w:lastRenderedPageBreak/>
-        <w:t>wrote any works that remained in continuous print for over 50 years (</w:t>
+        <w:t xml:space="preserve"> &lt; .001), or wrote any works that remained in continuous print for over 50 years (</w:t>
       </w:r>
       <w:r>
         <w:rPr>
@@ -5034,7 +5360,19 @@
         <w:rPr>
           <w:rFonts w:ascii="Times New Roman" w:eastAsia="Times New Roman" w:hAnsi="Times New Roman" w:cs="Times New Roman"/>
         </w:rPr>
-        <w:t xml:space="preserve"> condition on the likelihood of selecting a woman as the final author. Using Imai et al.’s (2010) average causal mediation effect approach, we found that 53.9% of the  effect under study occurs through mediation by a participant’s internal motivation to respond without prejudice. Next, we found that the 95% bias-corrected CI for the indirect effect of external motivation to respond without prejudice also excluded zero (indirect effect = 0.030, 95% CI = [0.014, 0.048]), suggesting that participants’ external motivation to respond without prejudice also accounted for the effect of assignment to the </w:t>
+        <w:t xml:space="preserve"> condition on the likelihood of selecting a woman as the final author. Using Imai et al.’s (2010) average causal mediation effect approach, we found that 53.9% of </w:t>
+      </w:r>
+      <w:r>
+        <w:rPr>
+          <w:rFonts w:ascii="Times New Roman" w:eastAsia="Times New Roman" w:hAnsi="Times New Roman" w:cs="Times New Roman"/>
+        </w:rPr>
+        <w:t>the effect</w:t>
+      </w:r>
+      <w:r>
+        <w:rPr>
+          <w:rFonts w:ascii="Times New Roman" w:eastAsia="Times New Roman" w:hAnsi="Times New Roman" w:cs="Times New Roman"/>
+        </w:rPr>
+        <w:t xml:space="preserve"> under study occurs through mediation by a participant’s internal motivation to respond without prejudice. Next, we found that the 95% bias-corrected CI for the indirect effect of external motivation to respond without prejudice also excluded zero (indirect effect = 0.030, 95% CI = [0.014, 0.048]), suggesting that participants’ external motivation to respond without prejudice also accounted for the effect of assignment to the </w:t>
       </w:r>
       <w:r>
         <w:rPr>
@@ -5092,7 +5430,14 @@
         <w:rPr>
           <w:rFonts w:ascii="Times New Roman" w:eastAsia="Times New Roman" w:hAnsi="Times New Roman" w:cs="Times New Roman"/>
         </w:rPr>
-        <w:t xml:space="preserve"> &lt; .001). The results confirmed that internal motivation to respond without prejudice (indirect effect = 0.091, 95% CI = [0.052, 0.131]) significantly mediated the effect. When both mediators were included simultaneously, external motivation to respond without prejudice showed a significant negative indirect effect (indirect effect = -0.028, 95% CI = [-0.046, -0.012]).</w:t>
+        <w:t xml:space="preserve"> &lt; .001). The results confirmed that internal motivation to respond without prejudice (indirect effect = 0.091, 95% CI = [0.052, 0.131]) significantly mediated the effect. When both mediators were included simultaneously, external motivation to respond without prejudice showed a significant negative indirect effect (indirect effect = -0.028, 95% CI = [-</w:t>
+      </w:r>
+      <w:r>
+        <w:rPr>
+          <w:rFonts w:ascii="Times New Roman" w:eastAsia="Times New Roman" w:hAnsi="Times New Roman" w:cs="Times New Roman"/>
+        </w:rPr>
+        <w:lastRenderedPageBreak/>
+        <w:t>0.046, -0.012]).</w:t>
       </w:r>
     </w:p>
     <w:p>
@@ -5136,14 +5481,7 @@
         <w:rPr>
           <w:rFonts w:ascii="Times New Roman" w:eastAsia="Times New Roman" w:hAnsi="Times New Roman" w:cs="Times New Roman"/>
         </w:rPr>
-        <w:t xml:space="preserve"> = -0.013, 95% CI = [-0.044, </w:t>
-      </w:r>
-      <w:r>
-        <w:rPr>
-          <w:rFonts w:ascii="Times New Roman" w:eastAsia="Times New Roman" w:hAnsi="Times New Roman" w:cs="Times New Roman"/>
-        </w:rPr>
-        <w:lastRenderedPageBreak/>
-        <w:t xml:space="preserve">0.018], </w:t>
+        <w:t xml:space="preserve"> = -0.013, 95% CI = [-0.044, 0.018], </w:t>
       </w:r>
       <w:r>
         <w:rPr>
@@ -5336,8 +5674,8 @@
           <w:szCs w:val="22"/>
         </w:rPr>
       </w:pPr>
-      <w:bookmarkStart w:id="28" w:name="_pf7zdhe9tp51" w:colFirst="0" w:colLast="0"/>
-      <w:bookmarkEnd w:id="28"/>
+      <w:bookmarkStart w:id="26" w:name="_pf7zdhe9tp51" w:colFirst="0" w:colLast="0"/>
+      <w:bookmarkEnd w:id="26"/>
       <w:r>
         <w:rPr>
           <w:sz w:val="22"/>
@@ -5359,7 +5697,28 @@
         <w:rPr>
           <w:rFonts w:ascii="Times New Roman" w:eastAsia="Times New Roman" w:hAnsi="Times New Roman" w:cs="Times New Roman"/>
         </w:rPr>
-        <w:t xml:space="preserve">In all of our studies so far, we examined situations where women or racial minorities were underrepresented in candidate pools, which means that mechanically they would also likely be underrepresented in many respondents’ initial set of selectees. As a result, the descriptive feedback we delivered typically highlighted that historically underrepresented groups had been picked at low rates (in fact, across all studies thus far, 83% of participants who received feedback about the gender or race of past selectees learned that the candidates they had initially selected were less than half women or racial minorities, respectively). In Study 5, we tested how descriptive feedback affects decision makers when it suggests that historically underrepresented groups have recently been picked at </w:t>
+        <w:t xml:space="preserve">In </w:t>
+      </w:r>
+      <w:proofErr w:type="gramStart"/>
+      <w:r>
+        <w:rPr>
+          <w:rFonts w:ascii="Times New Roman" w:eastAsia="Times New Roman" w:hAnsi="Times New Roman" w:cs="Times New Roman"/>
+        </w:rPr>
+        <w:t>all of</w:t>
+      </w:r>
+      <w:proofErr w:type="gramEnd"/>
+      <w:r>
+        <w:rPr>
+          <w:rFonts w:ascii="Times New Roman" w:eastAsia="Times New Roman" w:hAnsi="Times New Roman" w:cs="Times New Roman"/>
+        </w:rPr>
+        <w:t xml:space="preserve"> our studies so far, we examined situations where women or racial minorities were underrepresented in candidate pools, which means that mechanically they would also likely be underrepresented in many respondents’ initial set of selectees. As a result, the descriptive feedback we delivered typically highlighted that historically underrepresented groups had been picked at low rates (in fact, across all studies thus far, 83% of participants who received feedback about the gender or race of </w:t>
+      </w:r>
+      <w:r>
+        <w:rPr>
+          <w:rFonts w:ascii="Times New Roman" w:eastAsia="Times New Roman" w:hAnsi="Times New Roman" w:cs="Times New Roman"/>
+        </w:rPr>
+        <w:lastRenderedPageBreak/>
+        <w:t xml:space="preserve">past selectees learned that the candidates they had initially selected were less than half women or racial minorities, respectively). In Study 5, we tested how descriptive feedback affects decision makers when it suggests that historically underrepresented groups have recently been picked at </w:t>
       </w:r>
       <w:r>
         <w:rPr>
@@ -5373,14 +5732,7 @@
         <w:rPr>
           <w:rFonts w:ascii="Times New Roman" w:eastAsia="Times New Roman" w:hAnsi="Times New Roman" w:cs="Times New Roman"/>
         </w:rPr>
-        <w:t xml:space="preserve"> rates. This would not, in theory, activate a motivation to respond without prejudice, since the initial feedback would </w:t>
-      </w:r>
-      <w:r>
-        <w:rPr>
-          <w:rFonts w:ascii="Times New Roman" w:eastAsia="Times New Roman" w:hAnsi="Times New Roman" w:cs="Times New Roman"/>
-        </w:rPr>
-        <w:lastRenderedPageBreak/>
-        <w:t>indicate that historically underrepresented groups were being well-represented. Under such circumstances, we would no longer predict a positive effect of descriptive feedback about past decisions on the subsequent selection of candidates from a historically underrepresented population.</w:t>
+        <w:t xml:space="preserve"> rates. This would not, in theory, activate a motivation to respond without prejudice, since the initial feedback would indicate that historically underrepresented groups were being well-represented. Under such circumstances, we would no longer predict a positive effect of descriptive feedback about past decisions on the subsequent selection of candidates from a historically underrepresented population.</w:t>
       </w:r>
     </w:p>
     <w:p>
@@ -5469,7 +5821,14 @@
         <w:rPr>
           <w:rFonts w:ascii="Times New Roman" w:eastAsia="Times New Roman" w:hAnsi="Times New Roman" w:cs="Times New Roman"/>
         </w:rPr>
-        <w:t xml:space="preserve"> In Model 1, which analyzes data from Study 2 (gender), we found the predicted significant negative interaction between the proportion of women selected initially and the impact of assignment to the </w:t>
+        <w:t xml:space="preserve"> In Model 1, which analyzes data from Study 2 (gender), we found the predicted significant negative interaction between the proportion of women selected initially and the </w:t>
+      </w:r>
+      <w:r>
+        <w:rPr>
+          <w:rFonts w:ascii="Times New Roman" w:eastAsia="Times New Roman" w:hAnsi="Times New Roman" w:cs="Times New Roman"/>
+        </w:rPr>
+        <w:lastRenderedPageBreak/>
+        <w:t xml:space="preserve">impact of assignment to the </w:t>
       </w:r>
       <w:r>
         <w:rPr>
@@ -5525,14 +5884,7 @@
         <w:rPr>
           <w:rFonts w:ascii="Times New Roman" w:eastAsia="Times New Roman" w:hAnsi="Times New Roman" w:cs="Times New Roman"/>
         </w:rPr>
-        <w:t xml:space="preserve"> </w:t>
-      </w:r>
-      <w:r>
-        <w:rPr>
-          <w:rFonts w:ascii="Times New Roman" w:eastAsia="Times New Roman" w:hAnsi="Times New Roman" w:cs="Times New Roman"/>
-        </w:rPr>
-        <w:lastRenderedPageBreak/>
-        <w:t>condition on subsequent selections of racial minorities (</w:t>
+        <w:t xml:space="preserve"> condition on subsequent selections of racial minorities (</w:t>
       </w:r>
       <w:r>
         <w:rPr>
@@ -5769,7 +6121,19 @@
         <w:rPr>
           <w:rFonts w:ascii="Times New Roman" w:eastAsia="Times New Roman" w:hAnsi="Times New Roman" w:cs="Times New Roman"/>
         </w:rPr>
-        <w:t xml:space="preserve"> condition and the proportion of women or racial minorities initially selected. Using a random-effects model, which weights each study’s contribution by its standard error, we found a significant negative pooled interaction effect (</w:t>
+        <w:t xml:space="preserve"> condition and the proportion of women or racial minorities initially selected. Using a random-effects model, which </w:t>
+      </w:r>
+      <w:r>
+        <w:rPr>
+          <w:rFonts w:ascii="Times New Roman" w:eastAsia="Times New Roman" w:hAnsi="Times New Roman" w:cs="Times New Roman"/>
+        </w:rPr>
+        <w:t>weighs</w:t>
+      </w:r>
+      <w:r>
+        <w:rPr>
+          <w:rFonts w:ascii="Times New Roman" w:eastAsia="Times New Roman" w:hAnsi="Times New Roman" w:cs="Times New Roman"/>
+        </w:rPr>
+        <w:t xml:space="preserve"> each study’s contribution by its standard error, we found a significant negative pooled interaction effect (</w:t>
       </w:r>
       <w:r>
         <w:rPr>
@@ -5827,7 +6191,14 @@
         <w:rPr>
           <w:rFonts w:ascii="Times New Roman" w:eastAsia="Times New Roman" w:hAnsi="Times New Roman" w:cs="Times New Roman"/>
         </w:rPr>
-        <w:t xml:space="preserve">However, because the proportion of women or racial minorities in participants’ initial selections was not randomly assigned (although selections were made before random assignment) and was somewhat restricted in range, we conducted an experiment where we used our standard experimental setup from Studies 2-4 but exogenously varied whether women made up the minority versus the majority of candidates available for selection. We then examined how exogenously manipulating whether people likely select very few versus very many female candidates related to the effect of descriptive feedback about the gender of their </w:t>
+        <w:t xml:space="preserve">However, because the proportion of women or racial minorities in participants’ initial selections was not randomly assigned (although selections were made before random assignment) and was somewhat restricted in range, we conducted an experiment where we used our standard experimental setup from Studies 2-4 but exogenously varied whether women made up the minority versus the majority </w:t>
+      </w:r>
+      <w:r>
+        <w:rPr>
+          <w:rFonts w:ascii="Times New Roman" w:eastAsia="Times New Roman" w:hAnsi="Times New Roman" w:cs="Times New Roman"/>
+        </w:rPr>
+        <w:lastRenderedPageBreak/>
+        <w:t xml:space="preserve">of candidates available for selection. We then examined how exogenously manipulating whether people likely select very few versus very many female candidates related to the effect of descriptive feedback about the gender of their </w:t>
       </w:r>
       <w:r>
         <w:rPr>
@@ -5885,7 +6256,6 @@
         <w:rPr>
           <w:rFonts w:ascii="Times New Roman" w:eastAsia="Times New Roman" w:hAnsi="Times New Roman" w:cs="Times New Roman"/>
         </w:rPr>
-        <w:lastRenderedPageBreak/>
         <w:t xml:space="preserve">Insert Table 5 and Figure 4 about here </w:t>
       </w:r>
     </w:p>
@@ -5953,7 +6323,7 @@
         </w:rPr>
         <w:t>As pre-registered (</w:t>
       </w:r>
-      <w:hyperlink r:id="rId16">
+      <w:hyperlink r:id="rId14">
         <w:r>
           <w:rPr>
             <w:rFonts w:ascii="Times New Roman" w:eastAsia="Times New Roman" w:hAnsi="Times New Roman" w:cs="Times New Roman"/>
@@ -6004,7 +6374,19 @@
         <w:rPr>
           <w:rFonts w:ascii="Times New Roman" w:eastAsia="Times New Roman" w:hAnsi="Times New Roman" w:cs="Times New Roman"/>
         </w:rPr>
-        <w:t>Participants were asked to imagine that they were planning a major international business conference and had been tasked with selecting a panel of business leaders to provide insights on the global business landscape during the event. We then presented them with a list of 25 real business leaders in randomized order. We included each leader’s name (e.g., Jeff Bezos, Mary Barra), title (e.g., Founder, CEO), and company affiliation (e.g., Amazon, General Motors). Participants were instructed to select a portfolio of six leaders for their panel. After creating their six-person panel, they were presented with summary statistics describing the composition of their selected portfolio of panelists.</w:t>
+        <w:t xml:space="preserve">Participants were asked to imagine that they were planning a major international business conference and had been tasked with selecting a panel of business leaders to provide insights </w:t>
+      </w:r>
+      <w:r>
+        <w:rPr>
+          <w:rFonts w:ascii="Times New Roman" w:eastAsia="Times New Roman" w:hAnsi="Times New Roman" w:cs="Times New Roman"/>
+        </w:rPr>
+        <w:t>into</w:t>
+      </w:r>
+      <w:r>
+        <w:rPr>
+          <w:rFonts w:ascii="Times New Roman" w:eastAsia="Times New Roman" w:hAnsi="Times New Roman" w:cs="Times New Roman"/>
+        </w:rPr>
+        <w:t xml:space="preserve"> the global business landscape during the event. We then presented them with a list of 25 real business leaders in randomized order. We included each leader’s name (e.g., Jeff Bezos, Mary Barra), title (e.g., Founder, CEO), and company affiliation (e.g., Amazon, General Motors). Participants were instructed to select a portfolio of six leaders for their panel. After creating their six-person panel, they were presented with summary statistics describing the composition of their selected portfolio of panelists.</w:t>
       </w:r>
     </w:p>
     <w:p>
@@ -6090,7 +6472,14 @@
         <w:rPr>
           <w:rFonts w:ascii="Times New Roman" w:eastAsia="Times New Roman" w:hAnsi="Times New Roman" w:cs="Times New Roman"/>
         </w:rPr>
-        <w:t xml:space="preserve">conditions were randomly assigned to receive separate summary statistics about both the percentage of panelists they initially selected who were (1) in the tech industry and (2) company founders. In the </w:t>
+        <w:t xml:space="preserve">conditions were randomly assigned to receive separate summary statistics about both the percentage of panelists they initially selected who were (1) in the tech industry and (2) company founders. </w:t>
+      </w:r>
+      <w:r>
+        <w:rPr>
+          <w:rFonts w:ascii="Times New Roman" w:eastAsia="Times New Roman" w:hAnsi="Times New Roman" w:cs="Times New Roman"/>
+        </w:rPr>
+        <w:lastRenderedPageBreak/>
+        <w:t xml:space="preserve">In the </w:t>
       </w:r>
       <w:r>
         <w:rPr>
@@ -6104,14 +6493,7 @@
         <w:rPr>
           <w:rFonts w:ascii="Times New Roman" w:eastAsia="Times New Roman" w:hAnsi="Times New Roman" w:cs="Times New Roman"/>
         </w:rPr>
-        <w:t xml:space="preserve">conditions, participants received feedback about the percentage of panelists they had selected who were women as well as the two summary statistics about past selectees that were </w:t>
-      </w:r>
-      <w:r>
-        <w:rPr>
-          <w:rFonts w:ascii="Times New Roman" w:eastAsia="Times New Roman" w:hAnsi="Times New Roman" w:cs="Times New Roman"/>
-        </w:rPr>
-        <w:lastRenderedPageBreak/>
-        <w:t xml:space="preserve">provided to participants in the </w:t>
+        <w:t xml:space="preserve">conditions, participants received feedback about the percentage of panelists they had selected who were women as well as the two summary statistics about past selectees that were provided to participants in the </w:t>
       </w:r>
       <w:r>
         <w:rPr>
@@ -6215,6 +6597,7 @@
         <w:rPr>
           <w:rFonts w:ascii="Times New Roman" w:eastAsia="Times New Roman" w:hAnsi="Times New Roman" w:cs="Times New Roman"/>
         </w:rPr>
+        <w:lastRenderedPageBreak/>
         <w:t xml:space="preserve">Participants in all conditions first selected six panelists. In the </w:t>
       </w:r>
       <w:r>
@@ -6229,14 +6612,7 @@
         <w:rPr>
           <w:rFonts w:ascii="Times New Roman" w:eastAsia="Times New Roman" w:hAnsi="Times New Roman" w:cs="Times New Roman"/>
         </w:rPr>
-        <w:t xml:space="preserve">condition, 60.7% of these initial selectees were women (balance was successfully achieved on this attribute: 59.8% </w:t>
-      </w:r>
-      <w:r>
-        <w:rPr>
-          <w:rFonts w:ascii="Times New Roman" w:eastAsia="Times New Roman" w:hAnsi="Times New Roman" w:cs="Times New Roman"/>
-        </w:rPr>
-        <w:lastRenderedPageBreak/>
-        <w:t xml:space="preserve">of initial selectees were women in the </w:t>
+        <w:t xml:space="preserve">condition, 60.7% of these initial selectees were women (balance was successfully achieved on this attribute: 59.8% of initial selectees were women in the </w:t>
       </w:r>
       <w:r>
         <w:rPr>
@@ -6604,7 +6980,14 @@
         <w:rPr>
           <w:rFonts w:ascii="Times New Roman" w:eastAsia="Times New Roman" w:hAnsi="Times New Roman" w:cs="Times New Roman"/>
         </w:rPr>
-        <w:t xml:space="preserve">Our primary pre-registered analysis pooled data across all conditions in a single OLS regression with robust standard errors to predict whether the seventh and final panelist a participant selected was a woman. Our primary predictors were: (1) an indicator for assignment to the gender feedback condition, (2) an indicator for assignment to the </w:t>
+        <w:t xml:space="preserve">Our primary pre-registered analysis pooled data across all conditions in a single OLS regression with robust standard errors to predict whether the seventh and final panelist a participant selected was a </w:t>
+      </w:r>
+      <w:r>
+        <w:rPr>
+          <w:rFonts w:ascii="Times New Roman" w:eastAsia="Times New Roman" w:hAnsi="Times New Roman" w:cs="Times New Roman"/>
+        </w:rPr>
+        <w:lastRenderedPageBreak/>
+        <w:t xml:space="preserve">woman. Our primary predictors were: (1) an indicator for assignment to the gender feedback condition, (2) an indicator for assignment to the </w:t>
       </w:r>
       <w:r>
         <w:rPr>
@@ -6632,14 +7015,7 @@
         <w:rPr>
           <w:rFonts w:ascii="Times New Roman" w:eastAsia="Times New Roman" w:hAnsi="Times New Roman" w:cs="Times New Roman"/>
         </w:rPr>
-        <w:t xml:space="preserve"> as </w:t>
-      </w:r>
-      <w:r>
-        <w:rPr>
-          <w:rFonts w:ascii="Times New Roman" w:eastAsia="Times New Roman" w:hAnsi="Times New Roman" w:cs="Times New Roman"/>
-        </w:rPr>
-        <w:lastRenderedPageBreak/>
-        <w:t>the reference category), and (3) an interaction between the prior two indicators.</w:t>
+        <w:t xml:space="preserve"> as the reference category), and (3) an interaction between the prior two indicators.</w:t>
       </w:r>
       <w:r>
         <w:rPr>
@@ -6820,7 +7196,35 @@
         <w:rPr>
           <w:rFonts w:ascii="Times New Roman" w:eastAsia="Times New Roman" w:hAnsi="Times New Roman" w:cs="Times New Roman"/>
         </w:rPr>
-        <w:t xml:space="preserve"> the selection of women by 10.6 percentage points when women were overrepresented (vs. increasing selection of women by 24.1 percentage points when women were underrepresented). These results were robust to controlling for participant gender, race, and age (see Table 5, Model 6).</w:t>
+        <w:t xml:space="preserve"> the selection of women by 10.6 percentage points when women were overrepresented (vs. increasing selection of women by 24.1 percentage points when women were underrepresented). These results were robust to </w:t>
+      </w:r>
+      <w:proofErr w:type="gramStart"/>
+      <w:r>
+        <w:rPr>
+          <w:rFonts w:ascii="Times New Roman" w:eastAsia="Times New Roman" w:hAnsi="Times New Roman" w:cs="Times New Roman"/>
+        </w:rPr>
+        <w:t>controlling</w:t>
+      </w:r>
+      <w:proofErr w:type="gramEnd"/>
+      <w:r>
+        <w:rPr>
+          <w:rFonts w:ascii="Times New Roman" w:eastAsia="Times New Roman" w:hAnsi="Times New Roman" w:cs="Times New Roman"/>
+        </w:rPr>
+        <w:t xml:space="preserve"> </w:t>
+      </w:r>
+      <w:proofErr w:type="gramStart"/>
+      <w:r>
+        <w:rPr>
+          <w:rFonts w:ascii="Times New Roman" w:eastAsia="Times New Roman" w:hAnsi="Times New Roman" w:cs="Times New Roman"/>
+        </w:rPr>
+        <w:t>for participant gender, race, and age</w:t>
+      </w:r>
+      <w:proofErr w:type="gramEnd"/>
+      <w:r>
+        <w:rPr>
+          <w:rFonts w:ascii="Times New Roman" w:eastAsia="Times New Roman" w:hAnsi="Times New Roman" w:cs="Times New Roman"/>
+        </w:rPr>
+        <w:t xml:space="preserve"> (see Table 5, Model 6).</w:t>
       </w:r>
     </w:p>
     <w:p>
@@ -6919,7 +7323,14 @@
         <w:rPr>
           <w:rFonts w:ascii="Times New Roman" w:eastAsia="Times New Roman" w:hAnsi="Times New Roman" w:cs="Times New Roman"/>
         </w:rPr>
-        <w:t xml:space="preserve"> Specifically, the magnitude of the effect was 56% smaller in magnitude in the </w:t>
+        <w:t xml:space="preserve"> Specifically, the magnitude of the effect </w:t>
+      </w:r>
+      <w:r>
+        <w:rPr>
+          <w:rFonts w:ascii="Times New Roman" w:eastAsia="Times New Roman" w:hAnsi="Times New Roman" w:cs="Times New Roman"/>
+        </w:rPr>
+        <w:lastRenderedPageBreak/>
+        <w:t xml:space="preserve">was 56% smaller in magnitude in the </w:t>
       </w:r>
       <w:r>
         <w:rPr>
@@ -6941,16 +7352,7 @@
           <w:i/>
           <w:iCs/>
         </w:rPr>
-        <w:t xml:space="preserve">women </w:t>
-      </w:r>
-      <w:r>
-        <w:rPr>
-          <w:rFonts w:ascii="Times New Roman" w:eastAsia="Times New Roman" w:hAnsi="Times New Roman" w:cs="Times New Roman"/>
-          <w:i/>
-          <w:iCs/>
-        </w:rPr>
-        <w:lastRenderedPageBreak/>
-        <w:t>underrepresented</w:t>
+        <w:t>women underrepresented</w:t>
       </w:r>
       <w:r>
         <w:rPr>
@@ -7107,7 +7509,19 @@
         <w:rPr>
           <w:rFonts w:ascii="Times New Roman" w:eastAsia="Times New Roman" w:hAnsi="Times New Roman" w:cs="Times New Roman"/>
         </w:rPr>
-        <w:t xml:space="preserve"> condition, however, there was only one significant mediator of the effect of descriptive feedback on the increased selection of men: fairness concerns (indirect effect = -0.012, 95% CI [-0.026, -0.002], </w:t>
+        <w:t xml:space="preserve"> condition, however, there was only one significant mediator of the effect of descriptive feedback on the increased selection of men: fairness concerns (indirect effect = </w:t>
+      </w:r>
+      <w:r>
+        <w:rPr>
+          <w:rFonts w:ascii="Times New Roman" w:eastAsia="Times New Roman" w:hAnsi="Times New Roman" w:cs="Times New Roman"/>
+        </w:rPr>
+        <w:t>-</w:t>
+      </w:r>
+      <w:r>
+        <w:rPr>
+          <w:rFonts w:ascii="Times New Roman" w:eastAsia="Times New Roman" w:hAnsi="Times New Roman" w:cs="Times New Roman"/>
+        </w:rPr>
+        <w:t xml:space="preserve">0.012, 95% CI [-0.026, -0.002], </w:t>
       </w:r>
       <w:r>
         <w:rPr>
@@ -7196,7 +7610,14 @@
           <w:rFonts w:ascii="Times New Roman" w:eastAsia="Times New Roman" w:hAnsi="Times New Roman" w:cs="Times New Roman"/>
         </w:rPr>
         <w:tab/>
-        <w:t xml:space="preserve">This study shows that when women are underrepresented in a candidate pool, descriptive feedback about the prior fraction of women selected increases the likelihood of subsequently selecting a woman, replicating our findings from Studies 3A, 3B, 4A, and 4B. However, when women are overrepresented, feedback produces a statistically smaller effect in the opposite direction, decreasing the selection of women. </w:t>
+        <w:t xml:space="preserve">This study shows that when women are underrepresented in a candidate pool, descriptive feedback about the prior fraction of women selected increases the likelihood of subsequently selecting a woman, replicating our findings from Studies 3A, 3B, 4A, and 4B. However, when women are overrepresented, feedback produces a statistically smaller effect in the opposite direction, decreasing the </w:t>
+      </w:r>
+      <w:r>
+        <w:rPr>
+          <w:rFonts w:ascii="Times New Roman" w:eastAsia="Times New Roman" w:hAnsi="Times New Roman" w:cs="Times New Roman"/>
+        </w:rPr>
+        <w:lastRenderedPageBreak/>
+        <w:t xml:space="preserve">selection of women. </w:t>
       </w:r>
     </w:p>
     <w:p>
@@ -7212,14 +7633,7 @@
           <w:rFonts w:ascii="Times New Roman" w:eastAsia="Times New Roman" w:hAnsi="Times New Roman" w:cs="Times New Roman"/>
         </w:rPr>
         <w:tab/>
-        <w:t xml:space="preserve">Exploratory mediation analyses suggest that different mechanisms are key drivers of the effects of descriptive feedback on selection decisions after people learn that women were initially </w:t>
-      </w:r>
-      <w:r>
-        <w:rPr>
-          <w:rFonts w:ascii="Times New Roman" w:eastAsia="Times New Roman" w:hAnsi="Times New Roman" w:cs="Times New Roman"/>
-        </w:rPr>
-        <w:lastRenderedPageBreak/>
-        <w:t>underrepresented versus overrepresented in their original pool of picks. Consistent with Study 4 and our theorizing, when women are underrepresented, feedback triggers a motivation to respond without prejudice, which prompts decision makers to select more women. However, when women are overrepresented, general concerns about treating men and women fairly emerge as the main mediator (notably, these concerns arise alongside a motivation to respond without prejudice when women are overrepresented). These fairness concerns drive people to select candidates who reduce gender imbalance.</w:t>
+        <w:t>Exploratory mediation analyses suggest that different mechanisms are key drivers of the effects of descriptive feedback on selection decisions after people learn that women were initially underrepresented versus overrepresented in their original pool of picks. Consistent with Study 4 and our theorizing, when women are underrepresented, feedback triggers a motivation to respond without prejudice, which prompts decision makers to select more women. However, when women are overrepresented, general concerns about treating men and women fairly emerge as the main mediator (notably, these concerns arise alongside a motivation to respond without prejudice when women are overrepresented). These fairness concerns drive people to select candidates who reduce gender imbalance.</w:t>
       </w:r>
     </w:p>
     <w:p>
@@ -7237,8 +7651,8 @@
           <w:szCs w:val="22"/>
         </w:rPr>
       </w:pPr>
-      <w:bookmarkStart w:id="29" w:name="_nulb1vrqgwds" w:colFirst="0" w:colLast="0"/>
-      <w:bookmarkEnd w:id="29"/>
+      <w:bookmarkStart w:id="27" w:name="_nulb1vrqgwds" w:colFirst="0" w:colLast="0"/>
+      <w:bookmarkEnd w:id="27"/>
       <w:r>
         <w:rPr>
           <w:sz w:val="22"/>
@@ -7319,14 +7733,14 @@
         <w:rPr>
           <w:rFonts w:ascii="Times New Roman" w:eastAsia="Times New Roman" w:hAnsi="Times New Roman" w:cs="Times New Roman"/>
         </w:rPr>
-        <w:t xml:space="preserve"> we conducted simulations to estimate how a quota requiring at least one woman (or alternatively, one racial minority) in the final selection set would have affected control participants’ decisions. In our experimental paradigm, participants were asked to select six (or seven) individuals from a larger pool of candidates. To simulate what would have happened if we had applied a quota requiring that one woman (or alternatively, one racial minority) be included in each selection set, we identified participants in the control conditions in </w:t>
+        <w:t xml:space="preserve"> we conducted simulations to estimate how a quota requiring at least one woman (or alternatively, one racial minority) in the final selection set would have affected control participants’ decisions. In our experimental paradigm, </w:t>
       </w:r>
       <w:r>
         <w:rPr>
           <w:rFonts w:ascii="Times New Roman" w:eastAsia="Times New Roman" w:hAnsi="Times New Roman" w:cs="Times New Roman"/>
         </w:rPr>
         <w:lastRenderedPageBreak/>
-        <w:t xml:space="preserve">each study whose initial choices did not include any women (or in studies focused on racial minorities, we identified participants who didn’t select any racial minorities). Among these participants, we next identified those who did not choose a woman as their final selectee (or in studies focused on racial minorities, we identified participants who didn’t select a racial minority as their final selectee). For these participants, we simulated the imposition of a quota by modifying their final selection to be a candidate from the underrepresented group (i.e., we replaced their final selection with a woman or racial minority, thus changing the value of the dependent variable to equal one in cases where a quota rule would have changed their decision). For all other control participants, we retained their original selection decisions. See Appendix Table S13 for an illustration of the process used to create this simulated “quota condition” data. </w:t>
+        <w:t xml:space="preserve">participants were asked to select six (or seven) individuals from a larger pool of candidates. To simulate what would have happened if we had applied a quota requiring that one woman (or alternatively, one racial minority) be included in each selection set, we identified participants in the control conditions in each study whose initial choices did not include any women (or in studies focused on racial minorities, we identified participants who didn’t select any racial minorities). Among these participants, we next identified those who did not choose a woman as their final selectee (or in studies focused on racial minorities, we identified participants who didn’t select a racial minority as their final selectee). For these participants, we simulated the imposition of a quota by modifying their final selection to be a candidate from the underrepresented group (i.e., we replaced their final selection with a woman or racial minority, thus changing the value of the dependent variable to equal one in cases where a quota rule would have changed their decision). For all other control participants, we retained their original selection decisions. See Appendix Table S13 for an illustration of the process used to create this simulated “quota condition” data. </w:t>
       </w:r>
     </w:p>
     <w:p>
@@ -7469,7 +7883,14 @@
         <w:rPr>
           <w:rFonts w:ascii="Times New Roman" w:eastAsia="Times New Roman" w:hAnsi="Times New Roman" w:cs="Times New Roman"/>
         </w:rPr>
-        <w:t xml:space="preserve"> &lt; .001), meaning feedback produced 54.7% of the benefit of a quota. For women in Study 3B (see Appendix Table S12, Row 3), compared to control condition, the descriptive feedback intervention significantly increased the likelihood of selecting films featuring female protagonists by 20.6 percentage points (</w:t>
+        <w:t xml:space="preserve"> &lt; .001), meaning feedback produced 54.7% of the benefit of a quota. For women in Study 3B (see </w:t>
+      </w:r>
+      <w:r>
+        <w:rPr>
+          <w:rFonts w:ascii="Times New Roman" w:eastAsia="Times New Roman" w:hAnsi="Times New Roman" w:cs="Times New Roman"/>
+        </w:rPr>
+        <w:lastRenderedPageBreak/>
+        <w:t>Appendix Table S12, Row 3), compared to control condition, the descriptive feedback intervention significantly increased the likelihood of selecting films featuring female protagonists by 20.6 percentage points (</w:t>
       </w:r>
       <w:r>
         <w:rPr>
@@ -7497,14 +7918,7 @@
         <w:rPr>
           <w:rFonts w:ascii="Times New Roman" w:eastAsia="Times New Roman" w:hAnsi="Times New Roman" w:cs="Times New Roman"/>
         </w:rPr>
-        <w:t xml:space="preserve"> &lt; .001), while the simulated quota also significantly </w:t>
-      </w:r>
-      <w:r>
-        <w:rPr>
-          <w:rFonts w:ascii="Times New Roman" w:eastAsia="Times New Roman" w:hAnsi="Times New Roman" w:cs="Times New Roman"/>
-        </w:rPr>
-        <w:lastRenderedPageBreak/>
-        <w:t>increased selections by 25.7% (</w:t>
+        <w:t xml:space="preserve"> &lt; .001), while the simulated quota also significantly increased selections by 25.7% (</w:t>
       </w:r>
       <w:r>
         <w:rPr>
@@ -7532,7 +7946,21 @@
         <w:rPr>
           <w:rFonts w:ascii="Times New Roman" w:eastAsia="Times New Roman" w:hAnsi="Times New Roman" w:cs="Times New Roman"/>
         </w:rPr>
-        <w:t xml:space="preserve"> &lt; .001). This means offering descriptive feedback on the gender of past films’ protagonists yielded 80.0% of the benefit of a gender quota. In Study 4A (see Appendix Table S12, Row 4), which examined racial diversity in author selections, compared to the control condition the descriptive feedback intervention significantly increased the likelihood of selecting authors from racial minority backgrounds by 13.4 percentage points (</w:t>
+        <w:t xml:space="preserve"> &lt; .001). This means offering descriptive feedback on the gender of past films’ </w:t>
+      </w:r>
+      <w:proofErr w:type="gramStart"/>
+      <w:r>
+        <w:rPr>
+          <w:rFonts w:ascii="Times New Roman" w:eastAsia="Times New Roman" w:hAnsi="Times New Roman" w:cs="Times New Roman"/>
+        </w:rPr>
+        <w:t>protagonists</w:t>
+      </w:r>
+      <w:proofErr w:type="gramEnd"/>
+      <w:r>
+        <w:rPr>
+          <w:rFonts w:ascii="Times New Roman" w:eastAsia="Times New Roman" w:hAnsi="Times New Roman" w:cs="Times New Roman"/>
+        </w:rPr>
+        <w:t xml:space="preserve"> yielded 80.0% of the benefit of a gender quota. In Study 4A (see Appendix Table S12, Row 4), which examined racial diversity in author selections, compared to the control condition the descriptive feedback intervention significantly increased the likelihood of selecting authors from racial minority backgrounds by 13.4 percentage points (</w:t>
       </w:r>
       <w:r>
         <w:rPr>
@@ -7678,8 +8106,8 @@
           <w:szCs w:val="22"/>
         </w:rPr>
       </w:pPr>
-      <w:bookmarkStart w:id="30" w:name="_jicdkcqgqxjw" w:colFirst="0" w:colLast="0"/>
-      <w:bookmarkEnd w:id="30"/>
+      <w:bookmarkStart w:id="28" w:name="_jicdkcqgqxjw" w:colFirst="0" w:colLast="0"/>
+      <w:bookmarkEnd w:id="28"/>
       <w:r>
         <w:rPr>
           <w:sz w:val="22"/>
@@ -7706,14 +8134,26 @@
           <w:rFonts w:ascii="Times New Roman" w:eastAsia="Times New Roman" w:hAnsi="Times New Roman" w:cs="Times New Roman"/>
         </w:rPr>
         <w:tab/>
-        <w:t xml:space="preserve">Across seven pre-registered experiments, including a framed field study in a real organization, we investigate the impact of providing descriptive feedback about the gender and racial diversity of past candidate selections on evaluators’ future choices. In Studies 1-5 we demonstrate that when women (or racial minorities) are underrepresented in candidate pools, giving participants feedback about the fraction of women (or racial minorities) they initially select increases the likelihood that they will subsequently choose to add a woman (or racial minority) to their portfolio. By contrast, when participants receive </w:t>
+        <w:t xml:space="preserve">Across seven pre-registered experiments, including a framed field study in a real organization, we investigate the impact of providing descriptive feedback about the gender and racial diversity of past candidate selections on evaluators’ future choices. In Studies 1-5 we demonstrate that when women (or </w:t>
       </w:r>
       <w:r>
         <w:rPr>
           <w:rFonts w:ascii="Times New Roman" w:eastAsia="Times New Roman" w:hAnsi="Times New Roman" w:cs="Times New Roman"/>
         </w:rPr>
         <w:lastRenderedPageBreak/>
-        <w:t xml:space="preserve">descriptive feedback about the fraction of selectees with other domain-relevant attributes that are DEI-irrelevant (e.g., the fraction of Technologists on a panel instead of the fraction of women on that panel), it does not have the same impact on their subsequent selections (i.e., they are less likely to subsequently select a Technologist). In Studies 4A and 4B, we identify people’s motivation to respond without prejudice as a key mechanism underlying the effect of descriptive feedback on people’s subsequent DEI-related selection decisions. We find that both internal and external motivation to respond without prejudice mediate the relationship between receiving descriptive feedback about past selectees and making more gender-or-racially-diverse future candidate selections. </w:t>
+        <w:t xml:space="preserve">racial minorities) are underrepresented in candidate pools, giving participants feedback about the fraction of women (or racial minorities) they initially select increases the likelihood that they will subsequently choose to add a woman (or racial minority) to their portfolio. By contrast, when participants receive descriptive feedback about the fraction of selectees with other domain-relevant attributes that are DEI-irrelevant (e.g., the fraction of Technologists on a panel instead of the fraction of women on that panel), it does not have the same impact on their subsequent selections (i.e., they are less likely to subsequently select a Technologist). In Studies 4A and 4B, we identify people’s motivation to respond without prejudice as a key mechanism underlying the effect of descriptive feedback on people’s subsequent DEI-related selection decisions. We find that both internal and external motivation to respond without prejudice </w:t>
+      </w:r>
+      <w:r>
+        <w:rPr>
+          <w:rFonts w:ascii="Times New Roman" w:eastAsia="Times New Roman" w:hAnsi="Times New Roman" w:cs="Times New Roman"/>
+        </w:rPr>
+        <w:t>mediates</w:t>
+      </w:r>
+      <w:r>
+        <w:rPr>
+          <w:rFonts w:ascii="Times New Roman" w:eastAsia="Times New Roman" w:hAnsi="Times New Roman" w:cs="Times New Roman"/>
+        </w:rPr>
+        <w:t xml:space="preserve"> the relationship between receiving descriptive feedback about past selectees and making more gender-or-racially-diverse future candidate selections. </w:t>
       </w:r>
     </w:p>
     <w:p>
@@ -7762,7 +8202,26 @@
         <w:rPr>
           <w:rFonts w:ascii="Times New Roman" w:eastAsia="Times New Roman" w:hAnsi="Times New Roman" w:cs="Times New Roman"/>
         </w:rPr>
-        <w:t xml:space="preserve">Our work makes two primary theoretical contributions. First, we offer new insights about  how and when descriptive feedback motivates behavior change. According to Feedback Intervention Theory, feedback is most effective when paired with explicit goals, standards, or explicit injunctive norms that signal a clear gap between current performance and a desired state (Kluger &amp; DeNisi, 1996; Schultz et al., 2007). Purely descriptive feedback is often viewed as insufficient to drive change because it lacks a directive. We show that descriptive feedback can consistently motivate behavior change in the absence of explicit prescriptions. When such feedback targets DEI-relevant attributes of past selections and suggests women or minorities have been overlooked, the feedback itself elicits reputational or self-image concerns – specifically, internal and external motivation to respond without prejudice. In the context of diversity, an explicit goal, target, social norm or injunctive norm does not need to be coupled with feedback to induce a response because an </w:t>
+        <w:t xml:space="preserve">Our work makes two primary theoretical contributions. First, we offer new insights </w:t>
+      </w:r>
+      <w:r>
+        <w:rPr>
+          <w:rFonts w:ascii="Times New Roman" w:eastAsia="Times New Roman" w:hAnsi="Times New Roman" w:cs="Times New Roman"/>
+        </w:rPr>
+        <w:t>about how</w:t>
+      </w:r>
+      <w:r>
+        <w:rPr>
+          <w:rFonts w:ascii="Times New Roman" w:eastAsia="Times New Roman" w:hAnsi="Times New Roman" w:cs="Times New Roman"/>
+        </w:rPr>
+        <w:t xml:space="preserve"> and when descriptive feedback motivates behavior change. According to Feedback Intervention Theory, feedback is most effective when paired with explicit goals, standards, or explicit injunctive norms that signal a clear gap between current performance and a desired state (Kluger &amp; DeNisi, 1996; Schultz et al., 2007). Purely descriptive feedback is often viewed as insufficient to drive change because it lacks a directive. We show that descriptive feedback can consistently motivate behavior change in the absence of explicit prescriptions. When such feedback targets DEI-relevant attributes of past selections and suggests women or minorities have been overlooked, the feedback itself elicits reputational or self-image concerns – specifically, internal and external motivation to respond without prejudice. In the context of diversity, </w:t>
+      </w:r>
+      <w:r>
+        <w:rPr>
+          <w:rFonts w:ascii="Times New Roman" w:eastAsia="Times New Roman" w:hAnsi="Times New Roman" w:cs="Times New Roman"/>
+        </w:rPr>
+        <w:lastRenderedPageBreak/>
+        <w:t xml:space="preserve">an explicit goal, target, social norm or injunctive norm does not need to be coupled with feedback to induce a response because an </w:t>
       </w:r>
       <w:r>
         <w:rPr>
@@ -7776,14 +8235,7 @@
         <w:rPr>
           <w:rFonts w:ascii="Times New Roman" w:eastAsia="Times New Roman" w:hAnsi="Times New Roman" w:cs="Times New Roman"/>
         </w:rPr>
-        <w:t xml:space="preserve">injunctive norm to avoid prejudice has already been internalized by the decision-maker. This suggests that the utility of providing descriptive feedback absent an explicit </w:t>
-      </w:r>
-      <w:r>
-        <w:rPr>
-          <w:rFonts w:ascii="Times New Roman" w:eastAsia="Times New Roman" w:hAnsi="Times New Roman" w:cs="Times New Roman"/>
-        </w:rPr>
-        <w:lastRenderedPageBreak/>
-        <w:t>goal, target or norm lies in its ability to focus attention on past behavior in arenas where individuals already harbor self-image or reputational concerns.</w:t>
+        <w:t>injunctive norm to avoid prejudice has already been internalized by the decision-maker. This suggests that the utility of providing descriptive feedback absent an explicit goal, target or norm lies in its ability to focus attention on past behavior in arenas where individuals already harbor self-image or reputational concerns.</w:t>
       </w:r>
     </w:p>
     <w:p>
@@ -7813,14 +8265,38 @@
         <w:rPr>
           <w:rFonts w:ascii="Times New Roman" w:eastAsia="Times New Roman" w:hAnsi="Times New Roman" w:cs="Times New Roman"/>
         </w:rPr>
-        <w:t xml:space="preserve">Practically, our research offers new insights into how those eager to foster diversity, equity, and inclusion within organizations can do so. We document the benefits of a minimally invasive yet effective intervention: providing purely descriptive feedback about the race (or gender) diversity, respectively, of past selectees shapes future selection decisions, increasing their race (or gender) diversity, respectively. We add to a nascent literature that leverages insights about choice architecture and judgment and decision-making to address a continued lack of diversity in organizational settings (Cervantez &amp; Milkman, 2024; Chang et al., 2020; He et al., 2021; Kristal et al., 2023). Moreover, we show that our light-touch intervention generates 45%-80% of the benefits of imposing heavy-handed (and sometimes illegal) quotas requiring that at least one woman (or racial minority) be selected. We include this quota comparison as a practical benchmark: quotas represent a widely-discussed approach to increasing diversity (Dobbin &amp; Kalev, 2016; Leslie, 2019), making them a useful reference point for calibrating the magnitude of our intervention's effects. However, quotas are often illegal (Students for Fair Admissions, Inc. v. President &amp; Fellows of Harvard College, 2023) and even when legal, they can trigger backlash that undermines the very goals they aim to achieve (Dobbin &amp; Kalev, 2016). Our findings suggest that providing descriptive feedback about the diversity of those who were offered past opportunities offers a powerful alternative: it achieves a substantial portion of the diversity gains associated with imposing </w:t>
+        <w:t xml:space="preserve">Practically, our research offers new insights into how those eager to foster diversity, equity, and inclusion within organizations can do so. We document the benefits of a minimally invasive yet effective intervention: providing purely descriptive feedback about the race (or gender) diversity, respectively, of past selectees shapes future selection decisions, increasing their race (or gender) diversity, respectively. We add to a nascent literature that leverages insights </w:t>
+      </w:r>
+      <w:r>
+        <w:rPr>
+          <w:rFonts w:ascii="Times New Roman" w:eastAsia="Times New Roman" w:hAnsi="Times New Roman" w:cs="Times New Roman"/>
+        </w:rPr>
+        <w:t>into</w:t>
+      </w:r>
+      <w:r>
+        <w:rPr>
+          <w:rFonts w:ascii="Times New Roman" w:eastAsia="Times New Roman" w:hAnsi="Times New Roman" w:cs="Times New Roman"/>
+        </w:rPr>
+        <w:t xml:space="preserve"> choice architecture and judgment and decision-making to address a continued lack of diversity in organizational settings (Cervantez &amp; Milkman, 2024; Chang et al., 2020; He et al., 2021; Kristal et al., 2023). Moreover, we show that our light-touch intervention generates 45%-80% of the benefits of imposing heavy-handed (and sometimes illegal) quotas requiring that at least one woman (or racial minority) be selected. We include this quota comparison as a practical benchmark: quotas represent a </w:t>
+      </w:r>
+      <w:r>
+        <w:rPr>
+          <w:rFonts w:ascii="Times New Roman" w:eastAsia="Times New Roman" w:hAnsi="Times New Roman" w:cs="Times New Roman"/>
+        </w:rPr>
+        <w:t>widely discussed</w:t>
+      </w:r>
+      <w:r>
+        <w:rPr>
+          <w:rFonts w:ascii="Times New Roman" w:eastAsia="Times New Roman" w:hAnsi="Times New Roman" w:cs="Times New Roman"/>
+        </w:rPr>
+        <w:t xml:space="preserve"> approach to increasing diversity (Dobbin &amp; Kalev, 2016; Leslie, 2019), making them a useful reference point for calibrating the magnitude of our intervention's effects. However, quotas are often illegal (Students for Fair Admissions, Inc. v. President &amp; Fellows of Harvard College, 2023) and even when legal, they can trigger backlash that undermines the very goals they aim to achieve (Dobbin &amp; Kalev, 2016). Our findings suggest that providing descriptive </w:t>
       </w:r>
       <w:r>
         <w:rPr>
           <w:rFonts w:ascii="Times New Roman" w:eastAsia="Times New Roman" w:hAnsi="Times New Roman" w:cs="Times New Roman"/>
         </w:rPr>
         <w:lastRenderedPageBreak/>
-        <w:t>diversity quotas while preserving decision-maker autonomy and avoiding the legal and cultural risks associated with heavier-handed mandates.</w:t>
+        <w:t>feedback about the diversity of those who were offered past opportunities offers a powerful alternative: it achieves a substantial portion of the diversity gains associated with imposing diversity quotas while preserving decision-maker autonomy and avoiding the legal and cultural risks associated with heavier-handed mandates.</w:t>
       </w:r>
     </w:p>
     <w:p>
@@ -7869,14 +8345,70 @@
         <w:rPr>
           <w:rFonts w:ascii="Times New Roman" w:eastAsia="Times New Roman" w:hAnsi="Times New Roman" w:cs="Times New Roman"/>
         </w:rPr>
-        <w:t xml:space="preserve">While our large sample sizes, diverse stimuli, and pre-registered experiments have many strengths, our research also has several important limitations. First, most of our studies rely on a fairly consistent paradigm. However, we systematically varied several design features across studies, including organizational context (e.g., whether participants were selecting NPR guests, books to be displayed at a library or on campus, or leaders to speak at a large conference), the base rates of underrepresentation in candidate pools, and outcomes measured (the selection of a single woman/racial minority vs. the proportion of women selected in a set). In most organizational settings, selection decisions and feedback will be more spread out over time and candidate pools will be less constrained than in our studies. For example, one candidate might be hired per quarter, and feedback might be provided at the end of the calendar year. Future research confirming that the effect we’ve documented here still arises when people face unconstrained candidate pools and extended decision and feedback timelines would be valuable. </w:t>
+        <w:t xml:space="preserve">While our large sample sizes, diverse stimuli, and pre-registered experiments have many strengths, our research also has several important limitations. First, most of our studies rely on a </w:t>
+      </w:r>
+      <w:proofErr w:type="gramStart"/>
+      <w:r>
+        <w:rPr>
+          <w:rFonts w:ascii="Times New Roman" w:eastAsia="Times New Roman" w:hAnsi="Times New Roman" w:cs="Times New Roman"/>
+        </w:rPr>
+        <w:t>fairly consistent</w:t>
+      </w:r>
+      <w:proofErr w:type="gramEnd"/>
+      <w:r>
+        <w:rPr>
+          <w:rFonts w:ascii="Times New Roman" w:eastAsia="Times New Roman" w:hAnsi="Times New Roman" w:cs="Times New Roman"/>
+        </w:rPr>
+        <w:t xml:space="preserve"> paradigm. However, we systematically varied several design features across studies, including organizational context (e.g., whether participants were selecting NPR guests, books to be displayed at a library or on campus, or leaders to speak at a large conference), the base rates of underrepresentation in candidate pools, and outcomes measured (the selection of a single woman/racial minority vs. the proportion of women selected in a set). In most organizational settings, selection decisions and feedback will be more spread out over time and candidate </w:t>
+      </w:r>
+      <w:proofErr w:type="gramStart"/>
+      <w:r>
+        <w:rPr>
+          <w:rFonts w:ascii="Times New Roman" w:eastAsia="Times New Roman" w:hAnsi="Times New Roman" w:cs="Times New Roman"/>
+        </w:rPr>
+        <w:t>pools</w:t>
+      </w:r>
+      <w:proofErr w:type="gramEnd"/>
+      <w:r>
+        <w:rPr>
+          <w:rFonts w:ascii="Times New Roman" w:eastAsia="Times New Roman" w:hAnsi="Times New Roman" w:cs="Times New Roman"/>
+        </w:rPr>
+        <w:t xml:space="preserve"> will be less constrained than in our studies. For example, one candidate might be hired per quarter, and feedback might be provided at the end of the </w:t>
       </w:r>
       <w:r>
         <w:rPr>
           <w:rFonts w:ascii="Times New Roman" w:eastAsia="Times New Roman" w:hAnsi="Times New Roman" w:cs="Times New Roman"/>
         </w:rPr>
         <w:lastRenderedPageBreak/>
-        <w:t>While it is possible that an extended decision timeline would decrease the size of feedback effects because feedback can become less salient over time (Tiefenbeck et al., 2018), the effect could also be magnified. Given the strength of the reputational and self-image concerns involved in the types of decisions we study, having more time to deliberate may provide a greater opportunity for evaluators to actively regulate their decisions and implement even more substantial corrections (Fazio, 1990; Plant &amp; Devine, 2009). Additionally, while Study 5 demonstrates that feedback produces different effects depending on whether women are underrepresented or overrepresented, future research could explore the precise threshold at which feedback shifts from triggering motivation to respond without prejudice to triggering fairness concerns, though this threshold is likely context dependent.</w:t>
+        <w:t xml:space="preserve">calendar year. Future research </w:t>
+      </w:r>
+      <w:proofErr w:type="gramStart"/>
+      <w:r>
+        <w:rPr>
+          <w:rFonts w:ascii="Times New Roman" w:eastAsia="Times New Roman" w:hAnsi="Times New Roman" w:cs="Times New Roman"/>
+        </w:rPr>
+        <w:t>confirming</w:t>
+      </w:r>
+      <w:proofErr w:type="gramEnd"/>
+      <w:r>
+        <w:rPr>
+          <w:rFonts w:ascii="Times New Roman" w:eastAsia="Times New Roman" w:hAnsi="Times New Roman" w:cs="Times New Roman"/>
+        </w:rPr>
+        <w:t xml:space="preserve"> that the effect we’ve documented here still arises when people face unconstrained candidate </w:t>
+      </w:r>
+      <w:proofErr w:type="gramStart"/>
+      <w:r>
+        <w:rPr>
+          <w:rFonts w:ascii="Times New Roman" w:eastAsia="Times New Roman" w:hAnsi="Times New Roman" w:cs="Times New Roman"/>
+        </w:rPr>
+        <w:t>pools</w:t>
+      </w:r>
+      <w:proofErr w:type="gramEnd"/>
+      <w:r>
+        <w:rPr>
+          <w:rFonts w:ascii="Times New Roman" w:eastAsia="Times New Roman" w:hAnsi="Times New Roman" w:cs="Times New Roman"/>
+        </w:rPr>
+        <w:t xml:space="preserve"> and extended decision and feedback timelines would be valuable. While it is possible that an extended decision timeline would decrease the size of feedback effects because feedback can become less salient over time (Tiefenbeck et al., 2018), the effect could also be magnified. Given the strength of the reputational and self-image concerns involved in the types of decisions we study, having more time to deliberate may provide a greater opportunity for evaluators to actively regulate their decisions and implement even more substantial corrections (Fazio, 1990; Plant &amp; Devine, 2009). Additionally, while Study 5 demonstrates that feedback produces different effects depending on whether women are underrepresented or overrepresented, future research could explore the precise threshold at which feedback shifts from triggering motivation to respond without prejudice to triggering fairness concerns, though this threshold is likely context dependent.</w:t>
       </w:r>
     </w:p>
     <w:p>
@@ -7905,7 +8437,49 @@
         <w:rPr>
           <w:rFonts w:ascii="Times New Roman" w:eastAsia="Times New Roman" w:hAnsi="Times New Roman" w:cs="Times New Roman"/>
         </w:rPr>
-        <w:t>motivation to respond without prejudice, which may be because the delivery of feedback was private. However, if feedback were instead delivered publicly in an organization, we would predict that external motivation to respond without prejudice could become a greater propellant for changes in behavior (Leary &amp; Kowalski, 1990; Lerner &amp; Tetlock, 1999). By exploring only the effect of descriptive feedback delivered in private, we likely provide a conservative test of our intervention’s impact, dampening a potential additional mechanism that could enhance its impact (i.e., external motivation to reduce prejudice). Future work exploring the magnitude of behavior change that arises when the type of descriptive feedback we gave in our studies is provided publicly would be valuable. Such research could more definitively disentangle internal versus external motivation by systematically manipulating the private versus public nature of choices and feedback.</w:t>
+        <w:t xml:space="preserve">motivation to respond without prejudice, which may be because the delivery of feedback was private. However, if feedback were instead delivered publicly </w:t>
+      </w:r>
+      <w:proofErr w:type="gramStart"/>
+      <w:r>
+        <w:rPr>
+          <w:rFonts w:ascii="Times New Roman" w:eastAsia="Times New Roman" w:hAnsi="Times New Roman" w:cs="Times New Roman"/>
+        </w:rPr>
+        <w:t>in</w:t>
+      </w:r>
+      <w:proofErr w:type="gramEnd"/>
+      <w:r>
+        <w:rPr>
+          <w:rFonts w:ascii="Times New Roman" w:eastAsia="Times New Roman" w:hAnsi="Times New Roman" w:cs="Times New Roman"/>
+        </w:rPr>
+        <w:t xml:space="preserve"> an organization, we would predict that external motivation to respond without prejudice could become a greater propellant for changes in behavior (Leary &amp; Kowalski, 1990; Lerner &amp; Tetlock, 1999). By exploring </w:t>
+      </w:r>
+      <w:proofErr w:type="gramStart"/>
+      <w:r>
+        <w:rPr>
+          <w:rFonts w:ascii="Times New Roman" w:eastAsia="Times New Roman" w:hAnsi="Times New Roman" w:cs="Times New Roman"/>
+        </w:rPr>
+        <w:t>only</w:t>
+      </w:r>
+      <w:proofErr w:type="gramEnd"/>
+      <w:r>
+        <w:rPr>
+          <w:rFonts w:ascii="Times New Roman" w:eastAsia="Times New Roman" w:hAnsi="Times New Roman" w:cs="Times New Roman"/>
+        </w:rPr>
+        <w:t xml:space="preserve"> the effect of descriptive feedback </w:t>
+      </w:r>
+      <w:proofErr w:type="gramStart"/>
+      <w:r>
+        <w:rPr>
+          <w:rFonts w:ascii="Times New Roman" w:eastAsia="Times New Roman" w:hAnsi="Times New Roman" w:cs="Times New Roman"/>
+        </w:rPr>
+        <w:t>delivered in private</w:t>
+      </w:r>
+      <w:proofErr w:type="gramEnd"/>
+      <w:r>
+        <w:rPr>
+          <w:rFonts w:ascii="Times New Roman" w:eastAsia="Times New Roman" w:hAnsi="Times New Roman" w:cs="Times New Roman"/>
+        </w:rPr>
+        <w:t>, we likely provide a conservative test of our intervention’s impact, dampening a potential additional mechanism that could enhance its impact (i.e., external motivation to reduce prejudice). Future work exploring the magnitude of behavior change that arises when the type of descriptive feedback we gave in our studies is provided publicly would be valuable. Such research could more definitively disentangle internal versus external motivation by systematically manipulating the private versus public nature of choices and feedback.</w:t>
       </w:r>
     </w:p>
     <w:p>
@@ -7920,14 +8494,26 @@
         <w:rPr>
           <w:rFonts w:ascii="Times New Roman" w:eastAsia="Times New Roman" w:hAnsi="Times New Roman" w:cs="Times New Roman"/>
         </w:rPr>
-        <w:t xml:space="preserve">Relatedly, future research could investigate whether self-tabulating descriptive summary statistics  about past decisions (as opposed to receiving this information from a third party) would generate similar effects. In this scenario, evaluators would hold themselves accountable (Lerner &amp; Tetlock, 1999). We theorize that self-generated tabulations of how many women or racial minorities a decision maker has </w:t>
+        <w:t xml:space="preserve">Relatedly, future research could investigate whether self-tabulating descriptive summary </w:t>
+      </w:r>
+      <w:r>
+        <w:rPr>
+          <w:rFonts w:ascii="Times New Roman" w:eastAsia="Times New Roman" w:hAnsi="Times New Roman" w:cs="Times New Roman"/>
+        </w:rPr>
+        <w:t>statistics about</w:t>
+      </w:r>
+      <w:r>
+        <w:rPr>
+          <w:rFonts w:ascii="Times New Roman" w:eastAsia="Times New Roman" w:hAnsi="Times New Roman" w:cs="Times New Roman"/>
+        </w:rPr>
+        <w:t xml:space="preserve"> past decisions (as opposed to receiving this information from a third party) would generate similar </w:t>
       </w:r>
       <w:r>
         <w:rPr>
           <w:rFonts w:ascii="Times New Roman" w:eastAsia="Times New Roman" w:hAnsi="Times New Roman" w:cs="Times New Roman"/>
         </w:rPr>
         <w:lastRenderedPageBreak/>
-        <w:t>selected in the past would still motivate behavior change by activating internal self-image concerns. That is, this should produce an internal motivation to respond without prejudice driven by a person’s desire to view themself as unbiased. But it might be less effective than descriptive feedback provided by a third party, which leverages the additional pressure of external reputational consequences. Testing how self-tabulated versus other-tabulated summary statistics affect behavior would help further disentangle the specific roles of private self-regulation versus public impression management in driving diversity-related choices.</w:t>
+        <w:t>effects. In this scenario, evaluators would hold themselves accountable (Lerner &amp; Tetlock, 1999). We theorize that self-generated tabulations of how many women or racial minorities a decision maker has selected in the past would still motivate behavior change by activating internal self-image concerns. That is, this should produce an internal motivation to respond without prejudice driven by a person’s desire to view themself as unbiased. But it might be less effective than descriptive feedback provided by a third party, which leverages the additional pressure of external reputational consequences. Testing how self-tabulated versus other-tabulated summary statistics affect behavior would help further disentangle the specific roles of private self-regulation versus public impression management in driving diversity-related choices.</w:t>
       </w:r>
     </w:p>
     <w:p>
@@ -7973,14 +8559,14 @@
         <w:rPr>
           <w:rFonts w:ascii="Times New Roman" w:eastAsia="Times New Roman" w:hAnsi="Times New Roman" w:cs="Times New Roman"/>
         </w:rPr>
-        <w:t xml:space="preserve">Taken together, our research sheds new light on how and why providing descriptive feedback about the race or gender diversity of past selectees can influence subsequent selection decisions to prioritize racial minorities or women, respectively. We show that when women or racial minorities have been underrepresented, descriptive feedback revealing this triggers a motivation to respond without prejudice. This in turn drives decision makers to subsequently select candidates who have been underrepresented in the past at a higher rate. We demonstrate the robustness of this effect across a wide range of experiments including scenario studies, incentive-compatible online experiments, and a framed field experiment. Taken together, our findings suggest that in organizations where the underrepresentation </w:t>
+        <w:t xml:space="preserve">Taken together, our research sheds new light on how and why providing descriptive feedback about the race or gender diversity of past selectees can influence subsequent selection decisions to prioritize racial minorities or women, respectively. We show that when women or racial minorities have been underrepresented, descriptive feedback revealing this triggers a motivation to respond without prejudice. This in turn drives decision makers to subsequently select candidates who have been underrepresented in the past at a higher rate. We demonstrate the robustness of this effect across a wide </w:t>
       </w:r>
       <w:r>
         <w:rPr>
           <w:rFonts w:ascii="Times New Roman" w:eastAsia="Times New Roman" w:hAnsi="Times New Roman" w:cs="Times New Roman"/>
         </w:rPr>
         <w:lastRenderedPageBreak/>
-        <w:t>of women and racial minorities remains a challenge, providing descriptive feedback about past selection decisions may be useful. We show that it is an effective strategy for drawing attention to underrepresentation and increasing the race and gender diversity of those subsequently selected for valued opportunities.</w:t>
+        <w:t>range of experiments including scenario studies, incentive-compatible online experiments, and a framed field experiment. Taken together, our findings suggest that in organizations where the underrepresentation of women and racial minorities remains a challenge, providing descriptive feedback about past selection decisions may be useful. We show that it is an effective strategy for drawing attention to underrepresentation and increasing the race and gender diversity of those subsequently selected for valued opportunities.</w:t>
       </w:r>
       <w:r>
         <w:br w:type="page"/>
@@ -7992,8 +8578,8 @@
         <w:spacing w:line="480" w:lineRule="auto"/>
         <w:jc w:val="center"/>
       </w:pPr>
-      <w:bookmarkStart w:id="31" w:name="_a0k0jyzdszp0" w:colFirst="0" w:colLast="0"/>
-      <w:bookmarkEnd w:id="31"/>
+      <w:bookmarkStart w:id="29" w:name="_a0k0jyzdszp0" w:colFirst="0" w:colLast="0"/>
+      <w:bookmarkEnd w:id="29"/>
       <w:r>
         <w:lastRenderedPageBreak/>
         <w:t>References</w:t>
@@ -8043,7 +8629,7 @@
         </w:rPr>
         <w:t>(3), 273–291.</w:t>
       </w:r>
-      <w:hyperlink r:id="rId17">
+      <w:hyperlink r:id="rId15">
         <w:r>
           <w:rPr>
             <w:rFonts w:ascii="Times New Roman" w:eastAsia="Times New Roman" w:hAnsi="Times New Roman" w:cs="Times New Roman"/>
@@ -8051,7 +8637,7 @@
           <w:t xml:space="preserve"> </w:t>
         </w:r>
       </w:hyperlink>
-      <w:hyperlink r:id="rId18">
+      <w:hyperlink r:id="rId16">
         <w:r>
           <w:rPr>
             <w:rFonts w:ascii="Times New Roman" w:eastAsia="Times New Roman" w:hAnsi="Times New Roman" w:cs="Times New Roman"/>
@@ -8090,7 +8676,7 @@
         </w:rPr>
         <w:t xml:space="preserve"> (Vol. 2, pp. 267–299). Academic Press. </w:t>
       </w:r>
-      <w:hyperlink r:id="rId19">
+      <w:hyperlink r:id="rId17">
         <w:r>
           <w:rPr>
             <w:rFonts w:ascii="Times New Roman" w:eastAsia="Times New Roman" w:hAnsi="Times New Roman" w:cs="Times New Roman"/>
@@ -8145,7 +8731,7 @@
         </w:rPr>
         <w:t>(9–10), 1082–1095.</w:t>
       </w:r>
-      <w:hyperlink r:id="rId20">
+      <w:hyperlink r:id="rId18">
         <w:r>
           <w:rPr>
             <w:rFonts w:ascii="Times New Roman" w:eastAsia="Times New Roman" w:hAnsi="Times New Roman" w:cs="Times New Roman"/>
@@ -8153,7 +8739,7 @@
           <w:t xml:space="preserve"> </w:t>
         </w:r>
       </w:hyperlink>
-      <w:hyperlink r:id="rId21">
+      <w:hyperlink r:id="rId19">
         <w:r>
           <w:rPr>
             <w:rFonts w:ascii="Times New Roman" w:eastAsia="Times New Roman" w:hAnsi="Times New Roman" w:cs="Times New Roman"/>
@@ -8208,7 +8794,7 @@
         </w:rPr>
         <w:t>(3), 449–463.</w:t>
       </w:r>
-      <w:hyperlink r:id="rId22">
+      <w:hyperlink r:id="rId20">
         <w:r>
           <w:rPr>
             <w:rFonts w:ascii="Times New Roman" w:eastAsia="Times New Roman" w:hAnsi="Times New Roman" w:cs="Times New Roman"/>
@@ -8248,6 +8834,55 @@
           <w:rFonts w:ascii="Times New Roman" w:eastAsia="Times New Roman" w:hAnsi="Times New Roman" w:cs="Times New Roman"/>
         </w:rPr>
         <w:t xml:space="preserve"> [Data set].</w:t>
+      </w:r>
+      <w:hyperlink r:id="rId21">
+        <w:r>
+          <w:rPr>
+            <w:rFonts w:ascii="Times New Roman" w:eastAsia="Times New Roman" w:hAnsi="Times New Roman" w:cs="Times New Roman"/>
+          </w:rPr>
+          <w:t xml:space="preserve"> </w:t>
+        </w:r>
+      </w:hyperlink>
+      <w:hyperlink r:id="rId22">
+        <w:r>
+          <w:rPr>
+            <w:rFonts w:ascii="Times New Roman" w:eastAsia="Times New Roman" w:hAnsi="Times New Roman" w:cs="Times New Roman"/>
+            <w:color w:val="1155CC"/>
+            <w:u w:val="single"/>
+          </w:rPr>
+          <w:t>https://electionstudies.org/data-center/2022-pilot-study/</w:t>
+        </w:r>
+      </w:hyperlink>
+    </w:p>
+    <w:p>
+      <w:pPr>
+        <w:spacing w:before="240" w:after="240"/>
+        <w:ind w:left="720" w:hanging="720"/>
+        <w:rPr>
+          <w:rFonts w:ascii="Times New Roman" w:eastAsia="Times New Roman" w:hAnsi="Times New Roman" w:cs="Times New Roman"/>
+          <w:color w:val="1155CC"/>
+          <w:u w:val="single"/>
+        </w:rPr>
+      </w:pPr>
+      <w:r>
+        <w:rPr>
+          <w:rFonts w:ascii="Times New Roman" w:eastAsia="Times New Roman" w:hAnsi="Times New Roman" w:cs="Times New Roman"/>
+        </w:rPr>
+        <w:t xml:space="preserve">Angrist, J. D., &amp; Pischke, J.-S. (2009). </w:t>
+      </w:r>
+      <w:r>
+        <w:rPr>
+          <w:rFonts w:ascii="Times New Roman" w:eastAsia="Times New Roman" w:hAnsi="Times New Roman" w:cs="Times New Roman"/>
+          <w:i/>
+          <w:iCs/>
+        </w:rPr>
+        <w:t>Mostly harmless econometrics: An empiricist’s companion</w:t>
+      </w:r>
+      <w:r>
+        <w:rPr>
+          <w:rFonts w:ascii="Times New Roman" w:eastAsia="Times New Roman" w:hAnsi="Times New Roman" w:cs="Times New Roman"/>
+        </w:rPr>
+        <w:t>. Princeton University Press.</w:t>
       </w:r>
       <w:hyperlink r:id="rId23">
         <w:r>
@@ -8264,9 +8899,17 @@
             <w:color w:val="1155CC"/>
             <w:u w:val="single"/>
           </w:rPr>
-          <w:t>https://electionstudies.org/data-center/2022-pilot-study/</w:t>
+          <w:t>https://doi.org/10.1515/9781400829828</w:t>
         </w:r>
       </w:hyperlink>
+      <w:r>
+        <w:rPr>
+          <w:rFonts w:ascii="Times New Roman" w:eastAsia="Times New Roman" w:hAnsi="Times New Roman" w:cs="Times New Roman"/>
+          <w:color w:val="1155CC"/>
+          <w:u w:val="single"/>
+        </w:rPr>
+        <w:t xml:space="preserve"> </w:t>
+      </w:r>
     </w:p>
     <w:p>
       <w:pPr>
@@ -8282,21 +8925,35 @@
         <w:rPr>
           <w:rFonts w:ascii="Times New Roman" w:eastAsia="Times New Roman" w:hAnsi="Times New Roman" w:cs="Times New Roman"/>
         </w:rPr>
-        <w:t xml:space="preserve">Angrist, J. D., &amp; Pischke, J.-S. (2009). </w:t>
-      </w:r>
-      <w:r>
-        <w:rPr>
-          <w:rFonts w:ascii="Times New Roman" w:eastAsia="Times New Roman" w:hAnsi="Times New Roman" w:cs="Times New Roman"/>
-          <w:i/>
-          <w:iCs/>
-        </w:rPr>
-        <w:t>Mostly harmless econometrics: An empiricist’s companion</w:t>
-      </w:r>
-      <w:r>
-        <w:rPr>
-          <w:rFonts w:ascii="Times New Roman" w:eastAsia="Times New Roman" w:hAnsi="Times New Roman" w:cs="Times New Roman"/>
-        </w:rPr>
-        <w:t>. Princeton University Press.</w:t>
+        <w:t xml:space="preserve">Apfelbaum, E. P., Sommers, S. R., &amp; Norton, M. I. (2008). Seeing race and seeming racist? Evaluating strategic colorblindness in social interaction. </w:t>
+      </w:r>
+      <w:r>
+        <w:rPr>
+          <w:rFonts w:ascii="Times New Roman" w:eastAsia="Times New Roman" w:hAnsi="Times New Roman" w:cs="Times New Roman"/>
+          <w:i/>
+          <w:iCs/>
+        </w:rPr>
+        <w:t>Journal of Personality and Social Psychology</w:t>
+      </w:r>
+      <w:r>
+        <w:rPr>
+          <w:rFonts w:ascii="Times New Roman" w:eastAsia="Times New Roman" w:hAnsi="Times New Roman" w:cs="Times New Roman"/>
+        </w:rPr>
+        <w:t xml:space="preserve">, </w:t>
+      </w:r>
+      <w:r>
+        <w:rPr>
+          <w:rFonts w:ascii="Times New Roman" w:eastAsia="Times New Roman" w:hAnsi="Times New Roman" w:cs="Times New Roman"/>
+          <w:i/>
+          <w:iCs/>
+        </w:rPr>
+        <w:t>95</w:t>
+      </w:r>
+      <w:r>
+        <w:rPr>
+          <w:rFonts w:ascii="Times New Roman" w:eastAsia="Times New Roman" w:hAnsi="Times New Roman" w:cs="Times New Roman"/>
+        </w:rPr>
+        <w:t>(4), 918–932.</w:t>
       </w:r>
       <w:hyperlink r:id="rId25">
         <w:r>
@@ -8306,23 +8963,13 @@
           <w:t xml:space="preserve"> </w:t>
         </w:r>
       </w:hyperlink>
-      <w:hyperlink r:id="rId26">
-        <w:r>
-          <w:rPr>
-            <w:rFonts w:ascii="Times New Roman" w:eastAsia="Times New Roman" w:hAnsi="Times New Roman" w:cs="Times New Roman"/>
-            <w:color w:val="1155CC"/>
-            <w:u w:val="single"/>
-          </w:rPr>
-          <w:t>https://doi.org/10.1515/9781400829828</w:t>
-        </w:r>
-      </w:hyperlink>
       <w:r>
         <w:rPr>
           <w:rFonts w:ascii="Times New Roman" w:eastAsia="Times New Roman" w:hAnsi="Times New Roman" w:cs="Times New Roman"/>
           <w:color w:val="1155CC"/>
           <w:u w:val="single"/>
         </w:rPr>
-        <w:t xml:space="preserve"> </w:t>
+        <w:t>https://doi.org/10.1037/a0011990</w:t>
       </w:r>
     </w:p>
     <w:p>
@@ -8339,7 +8986,7 @@
         <w:rPr>
           <w:rFonts w:ascii="Times New Roman" w:eastAsia="Times New Roman" w:hAnsi="Times New Roman" w:cs="Times New Roman"/>
         </w:rPr>
-        <w:t xml:space="preserve">Apfelbaum, E. P., Sommers, S. R., &amp; Norton, M. I. (2008). Seeing race and seeming racist? Evaluating strategic colorblindness in social interaction. </w:t>
+        <w:t xml:space="preserve">Bandura, A., &amp; Cervone, D. (1983). Self-evaluative and self-efficacy mechanisms governing the motivational effects of goal systems. </w:t>
       </w:r>
       <w:r>
         <w:rPr>
@@ -8361,15 +9008,15 @@
           <w:i/>
           <w:iCs/>
         </w:rPr>
-        <w:t>95</w:t>
-      </w:r>
-      <w:r>
-        <w:rPr>
-          <w:rFonts w:ascii="Times New Roman" w:eastAsia="Times New Roman" w:hAnsi="Times New Roman" w:cs="Times New Roman"/>
-        </w:rPr>
-        <w:t>(4), 918–932.</w:t>
-      </w:r>
-      <w:hyperlink r:id="rId27">
+        <w:t>45</w:t>
+      </w:r>
+      <w:r>
+        <w:rPr>
+          <w:rFonts w:ascii="Times New Roman" w:eastAsia="Times New Roman" w:hAnsi="Times New Roman" w:cs="Times New Roman"/>
+        </w:rPr>
+        <w:t>(5), 1017–1028.</w:t>
+      </w:r>
+      <w:hyperlink r:id="rId26">
         <w:r>
           <w:rPr>
             <w:rFonts w:ascii="Times New Roman" w:eastAsia="Times New Roman" w:hAnsi="Times New Roman" w:cs="Times New Roman"/>
@@ -8383,7 +9030,7 @@
           <w:color w:val="1155CC"/>
           <w:u w:val="single"/>
         </w:rPr>
-        <w:t>https://doi.org/10.1037/a0011990</w:t>
+        <w:t>https://doi.org/10.1037/0022-3514.45.5.1017</w:t>
       </w:r>
     </w:p>
     <w:p>
@@ -8400,15 +9047,15 @@
         <w:rPr>
           <w:rFonts w:ascii="Times New Roman" w:eastAsia="Times New Roman" w:hAnsi="Times New Roman" w:cs="Times New Roman"/>
         </w:rPr>
-        <w:t xml:space="preserve">Bandura, A., &amp; Cervone, D. (1983). Self-evaluative and self-efficacy mechanisms governing the motivational effects of goal systems. </w:t>
-      </w:r>
-      <w:r>
-        <w:rPr>
-          <w:rFonts w:ascii="Times New Roman" w:eastAsia="Times New Roman" w:hAnsi="Times New Roman" w:cs="Times New Roman"/>
-          <w:i/>
-          <w:iCs/>
-        </w:rPr>
-        <w:t>Journal of Personality and Social Psychology</w:t>
+        <w:t xml:space="preserve">Barr, A., Lane, T., &amp; Nosenzo, D. (2018). On the social inappropriateness of discrimination. </w:t>
+      </w:r>
+      <w:r>
+        <w:rPr>
+          <w:rFonts w:ascii="Times New Roman" w:eastAsia="Times New Roman" w:hAnsi="Times New Roman" w:cs="Times New Roman"/>
+          <w:i/>
+          <w:iCs/>
+        </w:rPr>
+        <w:t>Journal of Public Economics</w:t>
       </w:r>
       <w:r>
         <w:rPr>
@@ -8422,67 +9069,6 @@
           <w:i/>
           <w:iCs/>
         </w:rPr>
-        <w:t>45</w:t>
-      </w:r>
-      <w:r>
-        <w:rPr>
-          <w:rFonts w:ascii="Times New Roman" w:eastAsia="Times New Roman" w:hAnsi="Times New Roman" w:cs="Times New Roman"/>
-        </w:rPr>
-        <w:t>(5), 1017–1028.</w:t>
-      </w:r>
-      <w:hyperlink r:id="rId28">
-        <w:r>
-          <w:rPr>
-            <w:rFonts w:ascii="Times New Roman" w:eastAsia="Times New Roman" w:hAnsi="Times New Roman" w:cs="Times New Roman"/>
-          </w:rPr>
-          <w:t xml:space="preserve"> </w:t>
-        </w:r>
-      </w:hyperlink>
-      <w:r>
-        <w:rPr>
-          <w:rFonts w:ascii="Times New Roman" w:eastAsia="Times New Roman" w:hAnsi="Times New Roman" w:cs="Times New Roman"/>
-          <w:color w:val="1155CC"/>
-          <w:u w:val="single"/>
-        </w:rPr>
-        <w:t>https://doi.org/10.1037/0022-3514.45.5.1017</w:t>
-      </w:r>
-    </w:p>
-    <w:p>
-      <w:pPr>
-        <w:spacing w:before="240" w:after="240"/>
-        <w:ind w:left="720" w:hanging="720"/>
-        <w:rPr>
-          <w:rFonts w:ascii="Times New Roman" w:eastAsia="Times New Roman" w:hAnsi="Times New Roman" w:cs="Times New Roman"/>
-          <w:color w:val="1155CC"/>
-          <w:u w:val="single"/>
-        </w:rPr>
-      </w:pPr>
-      <w:r>
-        <w:rPr>
-          <w:rFonts w:ascii="Times New Roman" w:eastAsia="Times New Roman" w:hAnsi="Times New Roman" w:cs="Times New Roman"/>
-        </w:rPr>
-        <w:t xml:space="preserve">Barr, A., Lane, T., &amp; Nosenzo, D. (2018). On the social inappropriateness of discrimination. </w:t>
-      </w:r>
-      <w:r>
-        <w:rPr>
-          <w:rFonts w:ascii="Times New Roman" w:eastAsia="Times New Roman" w:hAnsi="Times New Roman" w:cs="Times New Roman"/>
-          <w:i/>
-          <w:iCs/>
-        </w:rPr>
-        <w:t>Journal of Public Economics</w:t>
-      </w:r>
-      <w:r>
-        <w:rPr>
-          <w:rFonts w:ascii="Times New Roman" w:eastAsia="Times New Roman" w:hAnsi="Times New Roman" w:cs="Times New Roman"/>
-        </w:rPr>
-        <w:t xml:space="preserve">, </w:t>
-      </w:r>
-      <w:r>
-        <w:rPr>
-          <w:rFonts w:ascii="Times New Roman" w:eastAsia="Times New Roman" w:hAnsi="Times New Roman" w:cs="Times New Roman"/>
-          <w:i/>
-          <w:iCs/>
-        </w:rPr>
         <w:t>164</w:t>
       </w:r>
       <w:r>
@@ -8491,7 +9077,7 @@
         </w:rPr>
         <w:t>, 112–130.</w:t>
       </w:r>
-      <w:hyperlink r:id="rId29">
+      <w:hyperlink r:id="rId27">
         <w:r>
           <w:rPr>
             <w:rFonts w:ascii="Times New Roman" w:eastAsia="Times New Roman" w:hAnsi="Times New Roman" w:cs="Times New Roman"/>
@@ -8531,6 +9117,64 @@
           <w:rFonts w:ascii="Times New Roman" w:eastAsia="Times New Roman" w:hAnsi="Times New Roman" w:cs="Times New Roman"/>
         </w:rPr>
         <w:t>.</w:t>
+      </w:r>
+      <w:hyperlink r:id="rId28">
+        <w:r>
+          <w:rPr>
+            <w:rFonts w:ascii="Times New Roman" w:eastAsia="Times New Roman" w:hAnsi="Times New Roman" w:cs="Times New Roman"/>
+          </w:rPr>
+          <w:t xml:space="preserve"> </w:t>
+        </w:r>
+      </w:hyperlink>
+      <w:hyperlink r:id="rId29">
+        <w:r>
+          <w:rPr>
+            <w:rFonts w:ascii="Times New Roman" w:eastAsia="Times New Roman" w:hAnsi="Times New Roman" w:cs="Times New Roman"/>
+            <w:color w:val="1155CC"/>
+            <w:u w:val="single"/>
+          </w:rPr>
+          <w:t>https://www.bbc.com/5050/</w:t>
+        </w:r>
+      </w:hyperlink>
+    </w:p>
+    <w:p>
+      <w:pPr>
+        <w:spacing w:before="240" w:after="240"/>
+        <w:ind w:left="720" w:hanging="720"/>
+      </w:pPr>
+      <w:r>
+        <w:rPr>
+          <w:rFonts w:ascii="Times New Roman" w:eastAsia="Times New Roman" w:hAnsi="Times New Roman" w:cs="Times New Roman"/>
+        </w:rPr>
+        <w:t xml:space="preserve">Becker, L. J. (1978). Joint effect of feedback and goal setting on performance: A field study of residential energy conservation. </w:t>
+      </w:r>
+      <w:r>
+        <w:rPr>
+          <w:rFonts w:ascii="Times New Roman" w:eastAsia="Times New Roman" w:hAnsi="Times New Roman" w:cs="Times New Roman"/>
+          <w:i/>
+          <w:iCs/>
+        </w:rPr>
+        <w:t>Journal of Applied Psychology</w:t>
+      </w:r>
+      <w:r>
+        <w:rPr>
+          <w:rFonts w:ascii="Times New Roman" w:eastAsia="Times New Roman" w:hAnsi="Times New Roman" w:cs="Times New Roman"/>
+        </w:rPr>
+        <w:t xml:space="preserve">, </w:t>
+      </w:r>
+      <w:r>
+        <w:rPr>
+          <w:rFonts w:ascii="Times New Roman" w:eastAsia="Times New Roman" w:hAnsi="Times New Roman" w:cs="Times New Roman"/>
+          <w:i/>
+          <w:iCs/>
+        </w:rPr>
+        <w:t>63</w:t>
+      </w:r>
+      <w:r>
+        <w:rPr>
+          <w:rFonts w:ascii="Times New Roman" w:eastAsia="Times New Roman" w:hAnsi="Times New Roman" w:cs="Times New Roman"/>
+        </w:rPr>
+        <w:t>(4), 428–433.</w:t>
       </w:r>
       <w:hyperlink r:id="rId30">
         <w:r>
@@ -8547,7 +9191,7 @@
             <w:color w:val="1155CC"/>
             <w:u w:val="single"/>
           </w:rPr>
-          <w:t>https://www.bbc.com/5050/</w:t>
+          <w:t>https://doi.org/10.1037/0021-9010.63.4.428</w:t>
         </w:r>
       </w:hyperlink>
     </w:p>
@@ -8557,6 +9201,44 @@
         <w:ind w:left="720" w:hanging="720"/>
         <w:rPr>
           <w:rFonts w:ascii="Times New Roman" w:eastAsia="Times New Roman" w:hAnsi="Times New Roman" w:cs="Times New Roman"/>
+        </w:rPr>
+      </w:pPr>
+      <w:r>
+        <w:rPr>
+          <w:rFonts w:ascii="Times New Roman" w:eastAsia="Times New Roman" w:hAnsi="Times New Roman" w:cs="Times New Roman"/>
+        </w:rPr>
+        <w:t xml:space="preserve">Bicchieri, C., &amp; Xiao, E. (2009). Do the right thing: But only if others do so. </w:t>
+      </w:r>
+      <w:r>
+        <w:rPr>
+          <w:rFonts w:ascii="Times New Roman" w:eastAsia="Times New Roman" w:hAnsi="Times New Roman" w:cs="Times New Roman"/>
+          <w:i/>
+          <w:iCs/>
+        </w:rPr>
+        <w:t>Journal of Behavioral Decision Making, 22</w:t>
+      </w:r>
+      <w:r>
+        <w:rPr>
+          <w:rFonts w:ascii="Times New Roman" w:eastAsia="Times New Roman" w:hAnsi="Times New Roman" w:cs="Times New Roman"/>
+        </w:rPr>
+        <w:t xml:space="preserve">(2), 191–208. </w:t>
+      </w:r>
+      <w:hyperlink r:id="rId32" w:history="1">
+        <w:r>
+          <w:rPr>
+            <w:rStyle w:val="Hyperlink"/>
+            <w:rFonts w:ascii="Times New Roman" w:eastAsia="Times New Roman" w:hAnsi="Times New Roman" w:cs="Times New Roman"/>
+          </w:rPr>
+          <w:t>https://doi.org/10.1002/bdm.621</w:t>
+        </w:r>
+      </w:hyperlink>
+    </w:p>
+    <w:p>
+      <w:pPr>
+        <w:spacing w:before="240" w:after="240"/>
+        <w:ind w:left="720" w:hanging="720"/>
+        <w:rPr>
+          <w:rFonts w:ascii="Times New Roman" w:eastAsia="Times New Roman" w:hAnsi="Times New Roman" w:cs="Times New Roman"/>
           <w:color w:val="1155CC"/>
           <w:u w:val="single"/>
         </w:rPr>
@@ -8565,15 +9247,15 @@
         <w:rPr>
           <w:rFonts w:ascii="Times New Roman" w:eastAsia="Times New Roman" w:hAnsi="Times New Roman" w:cs="Times New Roman"/>
         </w:rPr>
-        <w:t xml:space="preserve">Becker, L. J. (1978). Joint effect of feedback and goal setting on performance: A field study of residential energy conservation. </w:t>
-      </w:r>
-      <w:r>
-        <w:rPr>
-          <w:rFonts w:ascii="Times New Roman" w:eastAsia="Times New Roman" w:hAnsi="Times New Roman" w:cs="Times New Roman"/>
-          <w:i/>
-          <w:iCs/>
-        </w:rPr>
-        <w:t>Journal of Applied Psychology</w:t>
+        <w:t xml:space="preserve">Bhanot, S. P. (2021). Isolating the effect of injunctive norms on conservation behavior: New evidence from a field experiment in California. </w:t>
+      </w:r>
+      <w:r>
+        <w:rPr>
+          <w:rFonts w:ascii="Times New Roman" w:eastAsia="Times New Roman" w:hAnsi="Times New Roman" w:cs="Times New Roman"/>
+          <w:i/>
+          <w:iCs/>
+        </w:rPr>
+        <w:t>Organizational Behavior and Human Decision Processes</w:t>
       </w:r>
       <w:r>
         <w:rPr>
@@ -8587,15 +9269,15 @@
           <w:i/>
           <w:iCs/>
         </w:rPr>
-        <w:t>63</w:t>
-      </w:r>
-      <w:r>
-        <w:rPr>
-          <w:rFonts w:ascii="Times New Roman" w:eastAsia="Times New Roman" w:hAnsi="Times New Roman" w:cs="Times New Roman"/>
-        </w:rPr>
-        <w:t>(4), 428–433.</w:t>
-      </w:r>
-      <w:hyperlink r:id="rId32">
+        <w:t>163</w:t>
+      </w:r>
+      <w:r>
+        <w:rPr>
+          <w:rFonts w:ascii="Times New Roman" w:eastAsia="Times New Roman" w:hAnsi="Times New Roman" w:cs="Times New Roman"/>
+        </w:rPr>
+        <w:t>, 30–42.</w:t>
+      </w:r>
+      <w:hyperlink r:id="rId33">
         <w:r>
           <w:rPr>
             <w:rFonts w:ascii="Times New Roman" w:eastAsia="Times New Roman" w:hAnsi="Times New Roman" w:cs="Times New Roman"/>
@@ -8603,70 +9285,7 @@
           <w:t xml:space="preserve"> </w:t>
         </w:r>
       </w:hyperlink>
-      <w:hyperlink r:id="rId33">
-        <w:r>
-          <w:rPr>
-            <w:rFonts w:ascii="Times New Roman" w:eastAsia="Times New Roman" w:hAnsi="Times New Roman" w:cs="Times New Roman"/>
-            <w:color w:val="1155CC"/>
-            <w:u w:val="single"/>
-          </w:rPr>
-          <w:t>https://doi.org/10.1037/0021-9010.63.4.428</w:t>
-        </w:r>
-      </w:hyperlink>
-    </w:p>
-    <w:p>
-      <w:pPr>
-        <w:spacing w:before="240" w:after="240"/>
-        <w:ind w:left="720" w:hanging="720"/>
-        <w:rPr>
-          <w:rFonts w:ascii="Times New Roman" w:eastAsia="Times New Roman" w:hAnsi="Times New Roman" w:cs="Times New Roman"/>
-          <w:color w:val="1155CC"/>
-          <w:u w:val="single"/>
-        </w:rPr>
-      </w:pPr>
-      <w:r>
-        <w:rPr>
-          <w:rFonts w:ascii="Times New Roman" w:eastAsia="Times New Roman" w:hAnsi="Times New Roman" w:cs="Times New Roman"/>
-        </w:rPr>
-        <w:t xml:space="preserve">Bhanot, S. P. (2021). Isolating the effect of injunctive norms on conservation behavior: New evidence from a field experiment in California. </w:t>
-      </w:r>
-      <w:r>
-        <w:rPr>
-          <w:rFonts w:ascii="Times New Roman" w:eastAsia="Times New Roman" w:hAnsi="Times New Roman" w:cs="Times New Roman"/>
-          <w:i/>
-          <w:iCs/>
-        </w:rPr>
-        <w:t>Organizational Behavior and Human Decision Processes</w:t>
-      </w:r>
-      <w:r>
-        <w:rPr>
-          <w:rFonts w:ascii="Times New Roman" w:eastAsia="Times New Roman" w:hAnsi="Times New Roman" w:cs="Times New Roman"/>
-        </w:rPr>
-        <w:t xml:space="preserve">, </w:t>
-      </w:r>
-      <w:r>
-        <w:rPr>
-          <w:rFonts w:ascii="Times New Roman" w:eastAsia="Times New Roman" w:hAnsi="Times New Roman" w:cs="Times New Roman"/>
-          <w:i/>
-          <w:iCs/>
-        </w:rPr>
-        <w:t>163</w:t>
-      </w:r>
-      <w:r>
-        <w:rPr>
-          <w:rFonts w:ascii="Times New Roman" w:eastAsia="Times New Roman" w:hAnsi="Times New Roman" w:cs="Times New Roman"/>
-        </w:rPr>
-        <w:t>, 30–42.</w:t>
-      </w:r>
       <w:hyperlink r:id="rId34">
-        <w:r>
-          <w:rPr>
-            <w:rFonts w:ascii="Times New Roman" w:eastAsia="Times New Roman" w:hAnsi="Times New Roman" w:cs="Times New Roman"/>
-          </w:rPr>
-          <w:t xml:space="preserve"> </w:t>
-        </w:r>
-      </w:hyperlink>
-      <w:hyperlink r:id="rId35">
         <w:r>
           <w:rPr>
             <w:rFonts w:ascii="Times New Roman" w:eastAsia="Times New Roman" w:hAnsi="Times New Roman" w:cs="Times New Roman"/>
@@ -8722,6 +9341,67 @@
         </w:rPr>
         <w:t>(5), 1225–1234.</w:t>
       </w:r>
+      <w:hyperlink r:id="rId35">
+        <w:r>
+          <w:rPr>
+            <w:rFonts w:ascii="Times New Roman" w:eastAsia="Times New Roman" w:hAnsi="Times New Roman" w:cs="Times New Roman"/>
+          </w:rPr>
+          <w:t xml:space="preserve"> </w:t>
+        </w:r>
+      </w:hyperlink>
+      <w:r>
+        <w:rPr>
+          <w:rFonts w:ascii="Times New Roman" w:eastAsia="Times New Roman" w:hAnsi="Times New Roman" w:cs="Times New Roman"/>
+          <w:color w:val="1155CC"/>
+          <w:u w:val="single"/>
+        </w:rPr>
+        <w:t>https://doi.org/10.1287/mnsc.2015.2186</w:t>
+      </w:r>
+    </w:p>
+    <w:p>
+      <w:pPr>
+        <w:spacing w:before="240" w:after="240"/>
+        <w:ind w:left="720" w:hanging="720"/>
+        <w:rPr>
+          <w:rFonts w:ascii="Times New Roman" w:eastAsia="Times New Roman" w:hAnsi="Times New Roman" w:cs="Times New Roman"/>
+          <w:color w:val="1155CC"/>
+          <w:u w:val="single"/>
+        </w:rPr>
+      </w:pPr>
+      <w:r>
+        <w:rPr>
+          <w:rFonts w:ascii="Times New Roman" w:eastAsia="Times New Roman" w:hAnsi="Times New Roman" w:cs="Times New Roman"/>
+        </w:rPr>
+        <w:t xml:space="preserve">Bosson, J. K., Parrott, D. J., Swan, S. C., Kuchynka, S. L., &amp; Schramm, A. T. (2015). A dangerous boomerang: Injunctive norms, hostile sexist attitudes, and male-to-female sexual aggression. </w:t>
+      </w:r>
+      <w:r>
+        <w:rPr>
+          <w:rFonts w:ascii="Times New Roman" w:eastAsia="Times New Roman" w:hAnsi="Times New Roman" w:cs="Times New Roman"/>
+          <w:i/>
+          <w:iCs/>
+        </w:rPr>
+        <w:t>Aggressive Behavior</w:t>
+      </w:r>
+      <w:r>
+        <w:rPr>
+          <w:rFonts w:ascii="Times New Roman" w:eastAsia="Times New Roman" w:hAnsi="Times New Roman" w:cs="Times New Roman"/>
+        </w:rPr>
+        <w:t xml:space="preserve">, </w:t>
+      </w:r>
+      <w:r>
+        <w:rPr>
+          <w:rFonts w:ascii="Times New Roman" w:eastAsia="Times New Roman" w:hAnsi="Times New Roman" w:cs="Times New Roman"/>
+          <w:i/>
+          <w:iCs/>
+        </w:rPr>
+        <w:t>41</w:t>
+      </w:r>
+      <w:r>
+        <w:rPr>
+          <w:rFonts w:ascii="Times New Roman" w:eastAsia="Times New Roman" w:hAnsi="Times New Roman" w:cs="Times New Roman"/>
+        </w:rPr>
+        <w:t>(6), 580–593.</w:t>
+      </w:r>
       <w:hyperlink r:id="rId36">
         <w:r>
           <w:rPr>
@@ -8736,7 +9416,7 @@
           <w:color w:val="1155CC"/>
           <w:u w:val="single"/>
         </w:rPr>
-        <w:t>https://doi.org/10.1287/mnsc.2015.2186</w:t>
+        <w:t>https://doi.org/10.1002/ab.21597</w:t>
       </w:r>
     </w:p>
     <w:p>
@@ -8753,15 +9433,15 @@
         <w:rPr>
           <w:rFonts w:ascii="Times New Roman" w:eastAsia="Times New Roman" w:hAnsi="Times New Roman" w:cs="Times New Roman"/>
         </w:rPr>
-        <w:t xml:space="preserve">Bosson, J. K., Parrott, D. J., Swan, S. C., Kuchynka, S. L., &amp; Schramm, A. T. (2015). A dangerous boomerang: Injunctive norms, hostile sexist attitudes, and male-to-female sexual aggression. </w:t>
-      </w:r>
-      <w:r>
-        <w:rPr>
-          <w:rFonts w:ascii="Times New Roman" w:eastAsia="Times New Roman" w:hAnsi="Times New Roman" w:cs="Times New Roman"/>
-          <w:i/>
-          <w:iCs/>
-        </w:rPr>
-        <w:t>Aggressive Behavior</w:t>
+        <w:t xml:space="preserve">Bravata, D. M., Smith-Spangler, C., Sundaram, V., Gienger, A. L., Lin, N., Lewis, R., Stave, C. D., Olkin, I., &amp; Sirard, J. R. (2007). Using pedometers to increase physical activity and improve health: A systematic review. </w:t>
+      </w:r>
+      <w:r>
+        <w:rPr>
+          <w:rFonts w:ascii="Times New Roman" w:eastAsia="Times New Roman" w:hAnsi="Times New Roman" w:cs="Times New Roman"/>
+          <w:i/>
+          <w:iCs/>
+        </w:rPr>
+        <w:t>JAMA</w:t>
       </w:r>
       <w:r>
         <w:rPr>
@@ -8775,13 +9455,13 @@
           <w:i/>
           <w:iCs/>
         </w:rPr>
-        <w:t>41</w:t>
-      </w:r>
-      <w:r>
-        <w:rPr>
-          <w:rFonts w:ascii="Times New Roman" w:eastAsia="Times New Roman" w:hAnsi="Times New Roman" w:cs="Times New Roman"/>
-        </w:rPr>
-        <w:t>(6), 580–593.</w:t>
+        <w:t>298</w:t>
+      </w:r>
+      <w:r>
+        <w:rPr>
+          <w:rFonts w:ascii="Times New Roman" w:eastAsia="Times New Roman" w:hAnsi="Times New Roman" w:cs="Times New Roman"/>
+        </w:rPr>
+        <w:t>(19), 2296–2304.</w:t>
       </w:r>
       <w:hyperlink r:id="rId37">
         <w:r>
@@ -8791,68 +9471,7 @@
           <w:t xml:space="preserve"> </w:t>
         </w:r>
       </w:hyperlink>
-      <w:r>
-        <w:rPr>
-          <w:rFonts w:ascii="Times New Roman" w:eastAsia="Times New Roman" w:hAnsi="Times New Roman" w:cs="Times New Roman"/>
-          <w:color w:val="1155CC"/>
-          <w:u w:val="single"/>
-        </w:rPr>
-        <w:t>https://doi.org/10.1002/ab.21597</w:t>
-      </w:r>
-    </w:p>
-    <w:p>
-      <w:pPr>
-        <w:spacing w:before="240" w:after="240"/>
-        <w:ind w:left="720" w:hanging="720"/>
-        <w:rPr>
-          <w:rFonts w:ascii="Times New Roman" w:eastAsia="Times New Roman" w:hAnsi="Times New Roman" w:cs="Times New Roman"/>
-          <w:color w:val="1155CC"/>
-          <w:u w:val="single"/>
-        </w:rPr>
-      </w:pPr>
-      <w:r>
-        <w:rPr>
-          <w:rFonts w:ascii="Times New Roman" w:eastAsia="Times New Roman" w:hAnsi="Times New Roman" w:cs="Times New Roman"/>
-        </w:rPr>
-        <w:t xml:space="preserve">Bravata, D. M., Smith-Spangler, C., Sundaram, V., Gienger, A. L., Lin, N., Lewis, R., Stave, C. D., Olkin, I., &amp; Sirard, J. R. (2007). Using pedometers to increase physical activity and improve health: A systematic review. </w:t>
-      </w:r>
-      <w:r>
-        <w:rPr>
-          <w:rFonts w:ascii="Times New Roman" w:eastAsia="Times New Roman" w:hAnsi="Times New Roman" w:cs="Times New Roman"/>
-          <w:i/>
-          <w:iCs/>
-        </w:rPr>
-        <w:t>JAMA</w:t>
-      </w:r>
-      <w:r>
-        <w:rPr>
-          <w:rFonts w:ascii="Times New Roman" w:eastAsia="Times New Roman" w:hAnsi="Times New Roman" w:cs="Times New Roman"/>
-        </w:rPr>
-        <w:t xml:space="preserve">, </w:t>
-      </w:r>
-      <w:r>
-        <w:rPr>
-          <w:rFonts w:ascii="Times New Roman" w:eastAsia="Times New Roman" w:hAnsi="Times New Roman" w:cs="Times New Roman"/>
-          <w:i/>
-          <w:iCs/>
-        </w:rPr>
-        <w:t>298</w:t>
-      </w:r>
-      <w:r>
-        <w:rPr>
-          <w:rFonts w:ascii="Times New Roman" w:eastAsia="Times New Roman" w:hAnsi="Times New Roman" w:cs="Times New Roman"/>
-        </w:rPr>
-        <w:t>(19), 2296–2304.</w:t>
-      </w:r>
       <w:hyperlink r:id="rId38">
-        <w:r>
-          <w:rPr>
-            <w:rFonts w:ascii="Times New Roman" w:eastAsia="Times New Roman" w:hAnsi="Times New Roman" w:cs="Times New Roman"/>
-          </w:rPr>
-          <w:t xml:space="preserve"> </w:t>
-        </w:r>
-      </w:hyperlink>
-      <w:hyperlink r:id="rId39">
         <w:r>
           <w:rPr>
             <w:rFonts w:ascii="Times New Roman" w:eastAsia="Times New Roman" w:hAnsi="Times New Roman" w:cs="Times New Roman"/>
@@ -8912,7 +9531,7 @@
         </w:rPr>
         <w:t xml:space="preserve">, 101874. </w:t>
       </w:r>
-      <w:hyperlink r:id="rId40">
+      <w:hyperlink r:id="rId39">
         <w:r>
           <w:rPr>
             <w:rFonts w:ascii="Times New Roman" w:eastAsia="Times New Roman" w:hAnsi="Times New Roman" w:cs="Times New Roman"/>
@@ -8974,7 +9593,7 @@
         </w:rPr>
         <w:t>(6), 2752–2761.</w:t>
       </w:r>
-      <w:hyperlink r:id="rId41">
+      <w:hyperlink r:id="rId40">
         <w:r>
           <w:rPr>
             <w:rFonts w:ascii="Times New Roman" w:eastAsia="Times New Roman" w:hAnsi="Times New Roman" w:cs="Times New Roman"/>
@@ -8982,7 +9601,7 @@
           <w:t xml:space="preserve"> </w:t>
         </w:r>
       </w:hyperlink>
-      <w:hyperlink r:id="rId42">
+      <w:hyperlink r:id="rId41">
         <w:r>
           <w:rPr>
             <w:rFonts w:ascii="Times New Roman" w:eastAsia="Times New Roman" w:hAnsi="Times New Roman" w:cs="Times New Roman"/>
@@ -9037,6 +9656,67 @@
         </w:rPr>
         <w:t>(1), 3–15.</w:t>
       </w:r>
+      <w:hyperlink r:id="rId42">
+        <w:r>
+          <w:rPr>
+            <w:rFonts w:ascii="Times New Roman" w:eastAsia="Times New Roman" w:hAnsi="Times New Roman" w:cs="Times New Roman"/>
+          </w:rPr>
+          <w:t xml:space="preserve"> </w:t>
+        </w:r>
+      </w:hyperlink>
+      <w:r>
+        <w:rPr>
+          <w:rFonts w:ascii="Times New Roman" w:eastAsia="Times New Roman" w:hAnsi="Times New Roman" w:cs="Times New Roman"/>
+          <w:color w:val="1155CC"/>
+          <w:u w:val="single"/>
+        </w:rPr>
+        <w:t>https://doi.org/10.1080/15534510500181459</w:t>
+      </w:r>
+    </w:p>
+    <w:p>
+      <w:pPr>
+        <w:spacing w:before="240" w:after="240"/>
+        <w:ind w:left="720" w:hanging="720"/>
+        <w:rPr>
+          <w:rFonts w:ascii="Times New Roman" w:eastAsia="Times New Roman" w:hAnsi="Times New Roman" w:cs="Times New Roman"/>
+          <w:color w:val="1155CC"/>
+          <w:u w:val="single"/>
+        </w:rPr>
+      </w:pPr>
+      <w:r>
+        <w:rPr>
+          <w:rFonts w:ascii="Times New Roman" w:eastAsia="Times New Roman" w:hAnsi="Times New Roman" w:cs="Times New Roman"/>
+        </w:rPr>
+        <w:t xml:space="preserve">Cialdini, R. B., Reno, R. R., &amp; Kallgren, C. A. (1990). A focus theory of normative conduct: Recycling the concept of norms to reduce littering in public places. </w:t>
+      </w:r>
+      <w:r>
+        <w:rPr>
+          <w:rFonts w:ascii="Times New Roman" w:eastAsia="Times New Roman" w:hAnsi="Times New Roman" w:cs="Times New Roman"/>
+          <w:i/>
+          <w:iCs/>
+        </w:rPr>
+        <w:t>Journal of Personality and Social Psychology</w:t>
+      </w:r>
+      <w:r>
+        <w:rPr>
+          <w:rFonts w:ascii="Times New Roman" w:eastAsia="Times New Roman" w:hAnsi="Times New Roman" w:cs="Times New Roman"/>
+        </w:rPr>
+        <w:t xml:space="preserve">, </w:t>
+      </w:r>
+      <w:r>
+        <w:rPr>
+          <w:rFonts w:ascii="Times New Roman" w:eastAsia="Times New Roman" w:hAnsi="Times New Roman" w:cs="Times New Roman"/>
+          <w:i/>
+          <w:iCs/>
+        </w:rPr>
+        <w:t>58</w:t>
+      </w:r>
+      <w:r>
+        <w:rPr>
+          <w:rFonts w:ascii="Times New Roman" w:eastAsia="Times New Roman" w:hAnsi="Times New Roman" w:cs="Times New Roman"/>
+        </w:rPr>
+        <w:t>(6), 1015–1026.</w:t>
+      </w:r>
       <w:hyperlink r:id="rId43">
         <w:r>
           <w:rPr>
@@ -9051,7 +9731,7 @@
           <w:color w:val="1155CC"/>
           <w:u w:val="single"/>
         </w:rPr>
-        <w:t>https://doi.org/10.1080/15534510500181459</w:t>
+        <w:t>https://doi.org/10.1037/0022-3514.58.6.1015</w:t>
       </w:r>
     </w:p>
     <w:p>
@@ -9060,76 +9740,15 @@
         <w:ind w:left="720" w:hanging="720"/>
         <w:rPr>
           <w:rFonts w:ascii="Times New Roman" w:eastAsia="Times New Roman" w:hAnsi="Times New Roman" w:cs="Times New Roman"/>
-          <w:color w:val="1155CC"/>
-          <w:u w:val="single"/>
-        </w:rPr>
-      </w:pPr>
-      <w:r>
-        <w:rPr>
-          <w:rFonts w:ascii="Times New Roman" w:eastAsia="Times New Roman" w:hAnsi="Times New Roman" w:cs="Times New Roman"/>
-        </w:rPr>
-        <w:t xml:space="preserve">Cialdini, R. B., Reno, R. R., &amp; Kallgren, C. A. (1990). A focus theory of normative conduct: Recycling the concept of norms to reduce littering in public places. </w:t>
-      </w:r>
-      <w:r>
-        <w:rPr>
-          <w:rFonts w:ascii="Times New Roman" w:eastAsia="Times New Roman" w:hAnsi="Times New Roman" w:cs="Times New Roman"/>
-          <w:i/>
-          <w:iCs/>
-        </w:rPr>
-        <w:t>Journal of Personality and Social Psychology</w:t>
-      </w:r>
-      <w:r>
-        <w:rPr>
-          <w:rFonts w:ascii="Times New Roman" w:eastAsia="Times New Roman" w:hAnsi="Times New Roman" w:cs="Times New Roman"/>
-        </w:rPr>
-        <w:t xml:space="preserve">, </w:t>
-      </w:r>
-      <w:r>
-        <w:rPr>
-          <w:rFonts w:ascii="Times New Roman" w:eastAsia="Times New Roman" w:hAnsi="Times New Roman" w:cs="Times New Roman"/>
-          <w:i/>
-          <w:iCs/>
-        </w:rPr>
-        <w:t>58</w:t>
-      </w:r>
-      <w:r>
-        <w:rPr>
-          <w:rFonts w:ascii="Times New Roman" w:eastAsia="Times New Roman" w:hAnsi="Times New Roman" w:cs="Times New Roman"/>
-        </w:rPr>
-        <w:t>(6), 1015–1026.</w:t>
+        </w:rPr>
+      </w:pPr>
+      <w:r>
+        <w:rPr>
+          <w:rFonts w:ascii="Times New Roman" w:eastAsia="Times New Roman" w:hAnsi="Times New Roman" w:cs="Times New Roman"/>
+        </w:rPr>
+        <w:t xml:space="preserve">Civil Rights Act of 1964, Pub. L. No. 88-352, 78 Stat. 241 (1964). </w:t>
       </w:r>
       <w:hyperlink r:id="rId44">
-        <w:r>
-          <w:rPr>
-            <w:rFonts w:ascii="Times New Roman" w:eastAsia="Times New Roman" w:hAnsi="Times New Roman" w:cs="Times New Roman"/>
-          </w:rPr>
-          <w:t xml:space="preserve"> </w:t>
-        </w:r>
-      </w:hyperlink>
-      <w:r>
-        <w:rPr>
-          <w:rFonts w:ascii="Times New Roman" w:eastAsia="Times New Roman" w:hAnsi="Times New Roman" w:cs="Times New Roman"/>
-          <w:color w:val="1155CC"/>
-          <w:u w:val="single"/>
-        </w:rPr>
-        <w:t>https://doi.org/10.1037/0022-3514.58.6.1015</w:t>
-      </w:r>
-    </w:p>
-    <w:p>
-      <w:pPr>
-        <w:spacing w:before="240" w:after="240"/>
-        <w:ind w:left="720" w:hanging="720"/>
-        <w:rPr>
-          <w:rFonts w:ascii="Times New Roman" w:eastAsia="Times New Roman" w:hAnsi="Times New Roman" w:cs="Times New Roman"/>
-        </w:rPr>
-      </w:pPr>
-      <w:r>
-        <w:rPr>
-          <w:rFonts w:ascii="Times New Roman" w:eastAsia="Times New Roman" w:hAnsi="Times New Roman" w:cs="Times New Roman"/>
-        </w:rPr>
-        <w:t xml:space="preserve">Civil Rights Act of 1964, Pub. L. No. 88-352, 78 Stat. 241 (1964). </w:t>
-      </w:r>
-      <w:hyperlink r:id="rId45">
         <w:r>
           <w:rPr>
             <w:rFonts w:ascii="Times New Roman" w:eastAsia="Times New Roman" w:hAnsi="Times New Roman" w:cs="Times New Roman"/>
@@ -9176,7 +9795,7 @@
         </w:rPr>
         <w:t xml:space="preserve"> (3rd ed.). Routledge.</w:t>
       </w:r>
-      <w:hyperlink r:id="rId46">
+      <w:hyperlink r:id="rId45">
         <w:r>
           <w:rPr>
             <w:rFonts w:ascii="Times New Roman" w:eastAsia="Times New Roman" w:hAnsi="Times New Roman" w:cs="Times New Roman"/>
@@ -9184,7 +9803,7 @@
           <w:t xml:space="preserve"> </w:t>
         </w:r>
       </w:hyperlink>
-      <w:hyperlink r:id="rId47">
+      <w:hyperlink r:id="rId46">
         <w:r>
           <w:rPr>
             <w:rFonts w:ascii="Times New Roman" w:eastAsia="Times New Roman" w:hAnsi="Times New Roman" w:cs="Times New Roman"/>
@@ -9239,7 +9858,7 @@
         </w:rPr>
         <w:t>(3), 386–400.</w:t>
       </w:r>
-      <w:hyperlink r:id="rId48">
+      <w:hyperlink r:id="rId47">
         <w:r>
           <w:rPr>
             <w:rFonts w:ascii="Times New Roman" w:eastAsia="Times New Roman" w:hAnsi="Times New Roman" w:cs="Times New Roman"/>
@@ -9278,7 +9897,7 @@
         </w:rPr>
         <w:t xml:space="preserve">, L 180, 22–26. </w:t>
       </w:r>
-      <w:hyperlink r:id="rId49">
+      <w:hyperlink r:id="rId48">
         <w:r>
           <w:rPr>
             <w:rFonts w:ascii="Times New Roman" w:eastAsia="Times New Roman" w:hAnsi="Times New Roman" w:cs="Times New Roman"/>
@@ -9337,7 +9956,7 @@
         </w:rPr>
         <w:t>(3), 414–446.</w:t>
       </w:r>
-      <w:hyperlink r:id="rId50">
+      <w:hyperlink r:id="rId49">
         <w:r>
           <w:rPr>
             <w:rFonts w:ascii="Times New Roman" w:eastAsia="Times New Roman" w:hAnsi="Times New Roman" w:cs="Times New Roman"/>
@@ -9345,7 +9964,7 @@
           <w:t xml:space="preserve"> </w:t>
         </w:r>
       </w:hyperlink>
-      <w:hyperlink r:id="rId51">
+      <w:hyperlink r:id="rId50">
         <w:r>
           <w:rPr>
             <w:rFonts w:ascii="Times New Roman" w:eastAsia="Times New Roman" w:hAnsi="Times New Roman" w:cs="Times New Roman"/>
@@ -9377,7 +9996,21 @@
           <w:rFonts w:ascii="Times New Roman" w:eastAsia="Times New Roman" w:hAnsi="Times New Roman" w:cs="Times New Roman"/>
         </w:rPr>
         <w:lastRenderedPageBreak/>
-        <w:t xml:space="preserve">Dobbin, F., &amp; Kalev, A. (2016). Why diversity programs fail. </w:t>
+        <w:t xml:space="preserve">Dobbin, F., &amp; Kalev, A. (2016). Why diversity programs </w:t>
+      </w:r>
+      <w:proofErr w:type="gramStart"/>
+      <w:r>
+        <w:rPr>
+          <w:rFonts w:ascii="Times New Roman" w:eastAsia="Times New Roman" w:hAnsi="Times New Roman" w:cs="Times New Roman"/>
+        </w:rPr>
+        <w:t>fail</w:t>
+      </w:r>
+      <w:proofErr w:type="gramEnd"/>
+      <w:r>
+        <w:rPr>
+          <w:rFonts w:ascii="Times New Roman" w:eastAsia="Times New Roman" w:hAnsi="Times New Roman" w:cs="Times New Roman"/>
+        </w:rPr>
+        <w:t xml:space="preserve">. </w:t>
       </w:r>
       <w:r>
         <w:rPr>
@@ -9438,7 +10071,7 @@
         </w:rPr>
         <w:t xml:space="preserve"> (Vol. 36, pp. 1–52). Academic Press.</w:t>
       </w:r>
-      <w:hyperlink r:id="rId52">
+      <w:hyperlink r:id="rId51">
         <w:r>
           <w:rPr>
             <w:rFonts w:ascii="Times New Roman" w:eastAsia="Times New Roman" w:hAnsi="Times New Roman" w:cs="Times New Roman"/>
@@ -9446,7 +10079,7 @@
           <w:t xml:space="preserve"> </w:t>
         </w:r>
       </w:hyperlink>
-      <w:hyperlink r:id="rId53">
+      <w:hyperlink r:id="rId52">
         <w:r>
           <w:rPr>
             <w:rFonts w:ascii="Times New Roman" w:eastAsia="Times New Roman" w:hAnsi="Times New Roman" w:cs="Times New Roman"/>
@@ -9487,7 +10120,7 @@
         </w:rPr>
         <w:t>. CNN.</w:t>
       </w:r>
-      <w:hyperlink r:id="rId54">
+      <w:hyperlink r:id="rId53">
         <w:r>
           <w:rPr>
             <w:rFonts w:ascii="Times New Roman" w:eastAsia="Times New Roman" w:hAnsi="Times New Roman" w:cs="Times New Roman"/>
@@ -9495,7 +10128,7 @@
           <w:t xml:space="preserve"> </w:t>
         </w:r>
       </w:hyperlink>
-      <w:hyperlink r:id="rId55">
+      <w:hyperlink r:id="rId54">
         <w:r>
           <w:rPr>
             <w:rFonts w:ascii="Times New Roman" w:eastAsia="Times New Roman" w:hAnsi="Times New Roman" w:cs="Times New Roman"/>
@@ -9580,7 +10213,7 @@
         </w:rPr>
         <w:t>, 75–109.</w:t>
       </w:r>
-      <w:hyperlink r:id="rId56">
+      <w:hyperlink r:id="rId55">
         <w:r>
           <w:rPr>
             <w:rFonts w:ascii="Times New Roman" w:eastAsia="Times New Roman" w:hAnsi="Times New Roman" w:cs="Times New Roman"/>
@@ -9627,7 +10260,7 @@
         </w:rPr>
         <w:t>. American Economic Review.</w:t>
       </w:r>
-      <w:hyperlink r:id="rId57">
+      <w:hyperlink r:id="rId56">
         <w:r>
           <w:rPr>
             <w:rFonts w:ascii="Times New Roman" w:eastAsia="Times New Roman" w:hAnsi="Times New Roman" w:cs="Times New Roman"/>
@@ -9666,7 +10299,7 @@
         </w:rPr>
         <w:t xml:space="preserve">. Sage Publications. </w:t>
       </w:r>
-      <w:hyperlink r:id="rId58">
+      <w:hyperlink r:id="rId57">
         <w:r>
           <w:rPr>
             <w:rFonts w:ascii="Times New Roman" w:eastAsia="Times New Roman" w:hAnsi="Times New Roman" w:cs="Times New Roman"/>
@@ -9687,9 +10320,6 @@
       <w:pPr>
         <w:spacing w:before="240" w:after="240"/>
         <w:ind w:left="720" w:hanging="720"/>
-        <w:rPr>
-          <w:rFonts w:ascii="Times New Roman" w:eastAsia="Times New Roman" w:hAnsi="Times New Roman" w:cs="Times New Roman"/>
-        </w:rPr>
       </w:pPr>
       <w:r>
         <w:rPr>
@@ -9711,7 +10341,7 @@
         </w:rPr>
         <w:t>.</w:t>
       </w:r>
-      <w:hyperlink r:id="rId59">
+      <w:hyperlink r:id="rId58">
         <w:r>
           <w:rPr>
             <w:rFonts w:ascii="Times New Roman" w:eastAsia="Times New Roman" w:hAnsi="Times New Roman" w:cs="Times New Roman"/>
@@ -9719,6 +10349,44 @@
             <w:u w:val="single"/>
           </w:rPr>
           <w:t xml:space="preserve"> https://www.poynter.org/reporting-editing/2021/new-tool-allows-npr-to-track-source-diversity-in-real-time/</w:t>
+        </w:r>
+      </w:hyperlink>
+    </w:p>
+    <w:p>
+      <w:pPr>
+        <w:spacing w:before="240" w:after="240"/>
+        <w:ind w:left="720" w:hanging="720"/>
+        <w:rPr>
+          <w:rFonts w:ascii="Times New Roman" w:eastAsia="Times New Roman" w:hAnsi="Times New Roman" w:cs="Times New Roman"/>
+        </w:rPr>
+      </w:pPr>
+      <w:r>
+        <w:rPr>
+          <w:rFonts w:ascii="Times New Roman" w:eastAsia="Times New Roman" w:hAnsi="Times New Roman" w:cs="Times New Roman"/>
+        </w:rPr>
+        <w:t xml:space="preserve">Goh, J. X., Hall, J. A., &amp; Rosenthal, R. (2016). Mini meta-analysis of your own studies: Some arguments on why and a primer on how. </w:t>
+      </w:r>
+      <w:r>
+        <w:rPr>
+          <w:rFonts w:ascii="Times New Roman" w:eastAsia="Times New Roman" w:hAnsi="Times New Roman" w:cs="Times New Roman"/>
+          <w:i/>
+          <w:iCs/>
+        </w:rPr>
+        <w:t>Social and Personality Psychology Compass, 10</w:t>
+      </w:r>
+      <w:r>
+        <w:rPr>
+          <w:rFonts w:ascii="Times New Roman" w:eastAsia="Times New Roman" w:hAnsi="Times New Roman" w:cs="Times New Roman"/>
+        </w:rPr>
+        <w:t xml:space="preserve">(10), 535–549. </w:t>
+      </w:r>
+      <w:hyperlink r:id="rId59" w:history="1">
+        <w:r>
+          <w:rPr>
+            <w:rStyle w:val="Hyperlink"/>
+            <w:rFonts w:ascii="Times New Roman" w:eastAsia="Times New Roman" w:hAnsi="Times New Roman" w:cs="Times New Roman"/>
+          </w:rPr>
+          <w:t>https://doi.org/10.1111/spc3.12267</w:t>
         </w:r>
       </w:hyperlink>
     </w:p>
@@ -9970,6 +10638,7 @@
         <w:rPr>
           <w:rFonts w:ascii="Times New Roman" w:eastAsia="Times New Roman" w:hAnsi="Times New Roman" w:cs="Times New Roman"/>
         </w:rPr>
+        <w:lastRenderedPageBreak/>
         <w:t xml:space="preserve">He, J. C., Kang, S. K., &amp; Lacetera, N. (2021). Opt-out choice framing attenuates gender differences in the decision to compete in the laboratory and in the field. </w:t>
       </w:r>
       <w:r>
@@ -10029,7 +10698,6 @@
         <w:rPr>
           <w:rFonts w:ascii="Times New Roman" w:eastAsia="Times New Roman" w:hAnsi="Times New Roman" w:cs="Times New Roman"/>
         </w:rPr>
-        <w:lastRenderedPageBreak/>
         <w:t xml:space="preserve">Heaton, R. (2025, April 14). What companies are rolling back DEI policies in 2025? </w:t>
       </w:r>
       <w:r>
@@ -10625,6 +11293,7 @@
         <w:rPr>
           <w:rFonts w:ascii="Times New Roman" w:eastAsia="Times New Roman" w:hAnsi="Times New Roman" w:cs="Times New Roman"/>
         </w:rPr>
+        <w:lastRenderedPageBreak/>
         <w:t xml:space="preserve">Kristal, A. S., Nicks, L., Gloor, J. L., &amp; Hauser, O. P. (2023). Reducing discrimination against job seekers with and without employment gaps. </w:t>
       </w:r>
       <w:r>
@@ -10687,14 +11356,7 @@
         <w:rPr>
           <w:rFonts w:ascii="Times New Roman" w:eastAsia="Times New Roman" w:hAnsi="Times New Roman" w:cs="Times New Roman"/>
         </w:rPr>
-        <w:t xml:space="preserve">Larimer, M. E., Graupensperger, S., Lewis, M. A., Cronce, J. M., Kilmer, J. R., Atkins, D. C., Lee, C. M., &amp; Neighbors, C. (2023). Injunctive and descriptive normative feedback for college drinking </w:t>
-      </w:r>
-      <w:r>
-        <w:rPr>
-          <w:rFonts w:ascii="Times New Roman" w:eastAsia="Times New Roman" w:hAnsi="Times New Roman" w:cs="Times New Roman"/>
-        </w:rPr>
-        <w:lastRenderedPageBreak/>
-        <w:t xml:space="preserve">prevention: Is the whole greater than the sum of its parts? </w:t>
+        <w:t xml:space="preserve">Larimer, M. E., Graupensperger, S., Lewis, M. A., Cronce, J. M., Kilmer, J. R., Atkins, D. C., Lee, C. M., &amp; Neighbors, C. (2023). Injunctive and descriptive normative feedback for college drinking prevention: Is the whole greater than the sum of its parts? </w:t>
       </w:r>
       <w:r>
         <w:rPr>
@@ -11107,7 +11769,21 @@
         <w:rPr>
           <w:rFonts w:ascii="Times New Roman" w:eastAsia="Times New Roman" w:hAnsi="Times New Roman" w:cs="Times New Roman"/>
         </w:rPr>
-        <w:t xml:space="preserve">Orne, M. T. (1962). On the social psychology of the psychological experiment: With particular reference to demand characteristics and their implications. </w:t>
+        <w:t xml:space="preserve">Orne, M. T. (1962). On the social psychology of the psychological experiment: With </w:t>
+      </w:r>
+      <w:proofErr w:type="gramStart"/>
+      <w:r>
+        <w:rPr>
+          <w:rFonts w:ascii="Times New Roman" w:eastAsia="Times New Roman" w:hAnsi="Times New Roman" w:cs="Times New Roman"/>
+        </w:rPr>
+        <w:t>particular reference</w:t>
+      </w:r>
+      <w:proofErr w:type="gramEnd"/>
+      <w:r>
+        <w:rPr>
+          <w:rFonts w:ascii="Times New Roman" w:eastAsia="Times New Roman" w:hAnsi="Times New Roman" w:cs="Times New Roman"/>
+        </w:rPr>
+        <w:t xml:space="preserve"> to demand characteristics and their implications. </w:t>
       </w:r>
       <w:r>
         <w:rPr>
@@ -11337,6 +12013,7 @@
         <w:rPr>
           <w:rFonts w:ascii="Times New Roman" w:eastAsia="Times New Roman" w:hAnsi="Times New Roman" w:cs="Times New Roman"/>
         </w:rPr>
+        <w:lastRenderedPageBreak/>
         <w:t xml:space="preserve">Porter, C., &amp; Serra, D. (2020). Gender differences in the choice of major: The importance of female role models. </w:t>
       </w:r>
       <w:r>
@@ -11400,7 +12077,6 @@
         <w:rPr>
           <w:rFonts w:ascii="Times New Roman" w:eastAsia="Times New Roman" w:hAnsi="Times New Roman" w:cs="Times New Roman"/>
         </w:rPr>
-        <w:lastRenderedPageBreak/>
         <w:t xml:space="preserve">Preston, M. C., &amp; Carton, A. M. (2024). Echoes from the past: The impact of racial transference on leader selection during succession. </w:t>
       </w:r>
       <w:r>
@@ -11741,7 +12417,21 @@
         <w:rPr>
           <w:rFonts w:ascii="Times New Roman" w:eastAsia="Times New Roman" w:hAnsi="Times New Roman" w:cs="Times New Roman"/>
         </w:rPr>
-        <w:t xml:space="preserve">Samdal, G. B., Eide, G. E., Barth, T., Williams, G., &amp; Meland, E. (2017). Effective behaviour change techniques for physical activity and healthy eating in overweight and obese adults: Systematic review and meta-regression analyses. </w:t>
+        <w:t xml:space="preserve">Samdal, G. B., Eide, G. E., Barth, T., Williams, G., &amp; Meland, E. (2017). Effective behaviour </w:t>
+      </w:r>
+      <w:proofErr w:type="gramStart"/>
+      <w:r>
+        <w:rPr>
+          <w:rFonts w:ascii="Times New Roman" w:eastAsia="Times New Roman" w:hAnsi="Times New Roman" w:cs="Times New Roman"/>
+        </w:rPr>
+        <w:t>change</w:t>
+      </w:r>
+      <w:proofErr w:type="gramEnd"/>
+      <w:r>
+        <w:rPr>
+          <w:rFonts w:ascii="Times New Roman" w:eastAsia="Times New Roman" w:hAnsi="Times New Roman" w:cs="Times New Roman"/>
+        </w:rPr>
+        <w:t xml:space="preserve"> techniques for physical activity and healthy eating in overweight and obese adults: Systematic review and meta-regression analyses. </w:t>
       </w:r>
       <w:r>
         <w:rPr>
@@ -11804,7 +12494,21 @@
         <w:rPr>
           <w:rFonts w:ascii="Times New Roman" w:eastAsia="Times New Roman" w:hAnsi="Times New Roman" w:cs="Times New Roman"/>
         </w:rPr>
-        <w:t xml:space="preserve">Schembre, S. M., Liao, Y., O’Connor, S. G., Hingle, M. D., Shen, S.-E., Hamann, A. K., ... &amp; Dunton, G. F. (2018). Just-in-time feedback in diet and physical activity interventions: Systematic review and practical design considerations. </w:t>
+        <w:t xml:space="preserve">Schembre, S. M., Liao, Y., O’Connor, S. G., Hingle, M. D., Shen, S.-E., Hamann, A. K., ... &amp; Dunton, G. F. (2018). Just-in-time feedback </w:t>
+      </w:r>
+      <w:proofErr w:type="gramStart"/>
+      <w:r>
+        <w:rPr>
+          <w:rFonts w:ascii="Times New Roman" w:eastAsia="Times New Roman" w:hAnsi="Times New Roman" w:cs="Times New Roman"/>
+        </w:rPr>
+        <w:t>in</w:t>
+      </w:r>
+      <w:proofErr w:type="gramEnd"/>
+      <w:r>
+        <w:rPr>
+          <w:rFonts w:ascii="Times New Roman" w:eastAsia="Times New Roman" w:hAnsi="Times New Roman" w:cs="Times New Roman"/>
+        </w:rPr>
+        <w:t xml:space="preserve"> diet and physical activity interventions: Systematic review and practical design considerations. </w:t>
       </w:r>
       <w:r>
         <w:rPr>
@@ -11991,6 +12695,7 @@
         <w:rPr>
           <w:rFonts w:ascii="Times New Roman" w:eastAsia="Times New Roman" w:hAnsi="Times New Roman" w:cs="Times New Roman"/>
         </w:rPr>
+        <w:lastRenderedPageBreak/>
         <w:t xml:space="preserve">Sher, S., &amp; McKenzie, C. R. M. (2006). Information leakage from logically equivalent frames. </w:t>
       </w:r>
       <w:r>
@@ -12095,7 +12800,6 @@
         <w:rPr>
           <w:rFonts w:ascii="Times New Roman" w:eastAsia="Times New Roman" w:hAnsi="Times New Roman" w:cs="Times New Roman"/>
         </w:rPr>
-        <w:lastRenderedPageBreak/>
         <w:t xml:space="preserve">Simonson, I. (1990). The effect of purchase quantity and timing on variety-seeking behavior. </w:t>
       </w:r>
       <w:r>
@@ -12455,8 +13159,8 @@
           <w:rFonts w:ascii="Times New Roman" w:eastAsia="Times New Roman" w:hAnsi="Times New Roman" w:cs="Times New Roman"/>
         </w:rPr>
       </w:pPr>
-      <w:bookmarkStart w:id="32" w:name="_kp497mobu8xj" w:colFirst="0" w:colLast="0"/>
-      <w:bookmarkEnd w:id="32"/>
+      <w:bookmarkStart w:id="30" w:name="_kp497mobu8xj" w:colFirst="0" w:colLast="0"/>
+      <w:bookmarkEnd w:id="30"/>
       <w:r>
         <w:rPr>
           <w:rFonts w:ascii="Times New Roman" w:eastAsia="Times New Roman" w:hAnsi="Times New Roman" w:cs="Times New Roman"/>
@@ -14428,13 +15132,23 @@
                 <w:szCs w:val="16"/>
               </w:rPr>
             </w:pPr>
+            <w:proofErr w:type="gramStart"/>
             <w:r>
               <w:rPr>
                 <w:rFonts w:ascii="Times New Roman" w:eastAsia="Times New Roman" w:hAnsi="Times New Roman" w:cs="Times New Roman"/>
                 <w:sz w:val="16"/>
                 <w:szCs w:val="16"/>
               </w:rPr>
-              <w:t>Wrote More than 10 books</w:t>
+              <w:t>Wrote</w:t>
+            </w:r>
+            <w:proofErr w:type="gramEnd"/>
+            <w:r>
+              <w:rPr>
+                <w:rFonts w:ascii="Times New Roman" w:eastAsia="Times New Roman" w:hAnsi="Times New Roman" w:cs="Times New Roman"/>
+                <w:sz w:val="16"/>
+                <w:szCs w:val="16"/>
+              </w:rPr>
+              <w:t xml:space="preserve"> More than 10 books</w:t>
             </w:r>
           </w:p>
           <w:p>
@@ -15265,7 +15979,23 @@
                 <w:sz w:val="16"/>
                 <w:szCs w:val="16"/>
               </w:rPr>
-              <w:t>The effect of feedback about the % of women selected previously was moderated by the fraction of women in the candidate pool. When women were underrepresented among candidates, gender feedback increased the selection of women; when women were overrepresented, the effect was significantly smaller in magnitude and reversed direction (decreasing selection of women), and was driven by fairness concerns rather than concerns about prejudice.</w:t>
+              <w:t>The effect of feedback about the % of women selected previously was moderated by the fraction of women in the candidate pool. When women were underrepresented among candidates, gender feedback increased the selection of women; when women were overrepresented, the effect was significantly smaller in magnitude and reversed direction (decreasing selection of women</w:t>
+            </w:r>
+            <w:r>
+              <w:rPr>
+                <w:rFonts w:ascii="Times New Roman" w:eastAsia="Times New Roman" w:hAnsi="Times New Roman" w:cs="Times New Roman"/>
+                <w:sz w:val="16"/>
+                <w:szCs w:val="16"/>
+              </w:rPr>
+              <w:t>) and</w:t>
+            </w:r>
+            <w:r>
+              <w:rPr>
+                <w:rFonts w:ascii="Times New Roman" w:eastAsia="Times New Roman" w:hAnsi="Times New Roman" w:cs="Times New Roman"/>
+                <w:sz w:val="16"/>
+                <w:szCs w:val="16"/>
+              </w:rPr>
+              <w:t xml:space="preserve"> was driven by fairness concerns rather than concerns about prejudice.</w:t>
             </w:r>
           </w:p>
         </w:tc>
@@ -15340,7 +16070,7 @@
     <w:p>
       <w:pPr>
         <w:widowControl w:val="0"/>
-        <w:spacing w:after="240" w:line="240" w:lineRule="auto"/>
+        <w:spacing w:line="240" w:lineRule="auto"/>
         <w:rPr>
           <w:rFonts w:ascii="Times New Roman" w:eastAsia="Times New Roman" w:hAnsi="Times New Roman" w:cs="Times New Roman"/>
           <w:sz w:val="8"/>
@@ -19616,17 +20346,15 @@
           <w:sz w:val="18"/>
           <w:szCs w:val="18"/>
         </w:rPr>
-        <w:t>: This table reports the results of eight ordinary least squares (OLS) regressions that predict whether the proportion of experts a participant selected in Study 1 after receiving feedback on prior selections had a given attribute (e.g., were under 50 years old). Model 1 predicts the proportion of experts selected who were women with an indicator for receiving feedback on the % of the original ten experts selected who were women. Model 2 predicts the proportion of experts under 50 selected with an indicator for receiving feedback on the % of the original experts selected who were under 50 years old. Model 3 predicts the proportion of experts based on the West Coast of the U.S. selected with an indicator for receiving feedback on the % of the original experts selected who were based on the West Coast of the U.S.. Model 4 predicts the proportion of experts selected who worked at a university with an indicator for receiving feedback on the % of the original experts selected who worked at a university. Models 5-8 were used to construct a simultaneous system of equations. All of these models include the following indicators as predictors: indicators for receiving feedback on the % of the original experts selected who (1) were women, (2) were under 50 years old, (3) were based on the West Coast of the U.S., and (4) worked at a university. Model 5 predicts the proportion of women selected. Model 6 predicts the proportion of experts under 50 selected. Model 7 predicts the proportion of experts based on the West Coast selected. Model 8 predicts the proportion of experts working at a university selected. Models 5-8 had the constant suppressed to prevent collinearity. Standard errors reported in parentheses are estimated robustly using HC3 and are clustered by participant in Models 5-8.  +</w:t>
-      </w:r>
-      <w:r>
-        <w:rPr>
-          <w:rFonts w:ascii="Times New Roman" w:eastAsia="Times New Roman" w:hAnsi="Times New Roman" w:cs="Times New Roman"/>
-          <w:i/>
-          <w:iCs/>
+        <w:t xml:space="preserve">: This table reports the results of eight ordinary least squares (OLS) regressions that predict whether the proportion of experts a participant selected in Study 1 after receiving feedback on prior selections had a given attribute (e.g., were under 50 years old). Model 1 predicts the proportion of experts selected who were women with an indicator for receiving feedback on the % of the original ten experts selected who were women. Model 2 predicts the proportion of experts under 50 selected with an indicator for receiving feedback on the % of the original experts selected who were under 50 years old. Model 3 predicts the proportion of experts based on the West Coast of the U.S. selected with an indicator for receiving feedback on the % of the original experts selected who were based on the West Coast of the </w:t>
+      </w:r>
+      <w:r>
+        <w:rPr>
+          <w:rFonts w:ascii="Times New Roman" w:eastAsia="Times New Roman" w:hAnsi="Times New Roman" w:cs="Times New Roman"/>
           <w:sz w:val="18"/>
           <w:szCs w:val="18"/>
         </w:rPr>
-        <w:t>p</w:t>
+        <w:t>U.S.</w:t>
       </w:r>
       <w:r>
         <w:rPr>
@@ -19634,43 +20362,115 @@
           <w:sz w:val="18"/>
           <w:szCs w:val="18"/>
         </w:rPr>
-        <w:t>&lt;0.1;*</w:t>
-      </w:r>
-      <w:r>
-        <w:rPr>
-          <w:rFonts w:ascii="Times New Roman" w:eastAsia="Times New Roman" w:hAnsi="Times New Roman" w:cs="Times New Roman"/>
-          <w:i/>
-          <w:iCs/>
+        <w:t xml:space="preserve"> Model 4 predicts the proportion of experts selected who worked at a university with an indicator for receiving feedback on the % of the original experts selected who worked at a university. Models 5-8 were used to construct a simultaneous system of equations. All of these models include the following indicators as predictors: indicators for receiving feedback on the % of the original experts selected who (1) were women, (2) were under 50 years old, (3) were based on the West Coast of the U.S., and (4) worked at a university. Model 5 predicts the proportion of women selected. Model 6 predicts the proportion of experts under 50 selected. Model 7 predicts the proportion of experts based on the West Coast selected. Model 8 predicts the proportion of experts working at a university selected. Models 5-8 had the constant </w:t>
+      </w:r>
+      <w:proofErr w:type="gramStart"/>
+      <w:r>
+        <w:rPr>
+          <w:rFonts w:ascii="Times New Roman" w:eastAsia="Times New Roman" w:hAnsi="Times New Roman" w:cs="Times New Roman"/>
           <w:sz w:val="18"/>
           <w:szCs w:val="18"/>
         </w:rPr>
-        <w:t>p</w:t>
-      </w:r>
+        <w:t>suppressed</w:t>
+      </w:r>
+      <w:proofErr w:type="gramEnd"/>
       <w:r>
         <w:rPr>
           <w:rFonts w:ascii="Times New Roman" w:eastAsia="Times New Roman" w:hAnsi="Times New Roman" w:cs="Times New Roman"/>
           <w:sz w:val="18"/>
           <w:szCs w:val="18"/>
         </w:rPr>
-        <w:t>&lt;0.05;**</w:t>
-      </w:r>
-      <w:r>
-        <w:rPr>
-          <w:rFonts w:ascii="Times New Roman" w:eastAsia="Times New Roman" w:hAnsi="Times New Roman" w:cs="Times New Roman"/>
-          <w:i/>
-          <w:iCs/>
+        <w:t xml:space="preserve"> to prevent collinearity. Standard errors reported in parentheses and are clustered by </w:t>
+      </w:r>
+      <w:proofErr w:type="gramStart"/>
+      <w:r>
+        <w:rPr>
+          <w:rFonts w:ascii="Times New Roman" w:eastAsia="Times New Roman" w:hAnsi="Times New Roman" w:cs="Times New Roman"/>
           <w:sz w:val="18"/>
           <w:szCs w:val="18"/>
         </w:rPr>
-        <w:t>p</w:t>
-      </w:r>
+        <w:t>participant</w:t>
+      </w:r>
+      <w:proofErr w:type="gramEnd"/>
       <w:r>
         <w:rPr>
           <w:rFonts w:ascii="Times New Roman" w:eastAsia="Times New Roman" w:hAnsi="Times New Roman" w:cs="Times New Roman"/>
           <w:sz w:val="18"/>
           <w:szCs w:val="18"/>
         </w:rPr>
-        <w:t>&lt;0.01;***</w:t>
+        <w:t xml:space="preserve"> in Models 5-8.  +</w:t>
+      </w:r>
+      <w:r>
+        <w:rPr>
+          <w:rFonts w:ascii="Times New Roman" w:eastAsia="Times New Roman" w:hAnsi="Times New Roman" w:cs="Times New Roman"/>
+          <w:i/>
+          <w:iCs/>
+          <w:sz w:val="18"/>
+          <w:szCs w:val="18"/>
+        </w:rPr>
+        <w:t>p</w:t>
+      </w:r>
+      <w:r>
+        <w:rPr>
+          <w:rFonts w:ascii="Times New Roman" w:eastAsia="Times New Roman" w:hAnsi="Times New Roman" w:cs="Times New Roman"/>
+          <w:sz w:val="18"/>
+          <w:szCs w:val="18"/>
+        </w:rPr>
+        <w:t>&lt;0.1;*</w:t>
+      </w:r>
+      <w:r>
+        <w:rPr>
+          <w:rFonts w:ascii="Times New Roman" w:eastAsia="Times New Roman" w:hAnsi="Times New Roman" w:cs="Times New Roman"/>
+          <w:i/>
+          <w:iCs/>
+          <w:sz w:val="18"/>
+          <w:szCs w:val="18"/>
+        </w:rPr>
+        <w:t>p</w:t>
+      </w:r>
+      <w:r>
+        <w:rPr>
+          <w:rFonts w:ascii="Times New Roman" w:eastAsia="Times New Roman" w:hAnsi="Times New Roman" w:cs="Times New Roman"/>
+          <w:sz w:val="18"/>
+          <w:szCs w:val="18"/>
+        </w:rPr>
+        <w:t>&lt;0.05;**</w:t>
+      </w:r>
+      <w:r>
+        <w:rPr>
+          <w:rFonts w:ascii="Times New Roman" w:eastAsia="Times New Roman" w:hAnsi="Times New Roman" w:cs="Times New Roman"/>
+          <w:i/>
+          <w:iCs/>
+          <w:sz w:val="18"/>
+          <w:szCs w:val="18"/>
+        </w:rPr>
+        <w:t>p</w:t>
+      </w:r>
+      <w:r>
+        <w:rPr>
+          <w:rFonts w:ascii="Times New Roman" w:eastAsia="Times New Roman" w:hAnsi="Times New Roman" w:cs="Times New Roman"/>
+          <w:sz w:val="18"/>
+          <w:szCs w:val="18"/>
+        </w:rPr>
+        <w:t>&lt;</w:t>
+      </w:r>
+      <w:proofErr w:type="gramStart"/>
+      <w:r>
+        <w:rPr>
+          <w:rFonts w:ascii="Times New Roman" w:eastAsia="Times New Roman" w:hAnsi="Times New Roman" w:cs="Times New Roman"/>
+          <w:sz w:val="18"/>
+          <w:szCs w:val="18"/>
+        </w:rPr>
+        <w:t>0.01;*</w:t>
+      </w:r>
+      <w:proofErr w:type="gramEnd"/>
+      <w:r>
+        <w:rPr>
+          <w:rFonts w:ascii="Times New Roman" w:eastAsia="Times New Roman" w:hAnsi="Times New Roman" w:cs="Times New Roman"/>
+          <w:sz w:val="18"/>
+          <w:szCs w:val="18"/>
+        </w:rPr>
+        <w:t>**</w:t>
       </w:r>
       <w:r>
         <w:rPr>
@@ -19721,13 +20521,31 @@
           <w:sz w:val="24"/>
           <w:szCs w:val="24"/>
         </w:rPr>
-        <w:t xml:space="preserve"> Ordinary Least Squares (OLS) Regressions Predicting Attributes of the Final Biography Selected in Study 2 as a Function of the Pieces of Feedback Participants Were Randomly Assigned to Receive on Their Initially Selected Set of Six Biographies</w:t>
+        <w:t xml:space="preserve"> Ordinary Least Squares (OLS) Regressions Predicting Attributes of the Final Biography Selected in Study 2 as a Function of the Pieces of Feedback </w:t>
+      </w:r>
+      <w:proofErr w:type="gramStart"/>
+      <w:r>
+        <w:rPr>
+          <w:rFonts w:ascii="Times New Roman" w:eastAsia="Times New Roman" w:hAnsi="Times New Roman" w:cs="Times New Roman"/>
+          <w:sz w:val="24"/>
+          <w:szCs w:val="24"/>
+        </w:rPr>
+        <w:t>Participants</w:t>
+      </w:r>
+      <w:proofErr w:type="gramEnd"/>
+      <w:r>
+        <w:rPr>
+          <w:rFonts w:ascii="Times New Roman" w:eastAsia="Times New Roman" w:hAnsi="Times New Roman" w:cs="Times New Roman"/>
+          <w:sz w:val="24"/>
+          <w:szCs w:val="24"/>
+        </w:rPr>
+        <w:t xml:space="preserve"> Were Randomly Assigned to Receive on Their Initially Selected Set of Six Biographies</w:t>
       </w:r>
     </w:p>
     <w:p>
       <w:pPr>
         <w:widowControl w:val="0"/>
-        <w:spacing w:after="240" w:line="240" w:lineRule="auto"/>
+        <w:spacing w:line="240" w:lineRule="auto"/>
         <w:rPr>
           <w:rFonts w:ascii="Times New Roman" w:eastAsia="Times New Roman" w:hAnsi="Times New Roman" w:cs="Times New Roman"/>
           <w:sz w:val="8"/>
@@ -22028,7 +22846,15 @@
           <w:sz w:val="18"/>
           <w:szCs w:val="18"/>
         </w:rPr>
-        <w:t>&lt;0.1;*</w:t>
+        <w:t>&lt;</w:t>
+      </w:r>
+      <w:r>
+        <w:rPr>
+          <w:rFonts w:ascii="Times New Roman" w:eastAsia="Times New Roman" w:hAnsi="Times New Roman" w:cs="Times New Roman"/>
+          <w:sz w:val="18"/>
+          <w:szCs w:val="18"/>
+        </w:rPr>
+        <w:t>0.1; *</w:t>
       </w:r>
       <w:r>
         <w:rPr>
@@ -22120,6 +22946,9 @@
     <w:p>
       <w:pPr>
         <w:widowControl w:val="0"/>
+        <w:tabs>
+          <w:tab w:val="left" w:pos="9090"/>
+        </w:tabs>
         <w:spacing w:line="240" w:lineRule="auto"/>
         <w:ind w:left="-270"/>
         <w:jc w:val="both"/>
@@ -22152,29 +22981,29 @@
     <w:tbl>
       <w:tblPr>
         <w:tblStyle w:val="a2"/>
-        <w:tblW w:w="9540" w:type="dxa"/>
-        <w:tblInd w:w="0" w:type="dxa"/>
+        <w:tblW w:w="9900" w:type="dxa"/>
+        <w:tblInd w:w="-360" w:type="dxa"/>
         <w:tblLayout w:type="fixed"/>
         <w:tblLook w:val="0400" w:firstRow="0" w:lastRow="0" w:firstColumn="0" w:lastColumn="0" w:noHBand="0" w:noVBand="1"/>
       </w:tblPr>
       <w:tblGrid>
-        <w:gridCol w:w="3330"/>
-        <w:gridCol w:w="1145"/>
+        <w:gridCol w:w="3600"/>
+        <w:gridCol w:w="1055"/>
         <w:gridCol w:w="1144"/>
         <w:gridCol w:w="1180"/>
         <w:gridCol w:w="1144"/>
         <w:gridCol w:w="1327"/>
-        <w:gridCol w:w="270"/>
+        <w:gridCol w:w="450"/>
       </w:tblGrid>
       <w:tr>
         <w:trPr>
           <w:gridAfter w:val="1"/>
-          <w:wAfter w:w="270" w:type="dxa"/>
+          <w:wAfter w:w="450" w:type="dxa"/>
           <w:trHeight w:val="64"/>
         </w:trPr>
         <w:tc>
           <w:tcPr>
-            <w:tcW w:w="9270" w:type="dxa"/>
+            <w:tcW w:w="9450" w:type="dxa"/>
             <w:gridSpan w:val="6"/>
             <w:tcBorders>
               <w:top w:val="nil"/>
@@ -22186,6 +23015,9 @@
           </w:tcPr>
           <w:p>
             <w:pPr>
+              <w:tabs>
+                <w:tab w:val="left" w:pos="9090"/>
+              </w:tabs>
               <w:spacing w:line="240" w:lineRule="auto"/>
               <w:rPr>
                 <w:rFonts w:ascii="Times New Roman" w:eastAsia="Times New Roman" w:hAnsi="Times New Roman" w:cs="Times New Roman"/>
@@ -22199,12 +23031,12 @@
       <w:tr>
         <w:trPr>
           <w:gridAfter w:val="1"/>
-          <w:wAfter w:w="270" w:type="dxa"/>
+          <w:wAfter w:w="450" w:type="dxa"/>
           <w:trHeight w:val="552"/>
         </w:trPr>
         <w:tc>
           <w:tcPr>
-            <w:tcW w:w="3330" w:type="dxa"/>
+            <w:tcW w:w="3600" w:type="dxa"/>
             <w:vMerge w:val="restart"/>
             <w:tcBorders>
               <w:top w:val="nil"/>
@@ -22216,6 +23048,9 @@
           </w:tcPr>
           <w:p>
             <w:pPr>
+              <w:tabs>
+                <w:tab w:val="left" w:pos="9090"/>
+              </w:tabs>
               <w:spacing w:line="240" w:lineRule="auto"/>
               <w:rPr>
                 <w:rFonts w:ascii="Times New Roman" w:eastAsia="Times New Roman" w:hAnsi="Times New Roman" w:cs="Times New Roman"/>
@@ -22239,7 +23074,7 @@
         </w:tc>
         <w:tc>
           <w:tcPr>
-            <w:tcW w:w="1145" w:type="dxa"/>
+            <w:tcW w:w="1055" w:type="dxa"/>
             <w:vMerge w:val="restart"/>
             <w:tcBorders>
               <w:top w:val="nil"/>
@@ -22250,6 +23085,9 @@
           </w:tcPr>
           <w:p>
             <w:pPr>
+              <w:tabs>
+                <w:tab w:val="left" w:pos="9090"/>
+              </w:tabs>
               <w:spacing w:line="240" w:lineRule="auto"/>
               <w:jc w:val="center"/>
               <w:rPr>
@@ -22261,6 +23099,9 @@
           </w:p>
           <w:p>
             <w:pPr>
+              <w:tabs>
+                <w:tab w:val="left" w:pos="9090"/>
+              </w:tabs>
               <w:spacing w:line="240" w:lineRule="auto"/>
               <w:jc w:val="center"/>
               <w:rPr>
@@ -22301,6 +23142,9 @@
           </w:tcPr>
           <w:p>
             <w:pPr>
+              <w:tabs>
+                <w:tab w:val="left" w:pos="9090"/>
+              </w:tabs>
               <w:spacing w:line="240" w:lineRule="auto"/>
               <w:jc w:val="center"/>
               <w:rPr>
@@ -22312,6 +23156,9 @@
           </w:p>
           <w:p>
             <w:pPr>
+              <w:tabs>
+                <w:tab w:val="left" w:pos="9090"/>
+              </w:tabs>
               <w:spacing w:line="240" w:lineRule="auto"/>
               <w:jc w:val="center"/>
               <w:rPr>
@@ -22352,6 +23199,9 @@
           </w:tcPr>
           <w:p>
             <w:pPr>
+              <w:tabs>
+                <w:tab w:val="left" w:pos="9090"/>
+              </w:tabs>
               <w:spacing w:line="240" w:lineRule="auto"/>
               <w:jc w:val="center"/>
               <w:rPr>
@@ -22363,6 +23213,9 @@
           </w:p>
           <w:p>
             <w:pPr>
+              <w:tabs>
+                <w:tab w:val="left" w:pos="9090"/>
+              </w:tabs>
               <w:spacing w:line="240" w:lineRule="auto"/>
               <w:jc w:val="center"/>
               <w:rPr>
@@ -22403,6 +23256,9 @@
           </w:tcPr>
           <w:p>
             <w:pPr>
+              <w:tabs>
+                <w:tab w:val="left" w:pos="9090"/>
+              </w:tabs>
               <w:spacing w:line="240" w:lineRule="auto"/>
               <w:jc w:val="center"/>
               <w:rPr>
@@ -22414,6 +23270,9 @@
           </w:p>
           <w:p>
             <w:pPr>
+              <w:tabs>
+                <w:tab w:val="left" w:pos="9090"/>
+              </w:tabs>
               <w:spacing w:line="240" w:lineRule="auto"/>
               <w:jc w:val="center"/>
               <w:rPr>
@@ -22454,6 +23313,9 @@
           </w:tcPr>
           <w:p>
             <w:pPr>
+              <w:tabs>
+                <w:tab w:val="left" w:pos="9090"/>
+              </w:tabs>
               <w:spacing w:line="240" w:lineRule="auto"/>
               <w:jc w:val="center"/>
               <w:rPr>
@@ -22465,6 +23327,9 @@
           </w:p>
           <w:p>
             <w:pPr>
+              <w:tabs>
+                <w:tab w:val="left" w:pos="9090"/>
+              </w:tabs>
               <w:spacing w:line="240" w:lineRule="auto"/>
               <w:jc w:val="center"/>
               <w:rPr>
@@ -22499,7 +23364,7 @@
         </w:trPr>
         <w:tc>
           <w:tcPr>
-            <w:tcW w:w="3330" w:type="dxa"/>
+            <w:tcW w:w="3600" w:type="dxa"/>
             <w:vMerge/>
             <w:tcBorders>
               <w:top w:val="nil"/>
@@ -22529,7 +23394,7 @@
         </w:tc>
         <w:tc>
           <w:tcPr>
-            <w:tcW w:w="1145" w:type="dxa"/>
+            <w:tcW w:w="1055" w:type="dxa"/>
             <w:vMerge/>
             <w:tcBorders>
               <w:top w:val="nil"/>
@@ -22674,7 +23539,7 @@
         </w:tc>
         <w:tc>
           <w:tcPr>
-            <w:tcW w:w="270" w:type="dxa"/>
+            <w:tcW w:w="450" w:type="dxa"/>
             <w:tcBorders>
               <w:top w:val="nil"/>
               <w:left w:val="nil"/>
@@ -22702,7 +23567,7 @@
         </w:trPr>
         <w:tc>
           <w:tcPr>
-            <w:tcW w:w="3330" w:type="dxa"/>
+            <w:tcW w:w="3600" w:type="dxa"/>
             <w:tcBorders>
               <w:top w:val="nil"/>
               <w:left w:val="nil"/>
@@ -22724,7 +23589,7 @@
         </w:tc>
         <w:tc>
           <w:tcPr>
-            <w:tcW w:w="1145" w:type="dxa"/>
+            <w:tcW w:w="1055" w:type="dxa"/>
             <w:vMerge/>
             <w:tcBorders>
               <w:top w:val="nil"/>
@@ -22869,7 +23734,7 @@
         </w:tc>
         <w:tc>
           <w:tcPr>
-            <w:tcW w:w="270" w:type="dxa"/>
+            <w:tcW w:w="450" w:type="dxa"/>
             <w:vAlign w:val="center"/>
           </w:tcPr>
           <w:p>
@@ -22890,7 +23755,7 @@
         </w:trPr>
         <w:tc>
           <w:tcPr>
-            <w:tcW w:w="3330" w:type="dxa"/>
+            <w:tcW w:w="3600" w:type="dxa"/>
             <w:vMerge w:val="restart"/>
             <w:tcBorders>
               <w:top w:val="nil"/>
@@ -22913,7 +23778,7 @@
         </w:tc>
         <w:tc>
           <w:tcPr>
-            <w:tcW w:w="1145" w:type="dxa"/>
+            <w:tcW w:w="1055" w:type="dxa"/>
             <w:vMerge/>
             <w:tcBorders>
               <w:top w:val="nil"/>
@@ -23060,7 +23925,7 @@
         </w:tc>
         <w:tc>
           <w:tcPr>
-            <w:tcW w:w="270" w:type="dxa"/>
+            <w:tcW w:w="450" w:type="dxa"/>
             <w:vAlign w:val="center"/>
           </w:tcPr>
           <w:p>
@@ -23081,7 +23946,7 @@
         </w:trPr>
         <w:tc>
           <w:tcPr>
-            <w:tcW w:w="3330" w:type="dxa"/>
+            <w:tcW w:w="3600" w:type="dxa"/>
             <w:vMerge/>
             <w:tcBorders>
               <w:top w:val="nil"/>
@@ -23111,7 +23976,7 @@
         </w:tc>
         <w:tc>
           <w:tcPr>
-            <w:tcW w:w="1145" w:type="dxa"/>
+            <w:tcW w:w="1055" w:type="dxa"/>
             <w:tcBorders>
               <w:top w:val="nil"/>
               <w:left w:val="nil"/>
@@ -23266,7 +24131,7 @@
         </w:tc>
         <w:tc>
           <w:tcPr>
-            <w:tcW w:w="270" w:type="dxa"/>
+            <w:tcW w:w="450" w:type="dxa"/>
             <w:vAlign w:val="center"/>
           </w:tcPr>
           <w:p>
@@ -23287,7 +24152,7 @@
         </w:trPr>
         <w:tc>
           <w:tcPr>
-            <w:tcW w:w="3330" w:type="dxa"/>
+            <w:tcW w:w="3600" w:type="dxa"/>
             <w:tcBorders>
               <w:top w:val="nil"/>
               <w:left w:val="nil"/>
@@ -23321,7 +24186,7 @@
         </w:tc>
         <w:tc>
           <w:tcPr>
-            <w:tcW w:w="1145" w:type="dxa"/>
+            <w:tcW w:w="1055" w:type="dxa"/>
             <w:tcBorders>
               <w:top w:val="nil"/>
               <w:left w:val="nil"/>
@@ -23435,7 +24300,7 @@
         </w:tc>
         <w:tc>
           <w:tcPr>
-            <w:tcW w:w="270" w:type="dxa"/>
+            <w:tcW w:w="450" w:type="dxa"/>
             <w:vAlign w:val="center"/>
           </w:tcPr>
           <w:p>
@@ -23456,7 +24321,7 @@
         </w:trPr>
         <w:tc>
           <w:tcPr>
-            <w:tcW w:w="3330" w:type="dxa"/>
+            <w:tcW w:w="3600" w:type="dxa"/>
             <w:vMerge w:val="restart"/>
             <w:tcBorders>
               <w:top w:val="nil"/>
@@ -23488,7 +24353,7 @@
         </w:tc>
         <w:tc>
           <w:tcPr>
-            <w:tcW w:w="1145" w:type="dxa"/>
+            <w:tcW w:w="1055" w:type="dxa"/>
             <w:vMerge w:val="restart"/>
             <w:tcBorders>
               <w:top w:val="nil"/>
@@ -23686,7 +24551,7 @@
         </w:tc>
         <w:tc>
           <w:tcPr>
-            <w:tcW w:w="270" w:type="dxa"/>
+            <w:tcW w:w="450" w:type="dxa"/>
             <w:vAlign w:val="center"/>
           </w:tcPr>
           <w:p>
@@ -23707,7 +24572,7 @@
         </w:trPr>
         <w:tc>
           <w:tcPr>
-            <w:tcW w:w="3330" w:type="dxa"/>
+            <w:tcW w:w="3600" w:type="dxa"/>
             <w:vMerge/>
             <w:tcBorders>
               <w:top w:val="nil"/>
@@ -23737,7 +24602,7 @@
         </w:tc>
         <w:tc>
           <w:tcPr>
-            <w:tcW w:w="1145" w:type="dxa"/>
+            <w:tcW w:w="1055" w:type="dxa"/>
             <w:vMerge/>
             <w:tcBorders>
               <w:top w:val="nil"/>
@@ -23872,7 +24737,7 @@
         </w:tc>
         <w:tc>
           <w:tcPr>
-            <w:tcW w:w="270" w:type="dxa"/>
+            <w:tcW w:w="450" w:type="dxa"/>
             <w:vAlign w:val="center"/>
           </w:tcPr>
           <w:p>
@@ -23893,7 +24758,7 @@
         </w:trPr>
         <w:tc>
           <w:tcPr>
-            <w:tcW w:w="3330" w:type="dxa"/>
+            <w:tcW w:w="3600" w:type="dxa"/>
             <w:vMerge w:val="restart"/>
             <w:tcBorders>
               <w:top w:val="nil"/>
@@ -23925,7 +24790,7 @@
         </w:tc>
         <w:tc>
           <w:tcPr>
-            <w:tcW w:w="1145" w:type="dxa"/>
+            <w:tcW w:w="1055" w:type="dxa"/>
             <w:tcBorders>
               <w:top w:val="nil"/>
               <w:left w:val="nil"/>
@@ -23993,7 +24858,23 @@
                 <w:sz w:val="18"/>
                 <w:szCs w:val="18"/>
               </w:rPr>
-              <w:t>(0.055)</w:t>
+              <w:t>(0.0</w:t>
+            </w:r>
+            <w:r>
+              <w:rPr>
+                <w:rFonts w:ascii="Times New Roman" w:eastAsia="Times New Roman" w:hAnsi="Times New Roman" w:cs="Times New Roman"/>
+                <w:sz w:val="18"/>
+                <w:szCs w:val="18"/>
+              </w:rPr>
+              <w:t>46</w:t>
+            </w:r>
+            <w:r>
+              <w:rPr>
+                <w:rFonts w:ascii="Times New Roman" w:eastAsia="Times New Roman" w:hAnsi="Times New Roman" w:cs="Times New Roman"/>
+                <w:sz w:val="18"/>
+                <w:szCs w:val="18"/>
+              </w:rPr>
+              <w:t>)</w:t>
             </w:r>
           </w:p>
         </w:tc>
@@ -24057,7 +24938,23 @@
                 <w:szCs w:val="18"/>
               </w:rPr>
               <w:br/>
-              <w:t>(0.41)</w:t>
+              <w:t>(0.</w:t>
+            </w:r>
+            <w:r>
+              <w:rPr>
+                <w:rFonts w:ascii="Times New Roman" w:eastAsia="Times New Roman" w:hAnsi="Times New Roman" w:cs="Times New Roman"/>
+                <w:sz w:val="18"/>
+                <w:szCs w:val="18"/>
+              </w:rPr>
+              <w:t>0</w:t>
+            </w:r>
+            <w:r>
+              <w:rPr>
+                <w:rFonts w:ascii="Times New Roman" w:eastAsia="Times New Roman" w:hAnsi="Times New Roman" w:cs="Times New Roman"/>
+                <w:sz w:val="18"/>
+                <w:szCs w:val="18"/>
+              </w:rPr>
+              <w:t>41)</w:t>
             </w:r>
           </w:p>
         </w:tc>
@@ -24087,7 +24984,7 @@
         </w:tc>
         <w:tc>
           <w:tcPr>
-            <w:tcW w:w="270" w:type="dxa"/>
+            <w:tcW w:w="450" w:type="dxa"/>
             <w:vAlign w:val="center"/>
           </w:tcPr>
           <w:p>
@@ -24108,7 +25005,7 @@
         </w:trPr>
         <w:tc>
           <w:tcPr>
-            <w:tcW w:w="3330" w:type="dxa"/>
+            <w:tcW w:w="3600" w:type="dxa"/>
             <w:vMerge/>
             <w:tcBorders>
               <w:top w:val="nil"/>
@@ -24138,7 +25035,7 @@
         </w:tc>
         <w:tc>
           <w:tcPr>
-            <w:tcW w:w="1145" w:type="dxa"/>
+            <w:tcW w:w="1055" w:type="dxa"/>
             <w:tcBorders>
               <w:top w:val="nil"/>
               <w:left w:val="nil"/>
@@ -24268,7 +25165,7 @@
         </w:tc>
         <w:tc>
           <w:tcPr>
-            <w:tcW w:w="270" w:type="dxa"/>
+            <w:tcW w:w="450" w:type="dxa"/>
             <w:vAlign w:val="center"/>
           </w:tcPr>
           <w:p>
@@ -24289,7 +25186,7 @@
         </w:trPr>
         <w:tc>
           <w:tcPr>
-            <w:tcW w:w="3330" w:type="dxa"/>
+            <w:tcW w:w="3600" w:type="dxa"/>
             <w:tcBorders>
               <w:top w:val="nil"/>
               <w:left w:val="nil"/>
@@ -24323,7 +25220,7 @@
         </w:tc>
         <w:tc>
           <w:tcPr>
-            <w:tcW w:w="1145" w:type="dxa"/>
+            <w:tcW w:w="1055" w:type="dxa"/>
             <w:tcBorders>
               <w:top w:val="nil"/>
               <w:left w:val="nil"/>
@@ -24440,7 +25337,7 @@
         </w:tc>
         <w:tc>
           <w:tcPr>
-            <w:tcW w:w="270" w:type="dxa"/>
+            <w:tcW w:w="450" w:type="dxa"/>
             <w:vAlign w:val="center"/>
           </w:tcPr>
           <w:p>
@@ -24461,7 +25358,7 @@
         </w:trPr>
         <w:tc>
           <w:tcPr>
-            <w:tcW w:w="3330" w:type="dxa"/>
+            <w:tcW w:w="3600" w:type="dxa"/>
             <w:vMerge w:val="restart"/>
             <w:tcBorders>
               <w:top w:val="nil"/>
@@ -24493,7 +25390,7 @@
         </w:tc>
         <w:tc>
           <w:tcPr>
-            <w:tcW w:w="1145" w:type="dxa"/>
+            <w:tcW w:w="1055" w:type="dxa"/>
             <w:vMerge w:val="restart"/>
             <w:tcBorders>
               <w:top w:val="nil"/>
@@ -24692,7 +25589,7 @@
         </w:tc>
         <w:tc>
           <w:tcPr>
-            <w:tcW w:w="270" w:type="dxa"/>
+            <w:tcW w:w="450" w:type="dxa"/>
             <w:vAlign w:val="center"/>
           </w:tcPr>
           <w:p>
@@ -24713,7 +25610,7 @@
         </w:trPr>
         <w:tc>
           <w:tcPr>
-            <w:tcW w:w="3330" w:type="dxa"/>
+            <w:tcW w:w="3600" w:type="dxa"/>
             <w:vMerge/>
             <w:tcBorders>
               <w:top w:val="nil"/>
@@ -24743,7 +25640,7 @@
         </w:tc>
         <w:tc>
           <w:tcPr>
-            <w:tcW w:w="1145" w:type="dxa"/>
+            <w:tcW w:w="1055" w:type="dxa"/>
             <w:vMerge/>
             <w:tcBorders>
               <w:top w:val="nil"/>
@@ -24873,7 +25770,7 @@
         </w:tc>
         <w:tc>
           <w:tcPr>
-            <w:tcW w:w="270" w:type="dxa"/>
+            <w:tcW w:w="450" w:type="dxa"/>
             <w:vAlign w:val="center"/>
           </w:tcPr>
           <w:p>
@@ -24894,7 +25791,7 @@
         </w:trPr>
         <w:tc>
           <w:tcPr>
-            <w:tcW w:w="3330" w:type="dxa"/>
+            <w:tcW w:w="3600" w:type="dxa"/>
             <w:vMerge w:val="restart"/>
             <w:tcBorders>
               <w:top w:val="nil"/>
@@ -24926,7 +25823,7 @@
         </w:tc>
         <w:tc>
           <w:tcPr>
-            <w:tcW w:w="1145" w:type="dxa"/>
+            <w:tcW w:w="1055" w:type="dxa"/>
             <w:tcBorders>
               <w:top w:val="nil"/>
               <w:left w:val="nil"/>
@@ -25077,7 +25974,7 @@
         </w:tc>
         <w:tc>
           <w:tcPr>
-            <w:tcW w:w="270" w:type="dxa"/>
+            <w:tcW w:w="450" w:type="dxa"/>
             <w:vAlign w:val="center"/>
           </w:tcPr>
           <w:p>
@@ -25098,7 +25995,7 @@
         </w:trPr>
         <w:tc>
           <w:tcPr>
-            <w:tcW w:w="3330" w:type="dxa"/>
+            <w:tcW w:w="3600" w:type="dxa"/>
             <w:vMerge/>
             <w:tcBorders>
               <w:top w:val="nil"/>
@@ -25128,7 +26025,7 @@
         </w:tc>
         <w:tc>
           <w:tcPr>
-            <w:tcW w:w="1145" w:type="dxa"/>
+            <w:tcW w:w="1055" w:type="dxa"/>
             <w:tcBorders>
               <w:top w:val="nil"/>
               <w:left w:val="nil"/>
@@ -25252,7 +26149,7 @@
         </w:tc>
         <w:tc>
           <w:tcPr>
-            <w:tcW w:w="270" w:type="dxa"/>
+            <w:tcW w:w="450" w:type="dxa"/>
             <w:vAlign w:val="center"/>
           </w:tcPr>
           <w:p>
@@ -25273,7 +26170,7 @@
         </w:trPr>
         <w:tc>
           <w:tcPr>
-            <w:tcW w:w="3330" w:type="dxa"/>
+            <w:tcW w:w="3600" w:type="dxa"/>
             <w:vMerge w:val="restart"/>
             <w:tcBorders>
               <w:top w:val="nil"/>
@@ -25323,7 +26220,7 @@
         </w:tc>
         <w:tc>
           <w:tcPr>
-            <w:tcW w:w="1145" w:type="dxa"/>
+            <w:tcW w:w="1055" w:type="dxa"/>
             <w:tcBorders>
               <w:top w:val="nil"/>
               <w:left w:val="nil"/>
@@ -25438,7 +26335,7 @@
         </w:tc>
         <w:tc>
           <w:tcPr>
-            <w:tcW w:w="270" w:type="dxa"/>
+            <w:tcW w:w="450" w:type="dxa"/>
             <w:vAlign w:val="center"/>
           </w:tcPr>
           <w:p>
@@ -25459,7 +26356,7 @@
         </w:trPr>
         <w:tc>
           <w:tcPr>
-            <w:tcW w:w="3330" w:type="dxa"/>
+            <w:tcW w:w="3600" w:type="dxa"/>
             <w:vMerge/>
             <w:tcBorders>
               <w:top w:val="nil"/>
@@ -25489,7 +26386,7 @@
         </w:tc>
         <w:tc>
           <w:tcPr>
-            <w:tcW w:w="1145" w:type="dxa"/>
+            <w:tcW w:w="1055" w:type="dxa"/>
             <w:tcBorders>
               <w:top w:val="nil"/>
               <w:left w:val="nil"/>
@@ -25684,7 +26581,7 @@
         </w:tc>
         <w:tc>
           <w:tcPr>
-            <w:tcW w:w="270" w:type="dxa"/>
+            <w:tcW w:w="450" w:type="dxa"/>
             <w:vAlign w:val="center"/>
           </w:tcPr>
           <w:p>
@@ -25705,7 +26602,7 @@
         </w:trPr>
         <w:tc>
           <w:tcPr>
-            <w:tcW w:w="3330" w:type="dxa"/>
+            <w:tcW w:w="3600" w:type="dxa"/>
             <w:vMerge w:val="restart"/>
             <w:tcBorders>
               <w:top w:val="nil"/>
@@ -25755,7 +26652,7 @@
         </w:tc>
         <w:tc>
           <w:tcPr>
-            <w:tcW w:w="1145" w:type="dxa"/>
+            <w:tcW w:w="1055" w:type="dxa"/>
             <w:tcBorders>
               <w:top w:val="nil"/>
               <w:left w:val="nil"/>
@@ -25862,7 +26759,7 @@
         </w:tc>
         <w:tc>
           <w:tcPr>
-            <w:tcW w:w="270" w:type="dxa"/>
+            <w:tcW w:w="450" w:type="dxa"/>
             <w:vAlign w:val="center"/>
           </w:tcPr>
           <w:p>
@@ -25883,7 +26780,7 @@
         </w:trPr>
         <w:tc>
           <w:tcPr>
-            <w:tcW w:w="3330" w:type="dxa"/>
+            <w:tcW w:w="3600" w:type="dxa"/>
             <w:vMerge/>
             <w:tcBorders>
               <w:top w:val="nil"/>
@@ -25913,7 +26810,7 @@
         </w:tc>
         <w:tc>
           <w:tcPr>
-            <w:tcW w:w="1145" w:type="dxa"/>
+            <w:tcW w:w="1055" w:type="dxa"/>
             <w:tcBorders>
               <w:top w:val="single" w:sz="4" w:space="0" w:color="FFFFFF"/>
               <w:left w:val="nil"/>
@@ -26079,7 +26976,7 @@
         </w:tc>
         <w:tc>
           <w:tcPr>
-            <w:tcW w:w="270" w:type="dxa"/>
+            <w:tcW w:w="450" w:type="dxa"/>
             <w:vAlign w:val="center"/>
           </w:tcPr>
           <w:p>
@@ -26100,7 +26997,7 @@
         </w:trPr>
         <w:tc>
           <w:tcPr>
-            <w:tcW w:w="3330" w:type="dxa"/>
+            <w:tcW w:w="3600" w:type="dxa"/>
             <w:tcBorders>
               <w:top w:val="single" w:sz="4" w:space="0" w:color="000000"/>
               <w:left w:val="nil"/>
@@ -26130,7 +27027,7 @@
         </w:tc>
         <w:tc>
           <w:tcPr>
-            <w:tcW w:w="1145" w:type="dxa"/>
+            <w:tcW w:w="1055" w:type="dxa"/>
             <w:tcBorders>
               <w:top w:val="single" w:sz="4" w:space="0" w:color="000000"/>
               <w:left w:val="nil"/>
@@ -26285,7 +27182,7 @@
         </w:tc>
         <w:tc>
           <w:tcPr>
-            <w:tcW w:w="270" w:type="dxa"/>
+            <w:tcW w:w="450" w:type="dxa"/>
             <w:vAlign w:val="center"/>
           </w:tcPr>
           <w:p>
@@ -26306,7 +27203,7 @@
         </w:trPr>
         <w:tc>
           <w:tcPr>
-            <w:tcW w:w="3330" w:type="dxa"/>
+            <w:tcW w:w="3600" w:type="dxa"/>
             <w:tcBorders>
               <w:top w:val="nil"/>
               <w:left w:val="nil"/>
@@ -26336,7 +27233,7 @@
         </w:tc>
         <w:tc>
           <w:tcPr>
-            <w:tcW w:w="1145" w:type="dxa"/>
+            <w:tcW w:w="1055" w:type="dxa"/>
             <w:tcBorders>
               <w:top w:val="nil"/>
               <w:left w:val="nil"/>
@@ -26491,7 +27388,7 @@
         </w:tc>
         <w:tc>
           <w:tcPr>
-            <w:tcW w:w="270" w:type="dxa"/>
+            <w:tcW w:w="450" w:type="dxa"/>
             <w:vAlign w:val="center"/>
           </w:tcPr>
           <w:p>
@@ -26524,6 +27421,10 @@
     </w:p>
     <w:p>
       <w:pPr>
+        <w:tabs>
+          <w:tab w:val="left" w:pos="9360"/>
+        </w:tabs>
+        <w:ind w:left="-360"/>
         <w:jc w:val="both"/>
         <w:rPr>
           <w:rFonts w:ascii="Times New Roman" w:eastAsia="Times New Roman" w:hAnsi="Times New Roman" w:cs="Times New Roman"/>
@@ -26549,7 +27450,7 @@
           <w:sz w:val="18"/>
           <w:szCs w:val="18"/>
         </w:rPr>
-        <w:t xml:space="preserve">: This table reports the results of four ordinary least squares (OLS) regressions that predict whether the final biography (Model 1), film (Models 2-3) or book (Models 4-5) a participant selected featured a woman (Model 1), a woman protagonist (Model 2), featured a racial minority protagonist (Model 3), was written by a woman author (Model 4), or was written by a racial minority author (Model 5). Model 1 analyzes data from Study 2 to predict the selection of a final biography about a woman with an indicator for receiving feedback on the % of the original six selected biographies that were about a woman, a continuous measure of the number of biographies about women selected initially, and an interaction between these two terms. Model 2 analyzes data from Study 3A to predict the selection of a final film featuring a racial minority protagonist with an indicator for receiving feedback on the % of the original seven selected films that were about racial minority protagonists, a continuous measure of the number of films featuring racial minority protagonists selected initially, and an interaction between these two terms. Model 3 analyzes data from Study 3B to predict the selection of a final film featuring a woman protagonist with an indicator for receiving feedback on the % of the original six selected films that were about women protagonists, a continuous measure of the number of films featuring women selected initially, and an interaction between these two terms. Model 4 analyzes data from Study 4A to predict the selection of a final book by a racial minority author with an indicator for receiving feedback on the % of the original six selected books that were by racial minority authors, a continuous measure of the number of books initially selected that were by racial minority authors, and an interaction between these two terms. Model 5 analyzes data from Study 4B to predict the selection of a final book by a woman author with an indicator for receiving feedback on the % of the original six selected books that were by women authors, a continuous </w:t>
+        <w:t xml:space="preserve">: This table reports the results of four ordinary least squares (OLS) regressions that predict whether the final biography (Model 1), film (Models 2-3) or book (Models 4-5) a participant selected featured a woman (Model 1), a woman protagonist (Model 2), featured a racial minority protagonist (Model 3), was written by a woman author (Model 4), or was written by a racial minority author (Model 5). Model 1 analyzes data from Study 2 to predict the selection of a final biography about a woman with an indicator for receiving feedback on the % of the original six selected biographies that were about a woman, a continuous measure of the number of biographies about women selected initially, and an interaction between these two terms. Model 2 analyzes data from Study 3A to predict the selection of a final film featuring a racial minority protagonist with an indicator for receiving feedback on the % of the original seven selected films that were about racial minority protagonists, a continuous measure of the number of films featuring racial minority protagonists selected initially, and an interaction between these two terms. Model 3 analyzes data from Study 3B to predict the selection of a final film featuring a woman protagonist with an indicator for receiving feedback on the % of the original six selected films that were about women protagonists, a continuous measure of the number of films featuring women selected initially, and an interaction between these two terms. Model 4 analyzes data from Study 4A to predict the selection of a final book by a racial minority author with an indicator for receiving feedback on the % of the original six selected books that were by racial minority authors, a continuous measure of the number of books initially selected that were by racial minority authors, and an interaction between these two terms. Model 5 analyzes data from Study 4B to predict the selection of a final book by a woman author with an indicator for receiving feedback on the % of the original six selected books that were by women authors, a continuous measure of the number of books initially selected that were by women </w:t>
       </w:r>
       <w:r>
         <w:rPr>
@@ -26558,7 +27459,7 @@
           <w:szCs w:val="18"/>
         </w:rPr>
         <w:lastRenderedPageBreak/>
-        <w:t>measure of the number of books initially selected that were by women authors, and an interaction between these two terms. Standard errors reported in parentheses are estimated robustly using HC3. +</w:t>
+        <w:t>authors, and an interaction between these two terms. Standard errors reported in parentheses are estimated robustly using HC3. +</w:t>
       </w:r>
       <w:r>
         <w:rPr>
@@ -26612,7 +27513,25 @@
           <w:sz w:val="18"/>
           <w:szCs w:val="18"/>
         </w:rPr>
-        <w:t>&lt;0.01;***</w:t>
+        <w:t>&lt;</w:t>
+      </w:r>
+      <w:proofErr w:type="gramStart"/>
+      <w:r>
+        <w:rPr>
+          <w:rFonts w:ascii="Times New Roman" w:eastAsia="Times New Roman" w:hAnsi="Times New Roman" w:cs="Times New Roman"/>
+          <w:sz w:val="18"/>
+          <w:szCs w:val="18"/>
+        </w:rPr>
+        <w:t>0.01;*</w:t>
+      </w:r>
+      <w:proofErr w:type="gramEnd"/>
+      <w:r>
+        <w:rPr>
+          <w:rFonts w:ascii="Times New Roman" w:eastAsia="Times New Roman" w:hAnsi="Times New Roman" w:cs="Times New Roman"/>
+          <w:sz w:val="18"/>
+          <w:szCs w:val="18"/>
+        </w:rPr>
+        <w:t>**</w:t>
       </w:r>
       <w:r>
         <w:rPr>
@@ -27740,6 +28659,14 @@
               </w:rPr>
               <w:t>0.241**</w:t>
             </w:r>
+            <w:r>
+              <w:rPr>
+                <w:rFonts w:ascii="Times New Roman" w:eastAsia="Times New Roman" w:hAnsi="Times New Roman" w:cs="Times New Roman"/>
+                <w:sz w:val="18"/>
+                <w:szCs w:val="18"/>
+              </w:rPr>
+              <w:t>*</w:t>
+            </w:r>
           </w:p>
         </w:tc>
         <w:tc>
@@ -28752,6 +29679,14 @@
               </w:rPr>
               <w:t>-0.348*</w:t>
             </w:r>
+            <w:r>
+              <w:rPr>
+                <w:rFonts w:ascii="Times New Roman" w:eastAsia="Times New Roman" w:hAnsi="Times New Roman" w:cs="Times New Roman"/>
+                <w:sz w:val="18"/>
+                <w:szCs w:val="18"/>
+              </w:rPr>
+              <w:t>**</w:t>
+            </w:r>
           </w:p>
         </w:tc>
         <w:tc>
@@ -28782,6 +29717,14 @@
                 <w:szCs w:val="18"/>
               </w:rPr>
               <w:t>-0.346*</w:t>
+            </w:r>
+            <w:r>
+              <w:rPr>
+                <w:rFonts w:ascii="Times New Roman" w:eastAsia="Times New Roman" w:hAnsi="Times New Roman" w:cs="Times New Roman"/>
+                <w:sz w:val="18"/>
+                <w:szCs w:val="18"/>
+              </w:rPr>
+              <w:t>**</w:t>
             </w:r>
           </w:p>
         </w:tc>
@@ -30118,17 +31061,15 @@
           <w:sz w:val="18"/>
           <w:szCs w:val="18"/>
         </w:rPr>
-        <w:t>: This table reports the results of six ordinary least squares (OLS) regressions that predict whether the final panelist a participant selected in Study 5 was a woman. Models 1-2 show results including only participants who were randomly assigned to select panelists from a candidate pool in which women were overrepresented (25% women). Models 3-4 show results including only participants who were randomly assigned to select panelists from a candidate pool in which women were overrepresented (75% women). Models 5-6 show results from all conditions in the study. Across all models, the primary predictor variable is an indicator for random assignment to receive feedback on the % of the original six panelists selected who were women. In Models 2, 4, and 6, we also include controls for whether a participant was a man and a participant’s age. Models 5 and 6 include an indicator for whether the participant was randomly assigned to select panelists from a candidate pool in which women were overrepresented and an interaction between this variable and the primary indicator for random assignment to receive feedback on the % of the original six panelists selected who were women. Standard errors reported in parentheses are estimated robustly using HC3.  +</w:t>
-      </w:r>
-      <w:r>
-        <w:rPr>
-          <w:rFonts w:ascii="Times New Roman" w:eastAsia="Times New Roman" w:hAnsi="Times New Roman" w:cs="Times New Roman"/>
-          <w:i/>
-          <w:iCs/>
+        <w:t xml:space="preserve">: This table reports the results of six ordinary least squares (OLS) regressions that predict whether the final panelist a participant selected in Study 5 was a woman. Models 1-2 show results including only participants who were randomly assigned to select panelists from a candidate pool in which women were </w:t>
+      </w:r>
+      <w:r>
+        <w:rPr>
+          <w:rFonts w:ascii="Times New Roman" w:eastAsia="Times New Roman" w:hAnsi="Times New Roman" w:cs="Times New Roman"/>
           <w:sz w:val="18"/>
           <w:szCs w:val="18"/>
         </w:rPr>
-        <w:t>p</w:t>
+        <w:t>under</w:t>
       </w:r>
       <w:r>
         <w:rPr>
@@ -30136,7 +31077,7 @@
           <w:sz w:val="18"/>
           <w:szCs w:val="18"/>
         </w:rPr>
-        <w:t>&lt;0.1;*</w:t>
+        <w:t>represented (25% women). Models 3-4 show results including only participants who were randomly assigned to select panelists from a candidate pool in which women were overrepresented (75% women). Models 5-6 show results from all conditions in the study. Across all models, the primary predictor variable is an indicator for random assignment to receive feedback on the % of the original six panelists selected who were women. In Models 2, 4, and 6, we also include controls for whether a participant was a man and a participant’s age. Models 5 and 6 include an indicator for whether the participant was randomly assigned to select panelists from a candidate pool in which women were overrepresented and an interaction between this variable and the primary indicator for random assignment to receive feedback on the % of the original six panelists selected who were women. Standard errors reported in parentheses are estimated robustly using HC3.  +</w:t>
       </w:r>
       <w:r>
         <w:rPr>
@@ -30154,7 +31095,7 @@
           <w:sz w:val="18"/>
           <w:szCs w:val="18"/>
         </w:rPr>
-        <w:t>&lt;0.05;**</w:t>
+        <w:t>&lt;0.1;*</w:t>
       </w:r>
       <w:r>
         <w:rPr>
@@ -30172,7 +31113,7 @@
           <w:sz w:val="18"/>
           <w:szCs w:val="18"/>
         </w:rPr>
-        <w:t>&lt;0.01;***</w:t>
+        <w:t>&lt;0.05;**</w:t>
       </w:r>
       <w:r>
         <w:rPr>
@@ -30190,6 +31131,42 @@
           <w:sz w:val="18"/>
           <w:szCs w:val="18"/>
         </w:rPr>
+        <w:t>&lt;</w:t>
+      </w:r>
+      <w:proofErr w:type="gramStart"/>
+      <w:r>
+        <w:rPr>
+          <w:rFonts w:ascii="Times New Roman" w:eastAsia="Times New Roman" w:hAnsi="Times New Roman" w:cs="Times New Roman"/>
+          <w:sz w:val="18"/>
+          <w:szCs w:val="18"/>
+        </w:rPr>
+        <w:t>0.01;*</w:t>
+      </w:r>
+      <w:proofErr w:type="gramEnd"/>
+      <w:r>
+        <w:rPr>
+          <w:rFonts w:ascii="Times New Roman" w:eastAsia="Times New Roman" w:hAnsi="Times New Roman" w:cs="Times New Roman"/>
+          <w:sz w:val="18"/>
+          <w:szCs w:val="18"/>
+        </w:rPr>
+        <w:t>**</w:t>
+      </w:r>
+      <w:r>
+        <w:rPr>
+          <w:rFonts w:ascii="Times New Roman" w:eastAsia="Times New Roman" w:hAnsi="Times New Roman" w:cs="Times New Roman"/>
+          <w:i/>
+          <w:iCs/>
+          <w:sz w:val="18"/>
+          <w:szCs w:val="18"/>
+        </w:rPr>
+        <w:t>p</w:t>
+      </w:r>
+      <w:r>
+        <w:rPr>
+          <w:rFonts w:ascii="Times New Roman" w:eastAsia="Times New Roman" w:hAnsi="Times New Roman" w:cs="Times New Roman"/>
+          <w:sz w:val="18"/>
+          <w:szCs w:val="18"/>
+        </w:rPr>
         <w:t>&lt;0.001.</w:t>
       </w:r>
     </w:p>
@@ -30197,8 +31174,8 @@
       <w:pPr>
         <w:pStyle w:val="Heading1"/>
       </w:pPr>
-      <w:bookmarkStart w:id="33" w:name="_wz0zzfq4h920" w:colFirst="0" w:colLast="0"/>
-      <w:bookmarkEnd w:id="33"/>
+      <w:bookmarkStart w:id="31" w:name="_wz0zzfq4h920" w:colFirst="0" w:colLast="0"/>
+      <w:bookmarkEnd w:id="31"/>
       <w:r>
         <w:lastRenderedPageBreak/>
         <w:t>Figures</w:t>
@@ -30444,7 +31421,25 @@
           <w:sz w:val="18"/>
           <w:szCs w:val="18"/>
         </w:rPr>
-        <w:t>This graph shows smaller and directionally inconsistent effects of providing descriptive feedback about other relevant attributes of past selectees (e.g., Study 3B: whether the film’s protagonist was a political leader, whether the budget of the film was above $40M, whether the film was released after 2010) on subsequent selection decisions. The gray circles show average effects pools, while the gray diamonds show the disaggregated effects of feedback on specific, targeted attributes. Positive values indicate a positive effect of random assignment to receive a certain type of descriptive feedback on the likelihood of subsequently selecting a candidate with that targeted attribute, while negative values indicate a negative response. The error bars represent 95% confidence intervals.</w:t>
+        <w:t xml:space="preserve">This graph shows smaller and directionally inconsistent effects of providing descriptive feedback about other relevant attributes of past selectees (e.g., Study 3B: whether the film’s protagonist was a political leader, whether the budget of the film was above $40M, whether the film was released after 2010) on subsequent selection decisions. The gray circles show average effects pools, while the gray diamonds show the disaggregated effects of feedback on specific, targeted attributes. Positive values indicate a positive effect of random </w:t>
+      </w:r>
+      <w:proofErr w:type="gramStart"/>
+      <w:r>
+        <w:rPr>
+          <w:rFonts w:ascii="Times New Roman" w:eastAsia="Times New Roman" w:hAnsi="Times New Roman" w:cs="Times New Roman"/>
+          <w:sz w:val="18"/>
+          <w:szCs w:val="18"/>
+        </w:rPr>
+        <w:t>assignment</w:t>
+      </w:r>
+      <w:proofErr w:type="gramEnd"/>
+      <w:r>
+        <w:rPr>
+          <w:rFonts w:ascii="Times New Roman" w:eastAsia="Times New Roman" w:hAnsi="Times New Roman" w:cs="Times New Roman"/>
+          <w:sz w:val="18"/>
+          <w:szCs w:val="18"/>
+        </w:rPr>
+        <w:t xml:space="preserve"> to receive a certain type of descriptive feedback on the likelihood of subsequently selecting a candidate with that targeted attribute, while negative values indicate a negative response. The error bars represent 95% confidence intervals.</w:t>
       </w:r>
       <w:r>
         <w:br w:type="page"/>
@@ -30971,53 +31966,6 @@
     </w:sectPr>
   </w:body>
 </w:document>
-</file>
-
-<file path=word/comments.xml><?xml version="1.0" encoding="utf-8"?>
-<w:comments xmlns:wpc="http://schemas.microsoft.com/office/word/2010/wordprocessingCanvas" xmlns:cx="http://schemas.microsoft.com/office/drawing/2014/chartex" xmlns:cx1="http://schemas.microsoft.com/office/drawing/2015/9/8/chartex" xmlns:cx2="http://schemas.microsoft.com/office/drawing/2015/10/21/chartex" xmlns:cx3="http://schemas.microsoft.com/office/drawing/2016/5/9/chartex" xmlns:cx4="http://schemas.microsoft.com/office/drawing/2016/5/10/chartex" xmlns:cx5="http://schemas.microsoft.com/office/drawing/2016/5/11/chartex" xmlns:cx6="http://schemas.microsoft.com/office/drawing/2016/5/12/chartex" xmlns:cx7="http://schemas.microsoft.com/office/drawing/2016/5/13/chartex" xmlns:cx8="http://schemas.microsoft.com/office/drawing/2016/5/14/chartex" xmlns:mc="http://schemas.openxmlformats.org/markup-compatibility/2006" xmlns:aink="http://schemas.microsoft.com/office/drawing/2016/ink" xmlns:am3d="http://schemas.microsoft.com/office/drawing/2017/model3d" xmlns:o="urn:schemas-microsoft-com:office:office" xmlns:oel="http://schemas.microsoft.com/office/2019/extlst" xmlns:r="http://schemas.openxmlformats.org/officeDocument/2006/relationships" xmlns:m="http://schemas.openxmlformats.org/officeDocument/2006/math" xmlns:v="urn:schemas-microsoft-com:vml" xmlns:wp14="http://schemas.microsoft.com/office/word/2010/wordprocessingDrawing" xmlns:wp="http://schemas.openxmlformats.org/drawingml/2006/wordprocessingDrawing" xmlns:w10="urn:schemas-microsoft-com:office:word" xmlns:w="http://schemas.openxmlformats.org/wordprocessingml/2006/main" xmlns:w14="http://schemas.microsoft.com/office/word/2010/wordml" xmlns:w15="http://schemas.microsoft.com/office/word/2012/wordml" xmlns:w16cex="http://schemas.microsoft.com/office/word/2018/wordml/cex" xmlns:w16cid="http://schemas.microsoft.com/office/word/2016/wordml/cid" xmlns:w16="http://schemas.microsoft.com/office/word/2018/wordml" xmlns:w16du="http://schemas.microsoft.com/office/word/2023/wordml/word16du" xmlns:w16sdtdh="http://schemas.microsoft.com/office/word/2020/wordml/sdtdatahash" xmlns:w16sdtfl="http://schemas.microsoft.com/office/word/2024/wordml/sdtformatlock" xmlns:w16se="http://schemas.microsoft.com/office/word/2015/wordml/symex" xmlns:wpg="http://schemas.microsoft.com/office/word/2010/wordprocessingGroup" xmlns:wpi="http://schemas.microsoft.com/office/word/2010/wordprocessingInk" xmlns:wne="http://schemas.microsoft.com/office/word/2006/wordml" xmlns:wps="http://schemas.microsoft.com/office/word/2010/wordprocessingShape" mc:Ignorable="w14 w15 w16se w16cid w16 w16cex w16sdtdh w16sdtfl w16du wp14">
-  <w:comment w:id="2" w:author="Kasandra Brabaw" w:date="2025-12-30T16:08:00Z" w:initials="">
-    <w:p>
-      <w:pPr>
-        <w:widowControl w:val="0"/>
-        <w:pBdr>
-          <w:top w:val="nil"/>
-          <w:left w:val="nil"/>
-          <w:bottom w:val="nil"/>
-          <w:right w:val="nil"/>
-          <w:between w:val="nil"/>
-        </w:pBdr>
-        <w:spacing w:line="240" w:lineRule="auto"/>
-        <w:rPr>
-          <w:color w:val="000000"/>
-        </w:rPr>
-      </w:pPr>
-      <w:r>
-        <w:rPr>
-          <w:rStyle w:val="CommentReference"/>
-        </w:rPr>
-        <w:annotationRef/>
-      </w:r>
-      <w:r>
-        <w:rPr>
-          <w:color w:val="000000"/>
-        </w:rPr>
-        <w:t>Something like "NPR, Salesforce, and the BBC have claimed to find value in such programs." To offset the "however" that comes next. As of now, the next sentence feels a little rushed and disconnected from the story you've told.</w:t>
-      </w:r>
-    </w:p>
-  </w:comment>
-</w:comments>
-</file>
-
-<file path=word/commentsExtended.xml><?xml version="1.0" encoding="utf-8"?>
-<w15:commentsEx xmlns:wpc="http://schemas.microsoft.com/office/word/2010/wordprocessingCanvas" xmlns:cx="http://schemas.microsoft.com/office/drawing/2014/chartex" xmlns:cx1="http://schemas.microsoft.com/office/drawing/2015/9/8/chartex" xmlns:cx2="http://schemas.microsoft.com/office/drawing/2015/10/21/chartex" xmlns:cx3="http://schemas.microsoft.com/office/drawing/2016/5/9/chartex" xmlns:cx4="http://schemas.microsoft.com/office/drawing/2016/5/10/chartex" xmlns:cx5="http://schemas.microsoft.com/office/drawing/2016/5/11/chartex" xmlns:cx6="http://schemas.microsoft.com/office/drawing/2016/5/12/chartex" xmlns:cx7="http://schemas.microsoft.com/office/drawing/2016/5/13/chartex" xmlns:cx8="http://schemas.microsoft.com/office/drawing/2016/5/14/chartex" xmlns:mc="http://schemas.openxmlformats.org/markup-compatibility/2006" xmlns:aink="http://schemas.microsoft.com/office/drawing/2016/ink" xmlns:am3d="http://schemas.microsoft.com/office/drawing/2017/model3d" xmlns:o="urn:schemas-microsoft-com:office:office" xmlns:oel="http://schemas.microsoft.com/office/2019/extlst" xmlns:r="http://schemas.openxmlformats.org/officeDocument/2006/relationships" xmlns:m="http://schemas.openxmlformats.org/officeDocument/2006/math" xmlns:v="urn:schemas-microsoft-com:vml" xmlns:wp14="http://schemas.microsoft.com/office/word/2010/wordprocessingDrawing" xmlns:wp="http://schemas.openxmlformats.org/drawingml/2006/wordprocessingDrawing" xmlns:w10="urn:schemas-microsoft-com:office:word" xmlns:w="http://schemas.openxmlformats.org/wordprocessingml/2006/main" xmlns:w14="http://schemas.microsoft.com/office/word/2010/wordml" xmlns:w15="http://schemas.microsoft.com/office/word/2012/wordml" xmlns:w16cex="http://schemas.microsoft.com/office/word/2018/wordml/cex" xmlns:w16cid="http://schemas.microsoft.com/office/word/2016/wordml/cid" xmlns:w16="http://schemas.microsoft.com/office/word/2018/wordml" xmlns:w16du="http://schemas.microsoft.com/office/word/2023/wordml/word16du" xmlns:w16sdtdh="http://schemas.microsoft.com/office/word/2020/wordml/sdtdatahash" xmlns:w16sdtfl="http://schemas.microsoft.com/office/word/2024/wordml/sdtformatlock" xmlns:w16se="http://schemas.microsoft.com/office/word/2015/wordml/symex" xmlns:wpg="http://schemas.microsoft.com/office/word/2010/wordprocessingGroup" xmlns:wpi="http://schemas.microsoft.com/office/word/2010/wordprocessingInk" xmlns:wne="http://schemas.microsoft.com/office/word/2006/wordml" xmlns:wps="http://schemas.microsoft.com/office/word/2010/wordprocessingShape" mc:Ignorable="w14 w15 w16se w16cid w16 w16cex w16sdtdh w16sdtfl w16du wp14">
-  <w15:commentEx w15:paraId="30A68436" w15:done="0"/>
-</w15:commentsEx>
-</file>
-
-<file path=word/commentsIds.xml><?xml version="1.0" encoding="utf-8"?>
-<w16cid:commentsIds xmlns:wpc="http://schemas.microsoft.com/office/word/2010/wordprocessingCanvas" xmlns:cx="http://schemas.microsoft.com/office/drawing/2014/chartex" xmlns:cx1="http://schemas.microsoft.com/office/drawing/2015/9/8/chartex" xmlns:cx2="http://schemas.microsoft.com/office/drawing/2015/10/21/chartex" xmlns:cx3="http://schemas.microsoft.com/office/drawing/2016/5/9/chartex" xmlns:cx4="http://schemas.microsoft.com/office/drawing/2016/5/10/chartex" xmlns:cx5="http://schemas.microsoft.com/office/drawing/2016/5/11/chartex" xmlns:cx6="http://schemas.microsoft.com/office/drawing/2016/5/12/chartex" xmlns:cx7="http://schemas.microsoft.com/office/drawing/2016/5/13/chartex" xmlns:cx8="http://schemas.microsoft.com/office/drawing/2016/5/14/chartex" xmlns:mc="http://schemas.openxmlformats.org/markup-compatibility/2006" xmlns:aink="http://schemas.microsoft.com/office/drawing/2016/ink" xmlns:am3d="http://schemas.microsoft.com/office/drawing/2017/model3d" xmlns:o="urn:schemas-microsoft-com:office:office" xmlns:oel="http://schemas.microsoft.com/office/2019/extlst" xmlns:r="http://schemas.openxmlformats.org/officeDocument/2006/relationships" xmlns:m="http://schemas.openxmlformats.org/officeDocument/2006/math" xmlns:v="urn:schemas-microsoft-com:vml" xmlns:wp14="http://schemas.microsoft.com/office/word/2010/wordprocessingDrawing" xmlns:wp="http://schemas.openxmlformats.org/drawingml/2006/wordprocessingDrawing" xmlns:w10="urn:schemas-microsoft-com:office:word" xmlns:w="http://schemas.openxmlformats.org/wordprocessingml/2006/main" xmlns:w14="http://schemas.microsoft.com/office/word/2010/wordml" xmlns:w15="http://schemas.microsoft.com/office/word/2012/wordml" xmlns:w16cex="http://schemas.microsoft.com/office/word/2018/wordml/cex" xmlns:w16cid="http://schemas.microsoft.com/office/word/2016/wordml/cid" xmlns:w16="http://schemas.microsoft.com/office/word/2018/wordml" xmlns:w16du="http://schemas.microsoft.com/office/word/2023/wordml/word16du" xmlns:w16sdtdh="http://schemas.microsoft.com/office/word/2020/wordml/sdtdatahash" xmlns:w16sdtfl="http://schemas.microsoft.com/office/word/2024/wordml/sdtformatlock" xmlns:w16se="http://schemas.microsoft.com/office/word/2015/wordml/symex" xmlns:wpg="http://schemas.microsoft.com/office/word/2010/wordprocessingGroup" xmlns:wpi="http://schemas.microsoft.com/office/word/2010/wordprocessingInk" xmlns:wne="http://schemas.microsoft.com/office/word/2006/wordml" xmlns:wps="http://schemas.microsoft.com/office/word/2010/wordprocessingShape" mc:Ignorable="w14 w15 w16se w16cid w16 w16cex w16sdtdh w16sdtfl w16du wp14">
-  <w16cid:commentId w16cid:paraId="30A68436" w16cid:durableId="139C2D78"/>
-</w16cid:commentsIds>
 </file>
 
 <file path=word/endnotes.xml><?xml version="1.0" encoding="utf-8"?>
@@ -31609,7 +32557,23 @@
           <w:sz w:val="20"/>
           <w:szCs w:val="20"/>
         </w:rPr>
-        <w:t xml:space="preserve"> condition as 0 . This change does not alter the fundamental results of our model (i.e., the magnitude of effects, significance levels, and interaction patterns), as all of these outcomes are mathematically equivalent regardless of which condition serves as the reference category.</w:t>
+        <w:t xml:space="preserve"> condition as </w:t>
+      </w:r>
+      <w:r>
+        <w:rPr>
+          <w:rFonts w:ascii="Times New Roman" w:eastAsia="Times New Roman" w:hAnsi="Times New Roman" w:cs="Times New Roman"/>
+          <w:sz w:val="20"/>
+          <w:szCs w:val="20"/>
+        </w:rPr>
+        <w:t>0.</w:t>
+      </w:r>
+      <w:r>
+        <w:rPr>
+          <w:rFonts w:ascii="Times New Roman" w:eastAsia="Times New Roman" w:hAnsi="Times New Roman" w:cs="Times New Roman"/>
+          <w:sz w:val="20"/>
+          <w:szCs w:val="20"/>
+        </w:rPr>
+        <w:t xml:space="preserve"> This change does not alter the fundamental results of our model (i.e., the magnitude of effects, significance levels, and interaction patterns), as all of these outcomes are mathematically equivalent regardless of which condition serves as the reference category.</w:t>
       </w:r>
     </w:p>
   </w:footnote>
@@ -33451,6 +34415,41 @@
       <w:szCs w:val="16"/>
     </w:rPr>
   </w:style>
+  <w:style w:type="character" w:styleId="Hyperlink">
+    <w:name w:val="Hyperlink"/>
+    <w:basedOn w:val="DefaultParagraphFont"/>
+    <w:uiPriority w:val="99"/>
+    <w:unhideWhenUsed/>
+    <w:rsid w:val="003A6ACC"/>
+    <w:rPr>
+      <w:color w:val="0000FF" w:themeColor="hyperlink"/>
+      <w:u w:val="single"/>
+    </w:rPr>
+  </w:style>
+  <w:style w:type="character" w:styleId="UnresolvedMention">
+    <w:name w:val="Unresolved Mention"/>
+    <w:basedOn w:val="DefaultParagraphFont"/>
+    <w:uiPriority w:val="99"/>
+    <w:semiHidden/>
+    <w:unhideWhenUsed/>
+    <w:rsid w:val="003A6ACC"/>
+    <w:rPr>
+      <w:color w:val="605E5C"/>
+      <w:shd w:val="clear" w:color="auto" w:fill="E1DFDD"/>
+    </w:rPr>
+  </w:style>
+  <w:style w:type="character" w:styleId="FollowedHyperlink">
+    <w:name w:val="FollowedHyperlink"/>
+    <w:basedOn w:val="DefaultParagraphFont"/>
+    <w:uiPriority w:val="99"/>
+    <w:semiHidden/>
+    <w:unhideWhenUsed/>
+    <w:rsid w:val="00947DA2"/>
+    <w:rPr>
+      <w:color w:val="800080" w:themeColor="followedHyperlink"/>
+      <w:u w:val="single"/>
+    </w:rPr>
+  </w:style>
 </w:styles>
 </file>
 

</xml_diff>